<commit_message>
Java Collections: Fixed Typos and updated content
</commit_message>
<xml_diff>
--- a/3. Java Collections.docx
+++ b/3. Java Collections.docx
@@ -2625,26 +2625,6 @@
               <w:t>, non-synchronized</w:t>
             </w:r>
           </w:p>
-          <w:p>
-            <w:pPr>
-              <w:spacing w:after="0" w:line="240" w:lineRule="auto"/>
-              <w:rPr>
-                <w:rFonts w:eastAsia="Times New Roman" w:cstheme="minorHAnsi"/>
-                <w:color w:val="000000"/>
-                <w:sz w:val="24"/>
-                <w:lang w:eastAsia="en-IN"/>
-              </w:rPr>
-            </w:pPr>
-            <w:r>
-              <w:rPr>
-                <w:rFonts w:eastAsia="Times New Roman" w:cstheme="minorHAnsi"/>
-                <w:color w:val="000000"/>
-                <w:sz w:val="24"/>
-                <w:lang w:eastAsia="en-IN"/>
-              </w:rPr>
-              <w:t>Example of insertion and deletion</w:t>
-            </w:r>
-          </w:p>
         </w:tc>
       </w:tr>
       <w:tr>
@@ -4083,25 +4063,16 @@
         <w:spacing w:after="0" w:line="240" w:lineRule="auto"/>
         <w:rPr>
           <w:rFonts w:eastAsia="Times New Roman" w:cstheme="minorHAnsi"/>
+          <w:b/>
           <w:color w:val="000000"/>
           <w:sz w:val="24"/>
           <w:lang w:eastAsia="en-IN"/>
         </w:rPr>
       </w:pPr>
-    </w:p>
-    <w:p>
-      <w:pPr>
-        <w:spacing w:after="0" w:line="240" w:lineRule="auto"/>
+      <w:r>
         <w:rPr>
           <w:rFonts w:eastAsia="Times New Roman" w:cstheme="minorHAnsi"/>
-          <w:color w:val="000000"/>
-          <w:sz w:val="24"/>
-          <w:lang w:eastAsia="en-IN"/>
-        </w:rPr>
-      </w:pPr>
-      <w:r>
-        <w:rPr>
-          <w:rFonts w:eastAsia="Times New Roman" w:cstheme="minorHAnsi"/>
+          <w:b/>
           <w:color w:val="000000"/>
           <w:sz w:val="24"/>
           <w:lang w:eastAsia="en-IN"/>
@@ -12878,10 +12849,10 @@
         <w:tblLook w:val="04A0" w:firstRow="1" w:lastRow="0" w:firstColumn="1" w:lastColumn="0" w:noHBand="0" w:noVBand="1"/>
       </w:tblPr>
       <w:tblGrid>
-        <w:gridCol w:w="1562"/>
-        <w:gridCol w:w="4031"/>
-        <w:gridCol w:w="2810"/>
-        <w:gridCol w:w="2517"/>
+        <w:gridCol w:w="1563"/>
+        <w:gridCol w:w="3675"/>
+        <w:gridCol w:w="3166"/>
+        <w:gridCol w:w="2516"/>
       </w:tblGrid>
       <w:tr>
         <w:trPr>
@@ -12931,7 +12902,7 @@
         </w:tc>
         <w:tc>
           <w:tcPr>
-            <w:tcW w:w="0" w:type="auto"/>
+            <w:tcW w:w="3645" w:type="dxa"/>
             <w:tcBorders>
               <w:top w:val="single" w:sz="6" w:space="0" w:color="auto"/>
               <w:left w:val="single" w:sz="6" w:space="0" w:color="auto"/>
@@ -12974,7 +12945,7 @@
         </w:tc>
         <w:tc>
           <w:tcPr>
-            <w:tcW w:w="0" w:type="auto"/>
+            <w:tcW w:w="3136" w:type="dxa"/>
             <w:tcBorders>
               <w:top w:val="single" w:sz="6" w:space="0" w:color="auto"/>
               <w:left w:val="single" w:sz="6" w:space="0" w:color="auto"/>
@@ -13104,7 +13075,7 @@
         </w:tc>
         <w:tc>
           <w:tcPr>
-            <w:tcW w:w="0" w:type="auto"/>
+            <w:tcW w:w="3645" w:type="dxa"/>
             <w:tcBorders>
               <w:top w:val="single" w:sz="2" w:space="0" w:color="auto"/>
               <w:left w:val="single" w:sz="6" w:space="0" w:color="auto"/>
@@ -13140,7 +13111,7 @@
         </w:tc>
         <w:tc>
           <w:tcPr>
-            <w:tcW w:w="0" w:type="auto"/>
+            <w:tcW w:w="3136" w:type="dxa"/>
             <w:tcBorders>
               <w:top w:val="single" w:sz="2" w:space="0" w:color="auto"/>
               <w:left w:val="single" w:sz="6" w:space="0" w:color="auto"/>
@@ -13256,7 +13227,7 @@
         </w:tc>
         <w:tc>
           <w:tcPr>
-            <w:tcW w:w="0" w:type="auto"/>
+            <w:tcW w:w="3645" w:type="dxa"/>
             <w:tcBorders>
               <w:top w:val="single" w:sz="2" w:space="0" w:color="auto"/>
               <w:left w:val="single" w:sz="6" w:space="0" w:color="auto"/>
@@ -13292,7 +13263,7 @@
         </w:tc>
         <w:tc>
           <w:tcPr>
-            <w:tcW w:w="0" w:type="auto"/>
+            <w:tcW w:w="3136" w:type="dxa"/>
             <w:tcBorders>
               <w:top w:val="single" w:sz="2" w:space="0" w:color="auto"/>
               <w:left w:val="single" w:sz="6" w:space="0" w:color="auto"/>
@@ -13408,7 +13379,7 @@
         </w:tc>
         <w:tc>
           <w:tcPr>
-            <w:tcW w:w="0" w:type="auto"/>
+            <w:tcW w:w="3645" w:type="dxa"/>
             <w:tcBorders>
               <w:top w:val="single" w:sz="2" w:space="0" w:color="auto"/>
               <w:left w:val="single" w:sz="6" w:space="0" w:color="auto"/>
@@ -13455,7 +13426,7 @@
         </w:tc>
         <w:tc>
           <w:tcPr>
-            <w:tcW w:w="0" w:type="auto"/>
+            <w:tcW w:w="3136" w:type="dxa"/>
             <w:tcBorders>
               <w:top w:val="single" w:sz="2" w:space="0" w:color="auto"/>
               <w:left w:val="single" w:sz="6" w:space="0" w:color="auto"/>
@@ -13593,7 +13564,7 @@
         </w:tc>
         <w:tc>
           <w:tcPr>
-            <w:tcW w:w="0" w:type="auto"/>
+            <w:tcW w:w="3645" w:type="dxa"/>
             <w:tcBorders>
               <w:top w:val="single" w:sz="2" w:space="0" w:color="auto"/>
               <w:left w:val="single" w:sz="6" w:space="0" w:color="auto"/>
@@ -13629,7 +13600,7 @@
         </w:tc>
         <w:tc>
           <w:tcPr>
-            <w:tcW w:w="0" w:type="auto"/>
+            <w:tcW w:w="3136" w:type="dxa"/>
             <w:tcBorders>
               <w:top w:val="single" w:sz="2" w:space="0" w:color="auto"/>
               <w:left w:val="single" w:sz="6" w:space="0" w:color="auto"/>
@@ -13745,7 +13716,7 @@
         </w:tc>
         <w:tc>
           <w:tcPr>
-            <w:tcW w:w="0" w:type="auto"/>
+            <w:tcW w:w="3645" w:type="dxa"/>
             <w:tcBorders>
               <w:top w:val="single" w:sz="2" w:space="0" w:color="auto"/>
               <w:left w:val="single" w:sz="6" w:space="0" w:color="auto"/>
@@ -13781,7 +13752,7 @@
         </w:tc>
         <w:tc>
           <w:tcPr>
-            <w:tcW w:w="0" w:type="auto"/>
+            <w:tcW w:w="3136" w:type="dxa"/>
             <w:tcBorders>
               <w:top w:val="single" w:sz="2" w:space="0" w:color="auto"/>
               <w:left w:val="single" w:sz="6" w:space="0" w:color="auto"/>
@@ -15091,26 +15062,6 @@
     </w:p>
     <w:p>
       <w:pPr>
-        <w:spacing w:after="0" w:line="240" w:lineRule="auto"/>
-        <w:rPr>
-          <w:rFonts w:ascii="Arial" w:eastAsia="Times New Roman" w:hAnsi="Arial" w:cs="Arial"/>
-          <w:color w:val="000000"/>
-          <w:lang w:eastAsia="en-IN"/>
-        </w:rPr>
-      </w:pPr>
-    </w:p>
-    <w:p>
-      <w:pPr>
-        <w:spacing w:after="0" w:line="240" w:lineRule="auto"/>
-        <w:rPr>
-          <w:rFonts w:ascii="Arial" w:eastAsia="Times New Roman" w:hAnsi="Arial" w:cs="Arial"/>
-          <w:color w:val="000000"/>
-          <w:lang w:eastAsia="en-IN"/>
-        </w:rPr>
-      </w:pPr>
-    </w:p>
-    <w:p>
-      <w:pPr>
         <w:pStyle w:val="Heading3"/>
         <w:rPr>
           <w:rFonts w:asciiTheme="majorHAnsi" w:hAnsiTheme="majorHAnsi" w:cstheme="majorHAnsi"/>
@@ -16913,7 +16864,8 @@
     </w:p>
     <w:tbl>
       <w:tblPr>
-        <w:tblW w:w="10920" w:type="dxa"/>
+        <w:tblW w:w="0" w:type="auto"/>
+        <w:jc w:val="center"/>
         <w:tblCellSpacing w:w="15" w:type="dxa"/>
         <w:tblBorders>
           <w:top w:val="single" w:sz="2" w:space="0" w:color="auto"/>
@@ -16931,17 +16883,18 @@
         <w:tblLook w:val="04A0" w:firstRow="1" w:lastRow="0" w:firstColumn="1" w:lastColumn="0" w:noHBand="0" w:noVBand="1"/>
       </w:tblPr>
       <w:tblGrid>
-        <w:gridCol w:w="1693"/>
-        <w:gridCol w:w="9227"/>
+        <w:gridCol w:w="1465"/>
+        <w:gridCol w:w="8985"/>
       </w:tblGrid>
       <w:tr>
         <w:trPr>
           <w:trHeight w:val="1604"/>
           <w:tblCellSpacing w:w="15" w:type="dxa"/>
+          <w:jc w:val="center"/>
         </w:trPr>
         <w:tc>
           <w:tcPr>
-            <w:tcW w:w="1648" w:type="dxa"/>
+            <w:tcW w:w="0" w:type="auto"/>
             <w:tcBorders>
               <w:top w:val="single" w:sz="2" w:space="0" w:color="auto"/>
               <w:left w:val="single" w:sz="6" w:space="0" w:color="auto"/>
@@ -16949,7 +16902,7 @@
               <w:right w:val="single" w:sz="2" w:space="0" w:color="auto"/>
             </w:tcBorders>
             <w:shd w:val="clear" w:color="auto" w:fill="FFFFFF"/>
-            <w:vAlign w:val="bottom"/>
+            <w:vAlign w:val="center"/>
             <w:hideMark/>
           </w:tcPr>
           <w:p>
@@ -16977,7 +16930,7 @@
         </w:tc>
         <w:tc>
           <w:tcPr>
-            <w:tcW w:w="9182" w:type="dxa"/>
+            <w:tcW w:w="0" w:type="auto"/>
             <w:tcBorders>
               <w:top w:val="single" w:sz="2" w:space="0" w:color="auto"/>
               <w:left w:val="single" w:sz="6" w:space="0" w:color="auto"/>
@@ -16985,7 +16938,7 @@
               <w:right w:val="single" w:sz="6" w:space="0" w:color="auto"/>
             </w:tcBorders>
             <w:shd w:val="clear" w:color="auto" w:fill="FFFFFF"/>
-            <w:vAlign w:val="bottom"/>
+            <w:vAlign w:val="center"/>
             <w:hideMark/>
           </w:tcPr>
           <w:p>
@@ -21694,7 +21647,7 @@
               <w:right w:val="single" w:sz="2" w:space="0" w:color="auto"/>
             </w:tcBorders>
             <w:shd w:val="clear" w:color="auto" w:fill="FFFFFF"/>
-            <w:vAlign w:val="bottom"/>
+            <w:vAlign w:val="center"/>
             <w:hideMark/>
           </w:tcPr>
           <w:p>
@@ -21730,7 +21683,7 @@
               <w:right w:val="single" w:sz="6" w:space="0" w:color="auto"/>
             </w:tcBorders>
             <w:shd w:val="clear" w:color="auto" w:fill="FFFFFF"/>
-            <w:vAlign w:val="bottom"/>
+            <w:vAlign w:val="center"/>
             <w:hideMark/>
           </w:tcPr>
           <w:p>
@@ -21824,7 +21777,7 @@
               <w:right w:val="single" w:sz="2" w:space="0" w:color="auto"/>
             </w:tcBorders>
             <w:shd w:val="clear" w:color="auto" w:fill="FFFFFF"/>
-            <w:vAlign w:val="bottom"/>
+            <w:vAlign w:val="center"/>
             <w:hideMark/>
           </w:tcPr>
           <w:p>
@@ -21860,7 +21813,7 @@
               <w:right w:val="single" w:sz="6" w:space="0" w:color="auto"/>
             </w:tcBorders>
             <w:shd w:val="clear" w:color="auto" w:fill="FFFFFF"/>
-            <w:vAlign w:val="bottom"/>
+            <w:vAlign w:val="center"/>
             <w:hideMark/>
           </w:tcPr>
           <w:p>
@@ -21938,7 +21891,7 @@
               <w:right w:val="single" w:sz="2" w:space="0" w:color="auto"/>
             </w:tcBorders>
             <w:shd w:val="clear" w:color="auto" w:fill="FFFFFF"/>
-            <w:vAlign w:val="bottom"/>
+            <w:vAlign w:val="center"/>
             <w:hideMark/>
           </w:tcPr>
           <w:p>
@@ -21974,7 +21927,7 @@
               <w:right w:val="single" w:sz="6" w:space="0" w:color="auto"/>
             </w:tcBorders>
             <w:shd w:val="clear" w:color="auto" w:fill="FFFFFF"/>
-            <w:vAlign w:val="bottom"/>
+            <w:vAlign w:val="center"/>
             <w:hideMark/>
           </w:tcPr>
           <w:p>
@@ -22093,7 +22046,7 @@
               <w:right w:val="single" w:sz="2" w:space="0" w:color="auto"/>
             </w:tcBorders>
             <w:shd w:val="clear" w:color="auto" w:fill="FFFFFF"/>
-            <w:vAlign w:val="bottom"/>
+            <w:vAlign w:val="center"/>
             <w:hideMark/>
           </w:tcPr>
           <w:p>
@@ -22129,7 +22082,7 @@
               <w:right w:val="single" w:sz="6" w:space="0" w:color="auto"/>
             </w:tcBorders>
             <w:shd w:val="clear" w:color="auto" w:fill="FFFFFF"/>
-            <w:vAlign w:val="bottom"/>
+            <w:vAlign w:val="center"/>
             <w:hideMark/>
           </w:tcPr>
           <w:p>
@@ -30118,7 +30071,19 @@
         <w:rPr>
           <w:sz w:val="24"/>
         </w:rPr>
-        <w:t>We know Object class is parent of all classes, so it also possible to get all functionalities of generics from Object class, but issue is that g</w:t>
+        <w:t xml:space="preserve">We know Object class is parent of all classes, so it </w:t>
+      </w:r>
+      <w:r>
+        <w:rPr>
+          <w:sz w:val="24"/>
+        </w:rPr>
+        <w:t xml:space="preserve">is </w:t>
+      </w:r>
+      <w:r>
+        <w:rPr>
+          <w:sz w:val="24"/>
+        </w:rPr>
+        <w:t>also possible to get all functionalities of generics from Object class, but issue is that g</w:t>
       </w:r>
       <w:r>
         <w:rPr>
@@ -35911,6 +35876,7 @@
     </w:p>
     <w:p>
       <w:pPr>
+        <w:jc w:val="center"/>
         <w:rPr>
           <w:sz w:val="24"/>
           <w:lang w:eastAsia="en-IN"/>
@@ -35919,6 +35885,7 @@
     </w:p>
     <w:p>
       <w:pPr>
+        <w:jc w:val="center"/>
         <w:rPr>
           <w:sz w:val="24"/>
           <w:lang w:eastAsia="en-IN"/>
@@ -35932,4460 +35899,64 @@
           <w:lang w:eastAsia="en-IN"/>
         </w:rPr>
       </w:pPr>
-    </w:p>
-    <w:p>
-      <w:pPr>
-        <w:rPr>
-          <w:sz w:val="24"/>
-          <w:lang w:eastAsia="en-IN"/>
-        </w:rPr>
-      </w:pPr>
-    </w:p>
-    <w:p>
-      <w:pPr>
-        <w:rPr>
-          <w:sz w:val="24"/>
-          <w:lang w:eastAsia="en-IN"/>
-        </w:rPr>
-      </w:pPr>
-    </w:p>
-    <w:p>
-      <w:pPr>
-        <w:rPr>
-          <w:sz w:val="24"/>
-          <w:lang w:eastAsia="en-IN"/>
-        </w:rPr>
-      </w:pPr>
-    </w:p>
-    <w:p>
-      <w:pPr>
-        <w:rPr>
-          <w:sz w:val="24"/>
-          <w:lang w:eastAsia="en-IN"/>
-        </w:rPr>
-      </w:pPr>
-    </w:p>
-    <w:p>
-      <w:pPr>
-        <w:pStyle w:val="Heading2"/>
-        <w:spacing w:after="240"/>
-        <w:rPr>
-          <w:rFonts w:eastAsia="Times New Roman"/>
-          <w:b/>
-          <w:color w:val="1F4E79" w:themeColor="accent5" w:themeShade="80"/>
-          <w:sz w:val="40"/>
-          <w:vertAlign w:val="subscript"/>
-          <w:lang w:eastAsia="en-IN"/>
-        </w:rPr>
-      </w:pPr>
-      <w:bookmarkStart w:id="21" w:name="_Toc197846310"/>
-      <w:r>
-        <w:rPr>
-          <w:rFonts w:eastAsia="Times New Roman"/>
-          <w:b/>
-          <w:color w:val="1F4E79" w:themeColor="accent5" w:themeShade="80"/>
-          <w:sz w:val="40"/>
-          <w:lang w:eastAsia="en-IN"/>
-        </w:rPr>
-        <w:lastRenderedPageBreak/>
-        <w:t>9</w:t>
-      </w:r>
-      <w:r>
-        <w:rPr>
-          <w:rFonts w:eastAsia="Times New Roman"/>
-          <w:b/>
-          <w:color w:val="1F4E79" w:themeColor="accent5" w:themeShade="80"/>
-          <w:sz w:val="40"/>
-          <w:lang w:eastAsia="en-IN"/>
-        </w:rPr>
-        <w:t xml:space="preserve">. </w:t>
-      </w:r>
-      <w:r>
-        <w:rPr>
-          <w:rFonts w:eastAsia="Times New Roman"/>
-          <w:b/>
-          <w:color w:val="1F4E79" w:themeColor="accent5" w:themeShade="80"/>
-          <w:sz w:val="40"/>
-          <w:lang w:eastAsia="en-IN"/>
-        </w:rPr>
-        <w:t>Interview Questions</w:t>
-      </w:r>
+      <w:bookmarkStart w:id="21" w:name="_GoBack"/>
       <w:bookmarkEnd w:id="21"/>
     </w:p>
     <w:p>
       <w:pPr>
-        <w:rPr>
-          <w:sz w:val="10"/>
-          <w:lang w:eastAsia="en-IN"/>
-        </w:rPr>
-      </w:pPr>
+        <w:spacing w:after="0"/>
+        <w:jc w:val="center"/>
+        <w:rPr>
+          <w:b/>
+          <w:sz w:val="36"/>
+          <w:lang w:eastAsia="en-IN"/>
+        </w:rPr>
+      </w:pPr>
+      <w:r>
+        <w:rPr>
+          <w:b/>
+          <w:sz w:val="36"/>
+          <w:lang w:eastAsia="en-IN"/>
+        </w:rPr>
+        <w:t>For Interview Questions, Check Out:</w:t>
+      </w:r>
     </w:p>
     <w:p>
       <w:pPr>
-        <w:rPr>
-          <w:b/>
-          <w:sz w:val="24"/>
-          <w:lang w:eastAsia="en-IN"/>
-        </w:rPr>
-      </w:pPr>
-      <w:r>
-        <w:rPr>
-          <w:b/>
-          <w:sz w:val="24"/>
-          <w:lang w:eastAsia="en-IN"/>
-        </w:rPr>
-        <w:t xml:space="preserve">Q1. How </w:t>
-      </w:r>
-      <w:proofErr w:type="spellStart"/>
-      <w:r>
-        <w:rPr>
-          <w:b/>
-          <w:sz w:val="24"/>
-          <w:lang w:eastAsia="en-IN"/>
-        </w:rPr>
-        <w:t>Hashmap</w:t>
-      </w:r>
-      <w:proofErr w:type="spellEnd"/>
-      <w:r>
-        <w:rPr>
-          <w:b/>
-          <w:sz w:val="24"/>
-          <w:lang w:eastAsia="en-IN"/>
-        </w:rPr>
-        <w:t xml:space="preserve"> is implemented internally in java?</w:t>
-      </w:r>
-    </w:p>
-    <w:p>
-      <w:pPr>
-        <w:rPr>
-          <w:sz w:val="24"/>
-          <w:lang w:eastAsia="en-IN"/>
-        </w:rPr>
-      </w:pPr>
-      <w:r>
-        <w:rPr>
-          <w:sz w:val="24"/>
-          <w:lang w:eastAsia="en-IN"/>
-        </w:rPr>
-        <w:t xml:space="preserve">A </w:t>
-      </w:r>
-      <w:proofErr w:type="spellStart"/>
-      <w:r>
-        <w:rPr>
-          <w:sz w:val="24"/>
-          <w:lang w:eastAsia="en-IN"/>
-        </w:rPr>
-        <w:t>HashMap</w:t>
-      </w:r>
-      <w:proofErr w:type="spellEnd"/>
-      <w:r>
-        <w:rPr>
-          <w:sz w:val="24"/>
-          <w:lang w:eastAsia="en-IN"/>
-        </w:rPr>
-        <w:t>&lt;K, V&gt; is part of the Java Collections Framew</w:t>
-      </w:r>
-      <w:r>
-        <w:rPr>
-          <w:sz w:val="24"/>
-          <w:lang w:eastAsia="en-IN"/>
-        </w:rPr>
-        <w:t xml:space="preserve">ork and stores key-value pairs. </w:t>
-      </w:r>
-      <w:r>
-        <w:rPr>
-          <w:sz w:val="24"/>
-          <w:lang w:eastAsia="en-IN"/>
-        </w:rPr>
-        <w:t xml:space="preserve">It allows one null key and multiple null values, and does not maintain insertion order (use </w:t>
-      </w:r>
-      <w:proofErr w:type="spellStart"/>
-      <w:r>
-        <w:rPr>
-          <w:sz w:val="24"/>
-          <w:lang w:eastAsia="en-IN"/>
-        </w:rPr>
-        <w:t>LinkedHashMap</w:t>
-      </w:r>
-      <w:proofErr w:type="spellEnd"/>
-      <w:r>
-        <w:rPr>
-          <w:sz w:val="24"/>
-          <w:lang w:eastAsia="en-IN"/>
-        </w:rPr>
-        <w:t xml:space="preserve"> for that).</w:t>
-      </w:r>
-    </w:p>
-    <w:p>
-      <w:pPr>
+        <w:spacing w:after="0"/>
         <w:jc w:val="center"/>
         <w:rPr>
-          <w:sz w:val="24"/>
-          <w:lang w:eastAsia="en-IN"/>
-        </w:rPr>
-      </w:pPr>
-      <w:r>
-        <w:rPr>
-          <w:noProof/>
-          <w:sz w:val="24"/>
-          <w:lang w:eastAsia="en-IN"/>
-        </w:rPr>
-        <w:drawing>
-          <wp:inline distT="0" distB="0" distL="0" distR="0" wp14:anchorId="71CF7F87" wp14:editId="3A44840F">
-            <wp:extent cx="3721779" cy="1581027"/>
-            <wp:effectExtent l="0" t="0" r="0" b="635"/>
-            <wp:docPr id="1" name="Picture 1"/>
-            <wp:cNvGraphicFramePr>
-              <a:graphicFrameLocks xmlns:a="http://schemas.openxmlformats.org/drawingml/2006/main" noChangeAspect="1"/>
-            </wp:cNvGraphicFramePr>
-            <a:graphic xmlns:a="http://schemas.openxmlformats.org/drawingml/2006/main">
-              <a:graphicData uri="http://schemas.openxmlformats.org/drawingml/2006/picture">
-                <pic:pic xmlns:pic="http://schemas.openxmlformats.org/drawingml/2006/picture">
-                  <pic:nvPicPr>
-                    <pic:cNvPr id="1" name=""/>
-                    <pic:cNvPicPr/>
-                  </pic:nvPicPr>
-                  <pic:blipFill>
-                    <a:blip r:embed="rId10"/>
-                    <a:stretch>
-                      <a:fillRect/>
-                    </a:stretch>
-                  </pic:blipFill>
-                  <pic:spPr>
-                    <a:xfrm>
-                      <a:off x="0" y="0"/>
-                      <a:ext cx="3758700" cy="1596711"/>
-                    </a:xfrm>
-                    <a:prstGeom prst="rect">
-                      <a:avLst/>
-                    </a:prstGeom>
-                  </pic:spPr>
-                </pic:pic>
-              </a:graphicData>
-            </a:graphic>
-          </wp:inline>
-        </w:drawing>
-      </w:r>
-    </w:p>
-    <w:p>
-      <w:pPr>
-        <w:rPr>
-          <w:b/>
-          <w:sz w:val="24"/>
-          <w:lang w:eastAsia="en-IN"/>
-        </w:rPr>
-      </w:pPr>
-      <w:r>
-        <w:rPr>
-          <w:b/>
-          <w:sz w:val="24"/>
-          <w:lang w:eastAsia="en-IN"/>
-        </w:rPr>
-        <w:t xml:space="preserve">Internally, a </w:t>
-      </w:r>
-      <w:proofErr w:type="spellStart"/>
-      <w:r>
-        <w:rPr>
-          <w:b/>
-          <w:sz w:val="24"/>
-          <w:lang w:eastAsia="en-IN"/>
-        </w:rPr>
-        <w:t>HashMap</w:t>
-      </w:r>
-      <w:proofErr w:type="spellEnd"/>
-      <w:r>
-        <w:rPr>
-          <w:b/>
-          <w:sz w:val="24"/>
-          <w:lang w:eastAsia="en-IN"/>
-        </w:rPr>
-        <w:t xml:space="preserve"> uses:</w:t>
-      </w:r>
-    </w:p>
-    <w:p>
-      <w:pPr>
-        <w:pStyle w:val="ListParagraph"/>
-        <w:numPr>
-          <w:ilvl w:val="0"/>
-          <w:numId w:val="27"/>
-        </w:numPr>
-        <w:rPr>
-          <w:sz w:val="24"/>
-          <w:lang w:eastAsia="en-IN"/>
-        </w:rPr>
-      </w:pPr>
-      <w:r>
-        <w:rPr>
-          <w:sz w:val="24"/>
-          <w:lang w:eastAsia="en-IN"/>
-        </w:rPr>
-        <w:t>An array of buckets (Node&lt;K,V&gt;[] table)</w:t>
-      </w:r>
-    </w:p>
-    <w:p>
-      <w:pPr>
-        <w:pStyle w:val="ListParagraph"/>
-        <w:numPr>
-          <w:ilvl w:val="0"/>
-          <w:numId w:val="27"/>
-        </w:numPr>
-        <w:rPr>
-          <w:sz w:val="24"/>
-          <w:lang w:eastAsia="en-IN"/>
-        </w:rPr>
-      </w:pPr>
-      <w:r>
-        <w:rPr>
-          <w:sz w:val="24"/>
-          <w:lang w:eastAsia="en-IN"/>
-        </w:rPr>
-        <w:t>Each bucket is a linked list or tree (in Java 8+)</w:t>
-      </w:r>
-    </w:p>
-    <w:p>
-      <w:pPr>
-        <w:pStyle w:val="ListParagraph"/>
-        <w:numPr>
-          <w:ilvl w:val="0"/>
-          <w:numId w:val="27"/>
-        </w:numPr>
-        <w:rPr>
-          <w:sz w:val="24"/>
-          <w:lang w:eastAsia="en-IN"/>
-        </w:rPr>
-      </w:pPr>
-      <w:r>
-        <w:rPr>
-          <w:sz w:val="24"/>
-          <w:lang w:eastAsia="en-IN"/>
-        </w:rPr>
-        <w:t>Each entry (</w:t>
-      </w:r>
-      <w:proofErr w:type="spellStart"/>
-      <w:r>
-        <w:rPr>
-          <w:sz w:val="24"/>
-          <w:lang w:eastAsia="en-IN"/>
-        </w:rPr>
-        <w:t>Map.Entry</w:t>
-      </w:r>
-      <w:proofErr w:type="spellEnd"/>
-      <w:r>
-        <w:rPr>
-          <w:sz w:val="24"/>
-          <w:lang w:eastAsia="en-IN"/>
-        </w:rPr>
-        <w:t>) contains: Key, Value, Hash, Pointer to next node</w:t>
-      </w:r>
-    </w:p>
-    <w:p>
-      <w:pPr>
-        <w:rPr>
-          <w:sz w:val="24"/>
-          <w:lang w:eastAsia="en-IN"/>
-        </w:rPr>
-      </w:pPr>
-    </w:p>
-    <w:p>
-      <w:pPr>
-        <w:rPr>
-          <w:b/>
-          <w:bCs/>
-          <w:sz w:val="24"/>
-          <w:lang w:eastAsia="en-IN"/>
-        </w:rPr>
-      </w:pPr>
-      <w:r>
-        <w:rPr>
-          <w:rFonts w:ascii="Segoe UI Symbol" w:hAnsi="Segoe UI Symbol" w:cs="Segoe UI Symbol"/>
-          <w:b/>
-          <w:bCs/>
-          <w:sz w:val="24"/>
-          <w:lang w:eastAsia="en-IN"/>
-        </w:rPr>
-        <w:t>➕</w:t>
-      </w:r>
-      <w:r>
-        <w:rPr>
-          <w:b/>
-          <w:bCs/>
-          <w:sz w:val="24"/>
-          <w:lang w:eastAsia="en-IN"/>
-        </w:rPr>
-        <w:t xml:space="preserve"> </w:t>
-      </w:r>
-      <w:proofErr w:type="gramStart"/>
-      <w:r>
-        <w:rPr>
-          <w:b/>
-          <w:bCs/>
-          <w:sz w:val="24"/>
-          <w:lang w:eastAsia="en-IN"/>
-        </w:rPr>
-        <w:t>put(</w:t>
-      </w:r>
-      <w:proofErr w:type="gramEnd"/>
-      <w:r>
-        <w:rPr>
-          <w:b/>
-          <w:bCs/>
-          <w:sz w:val="24"/>
-          <w:lang w:eastAsia="en-IN"/>
-        </w:rPr>
-        <w:t>K key, V value)</w:t>
-      </w:r>
-    </w:p>
-    <w:p>
-      <w:pPr>
-        <w:pStyle w:val="ListParagraph"/>
-        <w:numPr>
-          <w:ilvl w:val="0"/>
-          <w:numId w:val="33"/>
-        </w:numPr>
-        <w:rPr>
-          <w:sz w:val="24"/>
-          <w:lang w:eastAsia="en-IN"/>
-        </w:rPr>
-      </w:pPr>
-      <w:r>
-        <w:rPr>
-          <w:sz w:val="24"/>
-          <w:lang w:eastAsia="en-IN"/>
-        </w:rPr>
-        <w:t xml:space="preserve">Compute the </w:t>
-      </w:r>
-      <w:r>
-        <w:rPr>
-          <w:b/>
-          <w:bCs/>
-          <w:sz w:val="24"/>
-          <w:lang w:eastAsia="en-IN"/>
-        </w:rPr>
-        <w:t>hash</w:t>
-      </w:r>
-      <w:r>
-        <w:rPr>
-          <w:sz w:val="24"/>
-          <w:lang w:eastAsia="en-IN"/>
-        </w:rPr>
-        <w:t xml:space="preserve"> of the key.</w:t>
-      </w:r>
-    </w:p>
-    <w:p>
-      <w:pPr>
-        <w:pStyle w:val="ListParagraph"/>
-        <w:numPr>
-          <w:ilvl w:val="0"/>
-          <w:numId w:val="33"/>
-        </w:numPr>
-        <w:rPr>
-          <w:sz w:val="24"/>
-          <w:lang w:eastAsia="en-IN"/>
-        </w:rPr>
-      </w:pPr>
-      <w:r>
-        <w:rPr>
-          <w:sz w:val="24"/>
-          <w:lang w:eastAsia="en-IN"/>
-        </w:rPr>
-        <w:t xml:space="preserve">Find the </w:t>
-      </w:r>
-      <w:r>
-        <w:rPr>
-          <w:b/>
-          <w:bCs/>
-          <w:sz w:val="24"/>
-          <w:lang w:eastAsia="en-IN"/>
-        </w:rPr>
-        <w:t>index (bucket)</w:t>
-      </w:r>
-      <w:r>
-        <w:rPr>
-          <w:sz w:val="24"/>
-          <w:lang w:eastAsia="en-IN"/>
-        </w:rPr>
-        <w:t xml:space="preserve"> using: </w:t>
-      </w:r>
-      <w:r>
-        <w:rPr>
           <w:color w:val="0070C0"/>
-          <w:sz w:val="24"/>
-          <w:lang w:eastAsia="en-IN"/>
-        </w:rPr>
-        <w:t>index = (n - 1) &amp; hash;</w:t>
-      </w:r>
-    </w:p>
-    <w:p>
-      <w:pPr>
-        <w:pStyle w:val="ListParagraph"/>
-        <w:numPr>
-          <w:ilvl w:val="0"/>
-          <w:numId w:val="33"/>
-        </w:numPr>
-        <w:rPr>
-          <w:sz w:val="24"/>
-          <w:lang w:eastAsia="en-IN"/>
-        </w:rPr>
-      </w:pPr>
-      <w:r>
-        <w:rPr>
-          <w:sz w:val="24"/>
-          <w:lang w:eastAsia="en-IN"/>
-        </w:rPr>
-        <w:t xml:space="preserve">If bucket is </w:t>
-      </w:r>
-      <w:r>
-        <w:rPr>
-          <w:b/>
-          <w:bCs/>
-          <w:sz w:val="24"/>
-          <w:lang w:eastAsia="en-IN"/>
-        </w:rPr>
-        <w:t>empty</w:t>
-      </w:r>
-      <w:r>
-        <w:rPr>
-          <w:sz w:val="24"/>
-          <w:lang w:eastAsia="en-IN"/>
-        </w:rPr>
-        <w:t>, insert the node.</w:t>
-      </w:r>
-    </w:p>
-    <w:p>
-      <w:pPr>
-        <w:pStyle w:val="ListParagraph"/>
-        <w:numPr>
-          <w:ilvl w:val="0"/>
-          <w:numId w:val="33"/>
-        </w:numPr>
-        <w:rPr>
-          <w:sz w:val="24"/>
-          <w:lang w:eastAsia="en-IN"/>
-        </w:rPr>
-      </w:pPr>
-      <w:r>
-        <w:rPr>
-          <w:sz w:val="24"/>
-          <w:lang w:eastAsia="en-IN"/>
-        </w:rPr>
-        <w:t>If not:</w:t>
-      </w:r>
-    </w:p>
-    <w:p>
-      <w:pPr>
-        <w:pStyle w:val="ListParagraph"/>
-        <w:numPr>
-          <w:ilvl w:val="0"/>
-          <w:numId w:val="32"/>
-        </w:numPr>
-        <w:rPr>
-          <w:sz w:val="24"/>
-          <w:lang w:eastAsia="en-IN"/>
-        </w:rPr>
-      </w:pPr>
-      <w:r>
-        <w:rPr>
-          <w:sz w:val="24"/>
-          <w:lang w:eastAsia="en-IN"/>
-        </w:rPr>
-        <w:t>Search for the key in the linked list.</w:t>
-      </w:r>
-    </w:p>
-    <w:p>
-      <w:pPr>
-        <w:pStyle w:val="ListParagraph"/>
-        <w:numPr>
-          <w:ilvl w:val="0"/>
-          <w:numId w:val="32"/>
-        </w:numPr>
-        <w:rPr>
-          <w:sz w:val="24"/>
-          <w:lang w:eastAsia="en-IN"/>
-        </w:rPr>
-      </w:pPr>
-      <w:r>
-        <w:rPr>
-          <w:sz w:val="24"/>
-          <w:lang w:eastAsia="en-IN"/>
-        </w:rPr>
-        <w:t xml:space="preserve">If found, </w:t>
-      </w:r>
-      <w:r>
-        <w:rPr>
-          <w:b/>
-          <w:bCs/>
-          <w:sz w:val="24"/>
-          <w:lang w:eastAsia="en-IN"/>
-        </w:rPr>
-        <w:t>update value</w:t>
-      </w:r>
-      <w:r>
-        <w:rPr>
-          <w:sz w:val="24"/>
-          <w:lang w:eastAsia="en-IN"/>
-        </w:rPr>
-        <w:t>.</w:t>
-      </w:r>
-    </w:p>
-    <w:p>
-      <w:pPr>
-        <w:pStyle w:val="ListParagraph"/>
-        <w:numPr>
-          <w:ilvl w:val="0"/>
-          <w:numId w:val="32"/>
-        </w:numPr>
-        <w:rPr>
-          <w:sz w:val="24"/>
-          <w:lang w:eastAsia="en-IN"/>
-        </w:rPr>
-      </w:pPr>
-      <w:r>
-        <w:rPr>
-          <w:sz w:val="24"/>
-          <w:lang w:eastAsia="en-IN"/>
-        </w:rPr>
-        <w:t xml:space="preserve">If not found, </w:t>
-      </w:r>
-      <w:r>
-        <w:rPr>
-          <w:b/>
-          <w:bCs/>
-          <w:sz w:val="24"/>
-          <w:lang w:eastAsia="en-IN"/>
-        </w:rPr>
-        <w:t>append node</w:t>
-      </w:r>
-      <w:r>
-        <w:rPr>
-          <w:sz w:val="24"/>
-          <w:lang w:eastAsia="en-IN"/>
-        </w:rPr>
-        <w:t xml:space="preserve"> to list.</w:t>
-      </w:r>
-    </w:p>
-    <w:p>
-      <w:pPr>
-        <w:pStyle w:val="ListParagraph"/>
-        <w:numPr>
-          <w:ilvl w:val="0"/>
-          <w:numId w:val="32"/>
-        </w:numPr>
-        <w:rPr>
-          <w:sz w:val="24"/>
-          <w:lang w:eastAsia="en-IN"/>
-        </w:rPr>
-      </w:pPr>
-      <w:r>
-        <w:rPr>
-          <w:sz w:val="24"/>
-          <w:lang w:eastAsia="en-IN"/>
-        </w:rPr>
-        <w:t xml:space="preserve">If the list exceeds a threshold (8), convert to a </w:t>
-      </w:r>
-      <w:r>
-        <w:rPr>
-          <w:b/>
-          <w:bCs/>
-          <w:sz w:val="24"/>
-          <w:lang w:eastAsia="en-IN"/>
-        </w:rPr>
-        <w:t>tree</w:t>
-      </w:r>
-      <w:r>
-        <w:rPr>
-          <w:sz w:val="24"/>
-          <w:lang w:eastAsia="en-IN"/>
-        </w:rPr>
-        <w:t>.</w:t>
-      </w:r>
-    </w:p>
-    <w:p>
-      <w:pPr>
-        <w:rPr>
-          <w:b/>
-          <w:sz w:val="24"/>
-          <w:lang w:eastAsia="en-IN"/>
-        </w:rPr>
-      </w:pPr>
-    </w:p>
-    <w:p>
-      <w:pPr>
-        <w:spacing w:after="0"/>
-        <w:rPr>
-          <w:b/>
-          <w:sz w:val="24"/>
-          <w:lang w:eastAsia="en-IN"/>
-        </w:rPr>
-      </w:pPr>
-      <w:r>
-        <w:rPr>
-          <w:b/>
-          <w:sz w:val="24"/>
-          <w:lang w:eastAsia="en-IN"/>
-        </w:rPr>
-        <w:t>How hash code is generated:</w:t>
-      </w:r>
-      <w:r>
-        <w:rPr>
-          <w:b/>
-          <w:sz w:val="24"/>
-          <w:lang w:eastAsia="en-IN"/>
-        </w:rPr>
-        <w:t xml:space="preserve"> </w:t>
-      </w:r>
-      <w:r>
-        <w:rPr>
-          <w:sz w:val="24"/>
-          <w:lang w:eastAsia="en-IN"/>
-        </w:rPr>
-        <w:t xml:space="preserve">To get </w:t>
-      </w:r>
-      <w:proofErr w:type="spellStart"/>
-      <w:r>
-        <w:rPr>
-          <w:sz w:val="24"/>
-          <w:lang w:eastAsia="en-IN"/>
-        </w:rPr>
-        <w:t>hashcode</w:t>
-      </w:r>
-      <w:proofErr w:type="spellEnd"/>
-      <w:r>
-        <w:rPr>
-          <w:sz w:val="24"/>
-          <w:lang w:eastAsia="en-IN"/>
-        </w:rPr>
-        <w:t xml:space="preserve"> for Pal: </w:t>
-      </w:r>
-      <w:proofErr w:type="spellStart"/>
-      <w:proofErr w:type="gramStart"/>
-      <w:r>
-        <w:rPr>
-          <w:color w:val="0070C0"/>
-          <w:sz w:val="24"/>
-          <w:lang w:eastAsia="en-IN"/>
-        </w:rPr>
-        <w:t>System.out.println</w:t>
-      </w:r>
-      <w:proofErr w:type="spellEnd"/>
-      <w:r>
-        <w:rPr>
-          <w:color w:val="0070C0"/>
-          <w:sz w:val="24"/>
-          <w:lang w:eastAsia="en-IN"/>
-        </w:rPr>
-        <w:t>(</w:t>
-      </w:r>
-      <w:proofErr w:type="gramEnd"/>
-      <w:r>
-        <w:rPr>
-          <w:color w:val="0070C0"/>
-          <w:sz w:val="24"/>
-          <w:lang w:eastAsia="en-IN"/>
-        </w:rPr>
-        <w:t>"Pal".</w:t>
-      </w:r>
-      <w:proofErr w:type="spellStart"/>
-      <w:r>
-        <w:rPr>
-          <w:color w:val="0070C0"/>
-          <w:sz w:val="24"/>
-          <w:lang w:eastAsia="en-IN"/>
-        </w:rPr>
-        <w:t>hashCode</w:t>
-      </w:r>
-      <w:proofErr w:type="spellEnd"/>
-      <w:r>
-        <w:rPr>
-          <w:color w:val="0070C0"/>
-          <w:sz w:val="24"/>
-          <w:lang w:eastAsia="en-IN"/>
-        </w:rPr>
-        <w:t>());</w:t>
-      </w:r>
-    </w:p>
-    <w:p>
-      <w:pPr>
-        <w:rPr>
-          <w:sz w:val="24"/>
-          <w:lang w:eastAsia="en-IN"/>
-        </w:rPr>
-      </w:pPr>
-      <w:proofErr w:type="gramStart"/>
-      <w:r>
-        <w:rPr>
-          <w:sz w:val="24"/>
-          <w:lang w:eastAsia="en-IN"/>
-        </w:rPr>
-        <w:t>hash</w:t>
-      </w:r>
-      <w:proofErr w:type="gramEnd"/>
-      <w:r>
-        <w:rPr>
-          <w:sz w:val="24"/>
-          <w:lang w:eastAsia="en-IN"/>
-        </w:rPr>
-        <w:t xml:space="preserve"> = s[0]*31ⁿ⁻¹ + s[1]*31ⁿ⁻² + ... + s[n-1]</w:t>
-      </w:r>
-    </w:p>
-    <w:p>
-      <w:pPr>
-        <w:rPr>
-          <w:sz w:val="24"/>
-          <w:lang w:eastAsia="en-IN"/>
-        </w:rPr>
-      </w:pPr>
-      <w:r>
-        <w:rPr>
-          <w:sz w:val="24"/>
-          <w:lang w:eastAsia="en-IN"/>
-        </w:rPr>
-        <w:t xml:space="preserve">For "Pal":  'P' = ASCII </w:t>
-      </w:r>
-      <w:proofErr w:type="gramStart"/>
-      <w:r>
-        <w:rPr>
-          <w:sz w:val="24"/>
-          <w:lang w:eastAsia="en-IN"/>
-        </w:rPr>
-        <w:t>80 ,</w:t>
-      </w:r>
-      <w:proofErr w:type="gramEnd"/>
-      <w:r>
-        <w:rPr>
-          <w:sz w:val="24"/>
-          <w:lang w:eastAsia="en-IN"/>
-        </w:rPr>
-        <w:t xml:space="preserve"> 'a' = ASCII 97, </w:t>
-      </w:r>
-      <w:r>
-        <w:rPr>
-          <w:sz w:val="24"/>
-          <w:lang w:eastAsia="en-IN"/>
-        </w:rPr>
-        <w:t>'l' = ASCII 108</w:t>
-      </w:r>
-    </w:p>
-    <w:p>
-      <w:pPr>
-        <w:spacing w:after="0"/>
-        <w:rPr>
-          <w:sz w:val="24"/>
-          <w:lang w:eastAsia="en-IN"/>
-        </w:rPr>
-      </w:pPr>
-      <w:proofErr w:type="gramStart"/>
-      <w:r>
-        <w:rPr>
-          <w:sz w:val="24"/>
-          <w:lang w:eastAsia="en-IN"/>
-        </w:rPr>
-        <w:t>hash</w:t>
-      </w:r>
-      <w:proofErr w:type="gramEnd"/>
-      <w:r>
-        <w:rPr>
-          <w:sz w:val="24"/>
-          <w:lang w:eastAsia="en-IN"/>
-        </w:rPr>
-        <w:t xml:space="preserve"> = 'P' * 31² + 'a' * 31¹ + 'l' * 31⁰</w:t>
-      </w:r>
-    </w:p>
-    <w:p>
-      <w:pPr>
-        <w:spacing w:after="0"/>
-        <w:rPr>
-          <w:sz w:val="24"/>
-          <w:lang w:eastAsia="en-IN"/>
-        </w:rPr>
-      </w:pPr>
-      <w:r>
-        <w:rPr>
-          <w:sz w:val="24"/>
-          <w:lang w:eastAsia="en-IN"/>
-        </w:rPr>
-        <w:t xml:space="preserve">     = 80 * 961 + 97 * 31 + 108</w:t>
-      </w:r>
-    </w:p>
-    <w:p>
-      <w:pPr>
-        <w:spacing w:after="0"/>
-        <w:rPr>
-          <w:sz w:val="24"/>
-          <w:lang w:eastAsia="en-IN"/>
-        </w:rPr>
-      </w:pPr>
-      <w:r>
-        <w:rPr>
-          <w:sz w:val="24"/>
-          <w:lang w:eastAsia="en-IN"/>
-        </w:rPr>
-        <w:t xml:space="preserve">     = 79995</w:t>
-      </w:r>
-    </w:p>
-    <w:p>
-      <w:pPr>
-        <w:spacing w:after="0"/>
-        <w:rPr>
-          <w:sz w:val="24"/>
-          <w:lang w:eastAsia="en-IN"/>
-        </w:rPr>
-      </w:pPr>
-    </w:p>
-    <w:p>
-      <w:pPr>
-        <w:spacing w:after="0"/>
-        <w:rPr>
-          <w:sz w:val="24"/>
-          <w:lang w:eastAsia="en-IN"/>
-        </w:rPr>
-      </w:pPr>
-    </w:p>
-    <w:p>
-      <w:pPr>
-        <w:rPr>
-          <w:b/>
-          <w:sz w:val="24"/>
-          <w:lang w:eastAsia="en-IN"/>
-        </w:rPr>
-      </w:pPr>
-      <w:r>
-        <w:rPr>
-          <w:b/>
-          <w:sz w:val="24"/>
-          <w:lang w:eastAsia="en-IN"/>
-        </w:rPr>
-        <w:t xml:space="preserve">What happens </w:t>
-      </w:r>
-      <w:r>
-        <w:rPr>
-          <w:b/>
-          <w:sz w:val="24"/>
-          <w:lang w:eastAsia="en-IN"/>
-        </w:rPr>
-        <w:t xml:space="preserve">if all keys have the same hash? </w:t>
-      </w:r>
-      <w:r>
-        <w:rPr>
-          <w:sz w:val="24"/>
-          <w:lang w:eastAsia="en-IN"/>
-        </w:rPr>
-        <w:t>All entries go into the same bucket → poor performance → linked list becomes tree after threshold.</w:t>
-      </w:r>
-    </w:p>
-    <w:p>
-      <w:pPr>
-        <w:rPr>
-          <w:sz w:val="24"/>
-          <w:lang w:eastAsia="en-IN"/>
-        </w:rPr>
-      </w:pPr>
-    </w:p>
-    <w:p>
-      <w:r>
-        <w:rPr>
-          <w:b/>
-          <w:sz w:val="24"/>
-          <w:lang w:eastAsia="en-IN"/>
-        </w:rPr>
-        <w:lastRenderedPageBreak/>
-        <w:t>How collision handled here:</w:t>
-      </w:r>
-      <w:r>
-        <w:rPr>
-          <w:sz w:val="24"/>
-          <w:lang w:eastAsia="en-IN"/>
-        </w:rPr>
-        <w:t xml:space="preserve"> </w:t>
-      </w:r>
-      <w:r>
-        <w:t xml:space="preserve">If multiple entries hash to the same bucket index, they are stored in a </w:t>
-      </w:r>
-      <w:r>
-        <w:rPr>
-          <w:rStyle w:val="Strong"/>
-        </w:rPr>
-        <w:t>linked list</w:t>
-      </w:r>
-      <w:r>
-        <w:t xml:space="preserve"> at that index.</w:t>
-      </w:r>
-    </w:p>
-    <w:p>
-      <w:proofErr w:type="spellStart"/>
-      <w:r>
-        <w:t>Eg</w:t>
-      </w:r>
-      <w:proofErr w:type="spellEnd"/>
-      <w:r>
-        <w:t xml:space="preserve">: Now here for “Pal” and “lap” I will get same index, so what value I will get </w:t>
-      </w:r>
-      <w:r>
-        <w:t xml:space="preserve">by calling </w:t>
-      </w:r>
-      <w:proofErr w:type="spellStart"/>
-      <w:r>
-        <w:t>map.get</w:t>
-      </w:r>
-      <w:proofErr w:type="spellEnd"/>
-      <w:r>
-        <w:t>()</w:t>
-      </w:r>
-    </w:p>
-    <w:p>
-      <w:pPr>
-        <w:rPr>
-          <w:sz w:val="24"/>
-          <w:lang w:eastAsia="en-IN"/>
-        </w:rPr>
-      </w:pPr>
-      <w:r>
-        <w:rPr>
-          <w:sz w:val="24"/>
-          <w:lang w:eastAsia="en-IN"/>
-        </w:rPr>
-        <w:t>Even if "Pal" and "Lap" land in the same bucket index due to hash collision, Java doesn’t just</w:t>
-      </w:r>
-      <w:r>
-        <w:rPr>
-          <w:sz w:val="24"/>
-          <w:lang w:eastAsia="en-IN"/>
-        </w:rPr>
-        <w:t xml:space="preserve"> return the first key it finds.</w:t>
-      </w:r>
-    </w:p>
-    <w:p>
-      <w:pPr>
-        <w:rPr>
-          <w:sz w:val="24"/>
-          <w:lang w:eastAsia="en-IN"/>
-        </w:rPr>
-      </w:pPr>
-      <w:r>
-        <w:rPr>
-          <w:sz w:val="24"/>
-          <w:lang w:eastAsia="en-IN"/>
-        </w:rPr>
-        <w:t>It performs a two-step lookup:</w:t>
-      </w:r>
-    </w:p>
-    <w:p>
-      <w:pPr>
-        <w:rPr>
-          <w:sz w:val="24"/>
-          <w:lang w:eastAsia="en-IN"/>
-        </w:rPr>
-      </w:pPr>
-      <w:r>
-        <w:rPr>
-          <w:sz w:val="24"/>
-          <w:lang w:eastAsia="en-IN"/>
-        </w:rPr>
-        <w:t xml:space="preserve">1. Search for index: </w:t>
-      </w:r>
-      <w:r>
-        <w:rPr>
-          <w:color w:val="0070C0"/>
-          <w:sz w:val="24"/>
-          <w:lang w:eastAsia="en-IN"/>
-        </w:rPr>
-        <w:t xml:space="preserve">index = (n - 1) &amp; </w:t>
-      </w:r>
-      <w:proofErr w:type="gramStart"/>
-      <w:r>
-        <w:rPr>
-          <w:color w:val="0070C0"/>
-          <w:sz w:val="24"/>
-          <w:lang w:eastAsia="en-IN"/>
-        </w:rPr>
-        <w:t>hash(</w:t>
-      </w:r>
-      <w:proofErr w:type="gramEnd"/>
-      <w:r>
-        <w:rPr>
-          <w:color w:val="0070C0"/>
-          <w:sz w:val="24"/>
-          <w:lang w:eastAsia="en-IN"/>
-        </w:rPr>
-        <w:t>"Pal");</w:t>
-      </w:r>
-    </w:p>
-    <w:p>
-      <w:pPr>
-        <w:rPr>
-          <w:sz w:val="24"/>
-          <w:lang w:eastAsia="en-IN"/>
-        </w:rPr>
-      </w:pPr>
-      <w:r>
-        <w:rPr>
-          <w:sz w:val="24"/>
-          <w:lang w:eastAsia="en-IN"/>
-        </w:rPr>
-        <w:t xml:space="preserve">2. </w:t>
-      </w:r>
-      <w:r>
-        <w:rPr>
-          <w:sz w:val="24"/>
-          <w:lang w:eastAsia="en-IN"/>
-        </w:rPr>
-        <w:t>Search the Bucket’s Entries Using .</w:t>
-      </w:r>
-      <w:proofErr w:type="gramStart"/>
-      <w:r>
-        <w:rPr>
-          <w:sz w:val="24"/>
-          <w:lang w:eastAsia="en-IN"/>
-        </w:rPr>
-        <w:t>equals()</w:t>
-      </w:r>
-      <w:proofErr w:type="gramEnd"/>
-    </w:p>
-    <w:p>
-      <w:pPr>
-        <w:spacing w:after="0"/>
-        <w:rPr>
-          <w:color w:val="0070C0"/>
-          <w:sz w:val="24"/>
-          <w:lang w:eastAsia="en-IN"/>
-        </w:rPr>
-      </w:pPr>
-      <w:proofErr w:type="gramStart"/>
-      <w:r>
-        <w:rPr>
-          <w:color w:val="0070C0"/>
-          <w:sz w:val="24"/>
-          <w:lang w:eastAsia="en-IN"/>
-        </w:rPr>
-        <w:t>if</w:t>
-      </w:r>
-      <w:proofErr w:type="gramEnd"/>
-      <w:r>
-        <w:rPr>
-          <w:color w:val="0070C0"/>
-          <w:sz w:val="24"/>
-          <w:lang w:eastAsia="en-IN"/>
-        </w:rPr>
-        <w:t xml:space="preserve"> (</w:t>
-      </w:r>
-      <w:proofErr w:type="spellStart"/>
-      <w:r>
-        <w:rPr>
-          <w:color w:val="0070C0"/>
-          <w:sz w:val="24"/>
-          <w:lang w:eastAsia="en-IN"/>
-        </w:rPr>
-        <w:t>node.hash</w:t>
-      </w:r>
-      <w:proofErr w:type="spellEnd"/>
-      <w:r>
-        <w:rPr>
-          <w:color w:val="0070C0"/>
-          <w:sz w:val="24"/>
-          <w:lang w:eastAsia="en-IN"/>
-        </w:rPr>
-        <w:t xml:space="preserve"> == </w:t>
-      </w:r>
-      <w:proofErr w:type="spellStart"/>
-      <w:r>
-        <w:rPr>
-          <w:color w:val="0070C0"/>
-          <w:sz w:val="24"/>
-          <w:lang w:eastAsia="en-IN"/>
-        </w:rPr>
-        <w:t>key.hashCode</w:t>
-      </w:r>
-      <w:proofErr w:type="spellEnd"/>
-      <w:r>
-        <w:rPr>
-          <w:color w:val="0070C0"/>
-          <w:sz w:val="24"/>
-          <w:lang w:eastAsia="en-IN"/>
-        </w:rPr>
-        <w:t xml:space="preserve">() &amp;&amp; </w:t>
-      </w:r>
-      <w:proofErr w:type="spellStart"/>
-      <w:r>
-        <w:rPr>
-          <w:color w:val="0070C0"/>
-          <w:sz w:val="24"/>
-          <w:lang w:eastAsia="en-IN"/>
-        </w:rPr>
-        <w:t>node.key.equals</w:t>
-      </w:r>
-      <w:proofErr w:type="spellEnd"/>
-      <w:r>
-        <w:rPr>
-          <w:color w:val="0070C0"/>
-          <w:sz w:val="24"/>
-          <w:lang w:eastAsia="en-IN"/>
-        </w:rPr>
-        <w:t>("Pal")) {</w:t>
-      </w:r>
-    </w:p>
-    <w:p>
-      <w:pPr>
-        <w:spacing w:after="0"/>
-        <w:rPr>
-          <w:color w:val="0070C0"/>
-          <w:sz w:val="24"/>
-          <w:lang w:eastAsia="en-IN"/>
-        </w:rPr>
-      </w:pPr>
-      <w:r>
-        <w:rPr>
-          <w:color w:val="0070C0"/>
-          <w:sz w:val="24"/>
-          <w:lang w:eastAsia="en-IN"/>
-        </w:rPr>
-        <w:t xml:space="preserve">    </w:t>
-      </w:r>
-      <w:proofErr w:type="gramStart"/>
-      <w:r>
-        <w:rPr>
-          <w:color w:val="0070C0"/>
-          <w:sz w:val="24"/>
-          <w:lang w:eastAsia="en-IN"/>
-        </w:rPr>
-        <w:t>return</w:t>
-      </w:r>
-      <w:proofErr w:type="gramEnd"/>
-      <w:r>
-        <w:rPr>
-          <w:color w:val="0070C0"/>
-          <w:sz w:val="24"/>
-          <w:lang w:eastAsia="en-IN"/>
-        </w:rPr>
-        <w:t xml:space="preserve"> </w:t>
-      </w:r>
-      <w:proofErr w:type="spellStart"/>
-      <w:r>
-        <w:rPr>
-          <w:color w:val="0070C0"/>
-          <w:sz w:val="24"/>
-          <w:lang w:eastAsia="en-IN"/>
-        </w:rPr>
-        <w:t>node.value</w:t>
-      </w:r>
-      <w:proofErr w:type="spellEnd"/>
-      <w:r>
-        <w:rPr>
-          <w:color w:val="0070C0"/>
-          <w:sz w:val="24"/>
-          <w:lang w:eastAsia="en-IN"/>
-        </w:rPr>
-        <w:t>;</w:t>
-      </w:r>
-    </w:p>
-    <w:p>
-      <w:pPr>
-        <w:spacing w:after="0"/>
-        <w:rPr>
-          <w:color w:val="0070C0"/>
-          <w:sz w:val="24"/>
-          <w:lang w:eastAsia="en-IN"/>
-        </w:rPr>
-      </w:pPr>
-      <w:r>
-        <w:rPr>
-          <w:color w:val="0070C0"/>
-          <w:sz w:val="24"/>
-          <w:lang w:eastAsia="en-IN"/>
-        </w:rPr>
-        <w:t>}</w:t>
-      </w:r>
-    </w:p>
-    <w:p>
-      <w:pPr>
-        <w:spacing w:after="0"/>
-        <w:rPr>
-          <w:color w:val="0070C0"/>
-          <w:sz w:val="24"/>
-          <w:lang w:eastAsia="en-IN"/>
-        </w:rPr>
-      </w:pPr>
-    </w:p>
-    <w:p>
-      <w:pPr>
-        <w:spacing w:after="0"/>
-        <w:rPr>
-          <w:color w:val="0070C0"/>
-          <w:sz w:val="24"/>
-          <w:lang w:eastAsia="en-IN"/>
-        </w:rPr>
-      </w:pPr>
-    </w:p>
-    <w:p>
-      <w:pPr>
-        <w:spacing w:after="0"/>
-        <w:rPr>
-          <w:color w:val="0070C0"/>
-          <w:sz w:val="24"/>
-          <w:lang w:eastAsia="en-IN"/>
-        </w:rPr>
-      </w:pPr>
-    </w:p>
-    <w:p>
-      <w:pPr>
-        <w:spacing w:after="0"/>
-        <w:rPr>
-          <w:color w:val="0070C0"/>
-          <w:sz w:val="24"/>
-          <w:lang w:eastAsia="en-IN"/>
-        </w:rPr>
-      </w:pPr>
-    </w:p>
-    <w:p>
-      <w:pPr>
-        <w:spacing w:after="0"/>
-        <w:rPr>
-          <w:color w:val="0070C0"/>
-          <w:sz w:val="24"/>
-          <w:lang w:eastAsia="en-IN"/>
-        </w:rPr>
-      </w:pPr>
-    </w:p>
-    <w:p>
-      <w:pPr>
-        <w:spacing w:after="0"/>
-        <w:rPr>
-          <w:color w:val="0070C0"/>
-          <w:sz w:val="24"/>
-          <w:lang w:eastAsia="en-IN"/>
-        </w:rPr>
-      </w:pPr>
-    </w:p>
-    <w:p>
-      <w:pPr>
-        <w:spacing w:after="0"/>
-        <w:rPr>
-          <w:color w:val="0070C0"/>
-          <w:sz w:val="24"/>
-          <w:lang w:eastAsia="en-IN"/>
-        </w:rPr>
-      </w:pPr>
-    </w:p>
-    <w:p>
-      <w:pPr>
-        <w:rPr>
-          <w:b/>
-          <w:sz w:val="24"/>
-          <w:lang w:eastAsia="en-IN"/>
-        </w:rPr>
-      </w:pPr>
-      <w:r>
-        <w:rPr>
-          <w:b/>
-          <w:sz w:val="24"/>
-          <w:lang w:eastAsia="en-IN"/>
-        </w:rPr>
-        <w:t>Q2</w:t>
-      </w:r>
-      <w:r>
-        <w:rPr>
-          <w:b/>
-          <w:sz w:val="24"/>
-          <w:lang w:eastAsia="en-IN"/>
-        </w:rPr>
-        <w:t xml:space="preserve">. </w:t>
-      </w:r>
-      <w:r>
-        <w:rPr>
-          <w:b/>
-          <w:sz w:val="24"/>
-          <w:lang w:eastAsia="en-IN"/>
-        </w:rPr>
-        <w:t>Difference between Comparable and Comparator.</w:t>
-      </w:r>
-    </w:p>
-    <w:p>
-      <w:pPr>
-        <w:spacing w:after="0"/>
-        <w:rPr>
-          <w:b/>
-          <w:bCs/>
-          <w:sz w:val="24"/>
-          <w:lang w:eastAsia="en-IN"/>
-        </w:rPr>
-      </w:pPr>
-      <w:r>
-        <w:rPr>
-          <w:b/>
-          <w:bCs/>
-          <w:sz w:val="24"/>
-          <w:lang w:eastAsia="en-IN"/>
-        </w:rPr>
-        <w:t>Comparable</w:t>
-      </w:r>
-    </w:p>
-    <w:p>
-      <w:pPr>
-        <w:numPr>
-          <w:ilvl w:val="0"/>
-          <w:numId w:val="34"/>
-        </w:numPr>
-        <w:spacing w:after="0"/>
-        <w:rPr>
-          <w:sz w:val="24"/>
-          <w:lang w:eastAsia="en-IN"/>
-        </w:rPr>
-      </w:pPr>
-      <w:r>
-        <w:rPr>
-          <w:sz w:val="24"/>
-          <w:lang w:eastAsia="en-IN"/>
-        </w:rPr>
-        <w:t xml:space="preserve">Interface used to define </w:t>
-      </w:r>
-      <w:r>
-        <w:rPr>
-          <w:b/>
-          <w:bCs/>
-          <w:sz w:val="24"/>
-          <w:lang w:eastAsia="en-IN"/>
-        </w:rPr>
-        <w:t>natural ordering</w:t>
-      </w:r>
-      <w:r>
-        <w:rPr>
-          <w:sz w:val="24"/>
-          <w:lang w:eastAsia="en-IN"/>
-        </w:rPr>
-        <w:t xml:space="preserve"> of objects.</w:t>
-      </w:r>
-    </w:p>
-    <w:p>
-      <w:pPr>
-        <w:numPr>
-          <w:ilvl w:val="0"/>
-          <w:numId w:val="34"/>
-        </w:numPr>
-        <w:spacing w:after="0"/>
-        <w:rPr>
-          <w:sz w:val="24"/>
-          <w:lang w:eastAsia="en-IN"/>
-        </w:rPr>
-      </w:pPr>
-      <w:r>
-        <w:rPr>
-          <w:sz w:val="24"/>
-          <w:lang w:eastAsia="en-IN"/>
-        </w:rPr>
-        <w:t xml:space="preserve">Has </w:t>
-      </w:r>
-      <w:proofErr w:type="spellStart"/>
-      <w:proofErr w:type="gramStart"/>
-      <w:r>
-        <w:rPr>
-          <w:sz w:val="24"/>
-          <w:lang w:eastAsia="en-IN"/>
-        </w:rPr>
-        <w:t>compareTo</w:t>
-      </w:r>
-      <w:proofErr w:type="spellEnd"/>
-      <w:r>
-        <w:rPr>
-          <w:sz w:val="24"/>
-          <w:lang w:eastAsia="en-IN"/>
-        </w:rPr>
-        <w:t>(</w:t>
-      </w:r>
-      <w:proofErr w:type="gramEnd"/>
-      <w:r>
-        <w:rPr>
-          <w:sz w:val="24"/>
-          <w:lang w:eastAsia="en-IN"/>
-        </w:rPr>
-        <w:t>) method (e.g., obj1.compareTo(obj2)).</w:t>
-      </w:r>
-    </w:p>
-    <w:p>
-      <w:pPr>
-        <w:numPr>
-          <w:ilvl w:val="0"/>
-          <w:numId w:val="34"/>
-        </w:numPr>
-        <w:spacing w:after="0"/>
-        <w:rPr>
-          <w:sz w:val="24"/>
-          <w:lang w:eastAsia="en-IN"/>
-        </w:rPr>
-      </w:pPr>
-      <w:r>
-        <w:rPr>
-          <w:sz w:val="24"/>
-          <w:lang w:eastAsia="en-IN"/>
-        </w:rPr>
-        <w:t xml:space="preserve">Implemented </w:t>
-      </w:r>
-      <w:r>
-        <w:rPr>
-          <w:b/>
-          <w:bCs/>
-          <w:sz w:val="24"/>
-          <w:lang w:eastAsia="en-IN"/>
-        </w:rPr>
-        <w:t>within the class</w:t>
-      </w:r>
-      <w:r>
-        <w:rPr>
-          <w:sz w:val="24"/>
-          <w:lang w:eastAsia="en-IN"/>
-        </w:rPr>
-        <w:t xml:space="preserve"> to be sorted.</w:t>
-      </w:r>
-    </w:p>
-    <w:p>
-      <w:pPr>
-        <w:spacing w:after="0"/>
-        <w:rPr>
-          <w:b/>
-          <w:bCs/>
-          <w:sz w:val="24"/>
-          <w:lang w:eastAsia="en-IN"/>
-        </w:rPr>
-      </w:pPr>
-      <w:r>
-        <w:rPr>
-          <w:b/>
-          <w:bCs/>
-          <w:sz w:val="24"/>
-          <w:lang w:eastAsia="en-IN"/>
-        </w:rPr>
-        <w:t>Comparator</w:t>
-      </w:r>
-    </w:p>
-    <w:p>
-      <w:pPr>
-        <w:numPr>
-          <w:ilvl w:val="0"/>
-          <w:numId w:val="35"/>
-        </w:numPr>
-        <w:spacing w:after="0"/>
-        <w:rPr>
-          <w:sz w:val="24"/>
-          <w:lang w:eastAsia="en-IN"/>
-        </w:rPr>
-      </w:pPr>
-      <w:r>
-        <w:rPr>
-          <w:sz w:val="24"/>
-          <w:lang w:eastAsia="en-IN"/>
-        </w:rPr>
-        <w:t xml:space="preserve">Interface used to define </w:t>
-      </w:r>
-      <w:r>
-        <w:rPr>
-          <w:b/>
-          <w:bCs/>
-          <w:sz w:val="24"/>
-          <w:lang w:eastAsia="en-IN"/>
-        </w:rPr>
-        <w:t>custom ordering</w:t>
-      </w:r>
-      <w:r>
-        <w:rPr>
-          <w:sz w:val="24"/>
-          <w:lang w:eastAsia="en-IN"/>
-        </w:rPr>
-        <w:t xml:space="preserve"> externally.</w:t>
-      </w:r>
-    </w:p>
-    <w:p>
-      <w:pPr>
-        <w:numPr>
-          <w:ilvl w:val="0"/>
-          <w:numId w:val="35"/>
-        </w:numPr>
-        <w:spacing w:after="0"/>
-        <w:rPr>
-          <w:sz w:val="24"/>
-          <w:lang w:eastAsia="en-IN"/>
-        </w:rPr>
-      </w:pPr>
-      <w:r>
-        <w:rPr>
-          <w:sz w:val="24"/>
-          <w:lang w:eastAsia="en-IN"/>
-        </w:rPr>
-        <w:t xml:space="preserve">Has </w:t>
-      </w:r>
-      <w:proofErr w:type="gramStart"/>
-      <w:r>
-        <w:rPr>
-          <w:sz w:val="24"/>
-          <w:lang w:eastAsia="en-IN"/>
-        </w:rPr>
-        <w:t>compare(</w:t>
-      </w:r>
-      <w:proofErr w:type="gramEnd"/>
-      <w:r>
-        <w:rPr>
-          <w:sz w:val="24"/>
-          <w:lang w:eastAsia="en-IN"/>
-        </w:rPr>
-        <w:t>obj1, obj2) method.</w:t>
-      </w:r>
-    </w:p>
-    <w:p>
-      <w:pPr>
-        <w:numPr>
-          <w:ilvl w:val="0"/>
-          <w:numId w:val="35"/>
-        </w:numPr>
-        <w:spacing w:after="0"/>
-        <w:rPr>
-          <w:sz w:val="24"/>
-          <w:lang w:eastAsia="en-IN"/>
-        </w:rPr>
-      </w:pPr>
-      <w:r>
-        <w:rPr>
-          <w:sz w:val="24"/>
-          <w:lang w:eastAsia="en-IN"/>
-        </w:rPr>
-        <w:t xml:space="preserve">Useful when you </w:t>
-      </w:r>
-      <w:r>
-        <w:rPr>
-          <w:b/>
-          <w:bCs/>
-          <w:sz w:val="24"/>
-          <w:lang w:eastAsia="en-IN"/>
-        </w:rPr>
-        <w:t>can't modify</w:t>
-      </w:r>
-      <w:r>
-        <w:rPr>
-          <w:sz w:val="24"/>
-          <w:lang w:eastAsia="en-IN"/>
-        </w:rPr>
-        <w:t xml:space="preserve"> the original class or need </w:t>
-      </w:r>
-      <w:r>
-        <w:rPr>
-          <w:b/>
-          <w:bCs/>
-          <w:sz w:val="24"/>
-          <w:lang w:eastAsia="en-IN"/>
-        </w:rPr>
-        <w:t>multiple sort logics</w:t>
-      </w:r>
-      <w:r>
-        <w:rPr>
-          <w:sz w:val="24"/>
-          <w:lang w:eastAsia="en-IN"/>
-        </w:rPr>
-        <w:t>.</w:t>
-      </w:r>
-    </w:p>
-    <w:p>
-      <w:pPr>
-        <w:spacing w:after="0"/>
-        <w:rPr>
-          <w:color w:val="0070C0"/>
-          <w:sz w:val="24"/>
-          <w:lang w:eastAsia="en-IN"/>
-        </w:rPr>
-      </w:pPr>
-    </w:p>
-    <w:p>
-      <w:pPr>
-        <w:shd w:val="clear" w:color="auto" w:fill="1F1F1F"/>
-        <w:spacing w:after="0" w:line="285" w:lineRule="atLeast"/>
-        <w:rPr>
-          <w:rFonts w:ascii="Consolas" w:eastAsia="Times New Roman" w:hAnsi="Consolas" w:cs="Times New Roman"/>
-          <w:color w:val="CCCCCC"/>
-          <w:sz w:val="21"/>
-          <w:szCs w:val="21"/>
-          <w:lang w:eastAsia="en-IN"/>
-        </w:rPr>
-      </w:pPr>
-      <w:proofErr w:type="gramStart"/>
-      <w:r>
-        <w:rPr>
-          <w:rFonts w:ascii="Consolas" w:eastAsia="Times New Roman" w:hAnsi="Consolas" w:cs="Times New Roman"/>
-          <w:color w:val="569CD6"/>
-          <w:sz w:val="21"/>
-          <w:szCs w:val="21"/>
-          <w:lang w:eastAsia="en-IN"/>
-        </w:rPr>
-        <w:t>class</w:t>
-      </w:r>
-      <w:proofErr w:type="gramEnd"/>
-      <w:r>
-        <w:rPr>
-          <w:rFonts w:ascii="Consolas" w:eastAsia="Times New Roman" w:hAnsi="Consolas" w:cs="Times New Roman"/>
-          <w:color w:val="CCCCCC"/>
-          <w:sz w:val="21"/>
-          <w:szCs w:val="21"/>
-          <w:lang w:eastAsia="en-IN"/>
-        </w:rPr>
-        <w:t xml:space="preserve"> </w:t>
-      </w:r>
-      <w:r>
-        <w:rPr>
-          <w:rFonts w:ascii="Consolas" w:eastAsia="Times New Roman" w:hAnsi="Consolas" w:cs="Times New Roman"/>
-          <w:color w:val="4EC9B0"/>
-          <w:sz w:val="21"/>
-          <w:szCs w:val="21"/>
-          <w:lang w:eastAsia="en-IN"/>
-        </w:rPr>
-        <w:t>Student</w:t>
-      </w:r>
-      <w:r>
-        <w:rPr>
-          <w:rFonts w:ascii="Consolas" w:eastAsia="Times New Roman" w:hAnsi="Consolas" w:cs="Times New Roman"/>
-          <w:color w:val="CCCCCC"/>
-          <w:sz w:val="21"/>
-          <w:szCs w:val="21"/>
-          <w:lang w:eastAsia="en-IN"/>
-        </w:rPr>
-        <w:t xml:space="preserve"> </w:t>
-      </w:r>
-      <w:r>
-        <w:rPr>
-          <w:rFonts w:ascii="Consolas" w:eastAsia="Times New Roman" w:hAnsi="Consolas" w:cs="Times New Roman"/>
-          <w:color w:val="569CD6"/>
-          <w:sz w:val="21"/>
-          <w:szCs w:val="21"/>
-          <w:lang w:eastAsia="en-IN"/>
-        </w:rPr>
-        <w:t>implements</w:t>
-      </w:r>
-      <w:r>
-        <w:rPr>
-          <w:rFonts w:ascii="Consolas" w:eastAsia="Times New Roman" w:hAnsi="Consolas" w:cs="Times New Roman"/>
-          <w:color w:val="CCCCCC"/>
-          <w:sz w:val="21"/>
-          <w:szCs w:val="21"/>
-          <w:lang w:eastAsia="en-IN"/>
-        </w:rPr>
-        <w:t xml:space="preserve"> </w:t>
-      </w:r>
-      <w:r>
-        <w:rPr>
-          <w:rFonts w:ascii="Consolas" w:eastAsia="Times New Roman" w:hAnsi="Consolas" w:cs="Times New Roman"/>
-          <w:color w:val="4EC9B0"/>
-          <w:sz w:val="21"/>
-          <w:szCs w:val="21"/>
-          <w:lang w:eastAsia="en-IN"/>
-        </w:rPr>
-        <w:t>Comparable</w:t>
-      </w:r>
-      <w:r>
-        <w:rPr>
-          <w:rFonts w:ascii="Consolas" w:eastAsia="Times New Roman" w:hAnsi="Consolas" w:cs="Times New Roman"/>
-          <w:color w:val="CCCCCC"/>
-          <w:sz w:val="21"/>
-          <w:szCs w:val="21"/>
-          <w:lang w:eastAsia="en-IN"/>
-        </w:rPr>
-        <w:t>&lt;</w:t>
-      </w:r>
-      <w:r>
-        <w:rPr>
-          <w:rFonts w:ascii="Consolas" w:eastAsia="Times New Roman" w:hAnsi="Consolas" w:cs="Times New Roman"/>
-          <w:color w:val="4EC9B0"/>
-          <w:sz w:val="21"/>
-          <w:szCs w:val="21"/>
-          <w:lang w:eastAsia="en-IN"/>
-        </w:rPr>
-        <w:t>Student</w:t>
-      </w:r>
-      <w:r>
-        <w:rPr>
-          <w:rFonts w:ascii="Consolas" w:eastAsia="Times New Roman" w:hAnsi="Consolas" w:cs="Times New Roman"/>
-          <w:color w:val="CCCCCC"/>
-          <w:sz w:val="21"/>
-          <w:szCs w:val="21"/>
-          <w:lang w:eastAsia="en-IN"/>
-        </w:rPr>
-        <w:t>&gt; {</w:t>
-      </w:r>
-    </w:p>
-    <w:p>
-      <w:pPr>
-        <w:shd w:val="clear" w:color="auto" w:fill="1F1F1F"/>
-        <w:spacing w:after="0" w:line="285" w:lineRule="atLeast"/>
-        <w:rPr>
-          <w:rFonts w:ascii="Consolas" w:eastAsia="Times New Roman" w:hAnsi="Consolas" w:cs="Times New Roman"/>
-          <w:color w:val="CCCCCC"/>
-          <w:sz w:val="21"/>
-          <w:szCs w:val="21"/>
-          <w:lang w:eastAsia="en-IN"/>
-        </w:rPr>
-      </w:pPr>
-      <w:r>
-        <w:rPr>
-          <w:rFonts w:ascii="Consolas" w:eastAsia="Times New Roman" w:hAnsi="Consolas" w:cs="Times New Roman"/>
-          <w:color w:val="CCCCCC"/>
-          <w:sz w:val="21"/>
-          <w:szCs w:val="21"/>
-          <w:lang w:eastAsia="en-IN"/>
-        </w:rPr>
-        <w:t xml:space="preserve">    </w:t>
-      </w:r>
-      <w:proofErr w:type="spellStart"/>
-      <w:proofErr w:type="gramStart"/>
-      <w:r>
-        <w:rPr>
-          <w:rFonts w:ascii="Consolas" w:eastAsia="Times New Roman" w:hAnsi="Consolas" w:cs="Times New Roman"/>
-          <w:color w:val="4EC9B0"/>
-          <w:sz w:val="21"/>
-          <w:szCs w:val="21"/>
-          <w:lang w:eastAsia="en-IN"/>
-        </w:rPr>
-        <w:t>int</w:t>
-      </w:r>
-      <w:proofErr w:type="spellEnd"/>
-      <w:proofErr w:type="gramEnd"/>
-      <w:r>
-        <w:rPr>
-          <w:rFonts w:ascii="Consolas" w:eastAsia="Times New Roman" w:hAnsi="Consolas" w:cs="Times New Roman"/>
-          <w:color w:val="CCCCCC"/>
-          <w:sz w:val="21"/>
-          <w:szCs w:val="21"/>
-          <w:lang w:eastAsia="en-IN"/>
-        </w:rPr>
-        <w:t xml:space="preserve"> id;</w:t>
-      </w:r>
-    </w:p>
-    <w:p>
-      <w:pPr>
-        <w:shd w:val="clear" w:color="auto" w:fill="1F1F1F"/>
-        <w:spacing w:after="0" w:line="285" w:lineRule="atLeast"/>
-        <w:rPr>
-          <w:rFonts w:ascii="Consolas" w:eastAsia="Times New Roman" w:hAnsi="Consolas" w:cs="Times New Roman"/>
-          <w:color w:val="CCCCCC"/>
-          <w:sz w:val="21"/>
-          <w:szCs w:val="21"/>
-          <w:lang w:eastAsia="en-IN"/>
-        </w:rPr>
-      </w:pPr>
-      <w:r>
-        <w:rPr>
-          <w:rFonts w:ascii="Consolas" w:eastAsia="Times New Roman" w:hAnsi="Consolas" w:cs="Times New Roman"/>
-          <w:color w:val="CCCCCC"/>
-          <w:sz w:val="21"/>
-          <w:szCs w:val="21"/>
-          <w:lang w:eastAsia="en-IN"/>
-        </w:rPr>
-        <w:t xml:space="preserve">    </w:t>
-      </w:r>
-      <w:r>
-        <w:rPr>
-          <w:rFonts w:ascii="Consolas" w:eastAsia="Times New Roman" w:hAnsi="Consolas" w:cs="Times New Roman"/>
-          <w:color w:val="4EC9B0"/>
-          <w:sz w:val="21"/>
-          <w:szCs w:val="21"/>
-          <w:lang w:eastAsia="en-IN"/>
-        </w:rPr>
-        <w:t>String</w:t>
-      </w:r>
-      <w:r>
-        <w:rPr>
-          <w:rFonts w:ascii="Consolas" w:eastAsia="Times New Roman" w:hAnsi="Consolas" w:cs="Times New Roman"/>
-          <w:color w:val="CCCCCC"/>
-          <w:sz w:val="21"/>
-          <w:szCs w:val="21"/>
-          <w:lang w:eastAsia="en-IN"/>
-        </w:rPr>
-        <w:t xml:space="preserve"> name;</w:t>
-      </w:r>
-    </w:p>
-    <w:p>
-      <w:pPr>
-        <w:shd w:val="clear" w:color="auto" w:fill="1F1F1F"/>
-        <w:spacing w:after="0" w:line="285" w:lineRule="atLeast"/>
-        <w:rPr>
-          <w:rFonts w:ascii="Consolas" w:eastAsia="Times New Roman" w:hAnsi="Consolas" w:cs="Times New Roman"/>
-          <w:color w:val="CCCCCC"/>
-          <w:sz w:val="21"/>
-          <w:szCs w:val="21"/>
-          <w:lang w:eastAsia="en-IN"/>
-        </w:rPr>
-      </w:pPr>
-    </w:p>
-    <w:p>
-      <w:pPr>
-        <w:shd w:val="clear" w:color="auto" w:fill="1F1F1F"/>
-        <w:spacing w:after="0" w:line="285" w:lineRule="atLeast"/>
-        <w:rPr>
-          <w:rFonts w:ascii="Consolas" w:eastAsia="Times New Roman" w:hAnsi="Consolas" w:cs="Times New Roman"/>
-          <w:color w:val="CCCCCC"/>
-          <w:sz w:val="21"/>
-          <w:szCs w:val="21"/>
-          <w:lang w:eastAsia="en-IN"/>
-        </w:rPr>
-      </w:pPr>
-      <w:r>
-        <w:rPr>
-          <w:rFonts w:ascii="Consolas" w:eastAsia="Times New Roman" w:hAnsi="Consolas" w:cs="Times New Roman"/>
-          <w:color w:val="CCCCCC"/>
-          <w:sz w:val="21"/>
-          <w:szCs w:val="21"/>
-          <w:lang w:eastAsia="en-IN"/>
-        </w:rPr>
-        <w:t xml:space="preserve">    </w:t>
-      </w:r>
-      <w:proofErr w:type="gramStart"/>
-      <w:r>
-        <w:rPr>
-          <w:rFonts w:ascii="Consolas" w:eastAsia="Times New Roman" w:hAnsi="Consolas" w:cs="Times New Roman"/>
-          <w:color w:val="4EC9B0"/>
-          <w:sz w:val="21"/>
-          <w:szCs w:val="21"/>
-          <w:lang w:eastAsia="en-IN"/>
-        </w:rPr>
-        <w:t>Student</w:t>
-      </w:r>
-      <w:r>
-        <w:rPr>
-          <w:rFonts w:ascii="Consolas" w:eastAsia="Times New Roman" w:hAnsi="Consolas" w:cs="Times New Roman"/>
-          <w:color w:val="CCCCCC"/>
-          <w:sz w:val="21"/>
-          <w:szCs w:val="21"/>
-          <w:lang w:eastAsia="en-IN"/>
-        </w:rPr>
-        <w:t>(</w:t>
-      </w:r>
-      <w:proofErr w:type="spellStart"/>
-      <w:proofErr w:type="gramEnd"/>
-      <w:r>
-        <w:rPr>
-          <w:rFonts w:ascii="Consolas" w:eastAsia="Times New Roman" w:hAnsi="Consolas" w:cs="Times New Roman"/>
-          <w:color w:val="4EC9B0"/>
-          <w:sz w:val="21"/>
-          <w:szCs w:val="21"/>
-          <w:lang w:eastAsia="en-IN"/>
-        </w:rPr>
-        <w:t>int</w:t>
-      </w:r>
-      <w:proofErr w:type="spellEnd"/>
-      <w:r>
-        <w:rPr>
-          <w:rFonts w:ascii="Consolas" w:eastAsia="Times New Roman" w:hAnsi="Consolas" w:cs="Times New Roman"/>
-          <w:color w:val="CCCCCC"/>
-          <w:sz w:val="21"/>
-          <w:szCs w:val="21"/>
-          <w:lang w:eastAsia="en-IN"/>
-        </w:rPr>
-        <w:t xml:space="preserve"> id, </w:t>
-      </w:r>
-      <w:r>
-        <w:rPr>
-          <w:rFonts w:ascii="Consolas" w:eastAsia="Times New Roman" w:hAnsi="Consolas" w:cs="Times New Roman"/>
-          <w:color w:val="4EC9B0"/>
-          <w:sz w:val="21"/>
-          <w:szCs w:val="21"/>
-          <w:lang w:eastAsia="en-IN"/>
-        </w:rPr>
-        <w:t>String</w:t>
-      </w:r>
-      <w:r>
-        <w:rPr>
-          <w:rFonts w:ascii="Consolas" w:eastAsia="Times New Roman" w:hAnsi="Consolas" w:cs="Times New Roman"/>
-          <w:color w:val="CCCCCC"/>
-          <w:sz w:val="21"/>
-          <w:szCs w:val="21"/>
-          <w:lang w:eastAsia="en-IN"/>
-        </w:rPr>
-        <w:t xml:space="preserve"> name) {</w:t>
-      </w:r>
-    </w:p>
-    <w:p>
-      <w:pPr>
-        <w:shd w:val="clear" w:color="auto" w:fill="1F1F1F"/>
-        <w:spacing w:after="0" w:line="285" w:lineRule="atLeast"/>
-        <w:rPr>
-          <w:rFonts w:ascii="Consolas" w:eastAsia="Times New Roman" w:hAnsi="Consolas" w:cs="Times New Roman"/>
-          <w:color w:val="CCCCCC"/>
-          <w:sz w:val="21"/>
-          <w:szCs w:val="21"/>
-          <w:lang w:eastAsia="en-IN"/>
-        </w:rPr>
-      </w:pPr>
-      <w:r>
-        <w:rPr>
-          <w:rFonts w:ascii="Consolas" w:eastAsia="Times New Roman" w:hAnsi="Consolas" w:cs="Times New Roman"/>
-          <w:color w:val="CCCCCC"/>
-          <w:sz w:val="21"/>
-          <w:szCs w:val="21"/>
-          <w:lang w:eastAsia="en-IN"/>
-        </w:rPr>
-        <w:t xml:space="preserve">        </w:t>
-      </w:r>
-      <w:r>
-        <w:rPr>
-          <w:rFonts w:ascii="Consolas" w:eastAsia="Times New Roman" w:hAnsi="Consolas" w:cs="Times New Roman"/>
-          <w:color w:val="569CD6"/>
-          <w:sz w:val="21"/>
-          <w:szCs w:val="21"/>
-          <w:lang w:eastAsia="en-IN"/>
-        </w:rPr>
-        <w:t>this</w:t>
-      </w:r>
-      <w:r>
-        <w:rPr>
-          <w:rFonts w:ascii="Consolas" w:eastAsia="Times New Roman" w:hAnsi="Consolas" w:cs="Times New Roman"/>
-          <w:color w:val="CCCCCC"/>
-          <w:sz w:val="21"/>
-          <w:szCs w:val="21"/>
-          <w:lang w:eastAsia="en-IN"/>
-        </w:rPr>
-        <w:t xml:space="preserve">.id </w:t>
-      </w:r>
-      <w:r>
-        <w:rPr>
-          <w:rFonts w:ascii="Consolas" w:eastAsia="Times New Roman" w:hAnsi="Consolas" w:cs="Times New Roman"/>
-          <w:color w:val="D4D4D4"/>
-          <w:sz w:val="21"/>
-          <w:szCs w:val="21"/>
-          <w:lang w:eastAsia="en-IN"/>
-        </w:rPr>
-        <w:t>=</w:t>
-      </w:r>
-      <w:r>
-        <w:rPr>
-          <w:rFonts w:ascii="Consolas" w:eastAsia="Times New Roman" w:hAnsi="Consolas" w:cs="Times New Roman"/>
-          <w:color w:val="CCCCCC"/>
-          <w:sz w:val="21"/>
-          <w:szCs w:val="21"/>
-          <w:lang w:eastAsia="en-IN"/>
-        </w:rPr>
-        <w:t xml:space="preserve"> id;</w:t>
-      </w:r>
-    </w:p>
-    <w:p>
-      <w:pPr>
-        <w:shd w:val="clear" w:color="auto" w:fill="1F1F1F"/>
-        <w:spacing w:after="0" w:line="285" w:lineRule="atLeast"/>
-        <w:rPr>
-          <w:rFonts w:ascii="Consolas" w:eastAsia="Times New Roman" w:hAnsi="Consolas" w:cs="Times New Roman"/>
-          <w:color w:val="CCCCCC"/>
-          <w:sz w:val="21"/>
-          <w:szCs w:val="21"/>
-          <w:lang w:eastAsia="en-IN"/>
-        </w:rPr>
-      </w:pPr>
-      <w:r>
-        <w:rPr>
-          <w:rFonts w:ascii="Consolas" w:eastAsia="Times New Roman" w:hAnsi="Consolas" w:cs="Times New Roman"/>
-          <w:color w:val="CCCCCC"/>
-          <w:sz w:val="21"/>
-          <w:szCs w:val="21"/>
-          <w:lang w:eastAsia="en-IN"/>
-        </w:rPr>
-        <w:t xml:space="preserve">        </w:t>
-      </w:r>
-      <w:r>
-        <w:rPr>
-          <w:rFonts w:ascii="Consolas" w:eastAsia="Times New Roman" w:hAnsi="Consolas" w:cs="Times New Roman"/>
-          <w:color w:val="569CD6"/>
-          <w:sz w:val="21"/>
-          <w:szCs w:val="21"/>
-          <w:lang w:eastAsia="en-IN"/>
-        </w:rPr>
-        <w:t>this</w:t>
-      </w:r>
-      <w:r>
-        <w:rPr>
-          <w:rFonts w:ascii="Consolas" w:eastAsia="Times New Roman" w:hAnsi="Consolas" w:cs="Times New Roman"/>
-          <w:color w:val="CCCCCC"/>
-          <w:sz w:val="21"/>
-          <w:szCs w:val="21"/>
-          <w:lang w:eastAsia="en-IN"/>
-        </w:rPr>
-        <w:t xml:space="preserve">.name </w:t>
-      </w:r>
-      <w:r>
-        <w:rPr>
-          <w:rFonts w:ascii="Consolas" w:eastAsia="Times New Roman" w:hAnsi="Consolas" w:cs="Times New Roman"/>
-          <w:color w:val="D4D4D4"/>
-          <w:sz w:val="21"/>
-          <w:szCs w:val="21"/>
-          <w:lang w:eastAsia="en-IN"/>
-        </w:rPr>
-        <w:t>=</w:t>
-      </w:r>
-      <w:r>
-        <w:rPr>
-          <w:rFonts w:ascii="Consolas" w:eastAsia="Times New Roman" w:hAnsi="Consolas" w:cs="Times New Roman"/>
-          <w:color w:val="CCCCCC"/>
-          <w:sz w:val="21"/>
-          <w:szCs w:val="21"/>
-          <w:lang w:eastAsia="en-IN"/>
-        </w:rPr>
-        <w:t xml:space="preserve"> name;</w:t>
-      </w:r>
-    </w:p>
-    <w:p>
-      <w:pPr>
-        <w:shd w:val="clear" w:color="auto" w:fill="1F1F1F"/>
-        <w:spacing w:after="0" w:line="285" w:lineRule="atLeast"/>
-        <w:rPr>
-          <w:rFonts w:ascii="Consolas" w:eastAsia="Times New Roman" w:hAnsi="Consolas" w:cs="Times New Roman"/>
-          <w:color w:val="CCCCCC"/>
-          <w:sz w:val="21"/>
-          <w:szCs w:val="21"/>
-          <w:lang w:eastAsia="en-IN"/>
-        </w:rPr>
-      </w:pPr>
-      <w:r>
-        <w:rPr>
-          <w:rFonts w:ascii="Consolas" w:eastAsia="Times New Roman" w:hAnsi="Consolas" w:cs="Times New Roman"/>
-          <w:color w:val="CCCCCC"/>
-          <w:sz w:val="21"/>
-          <w:szCs w:val="21"/>
-          <w:lang w:eastAsia="en-IN"/>
-        </w:rPr>
-        <w:t>    }</w:t>
-      </w:r>
-    </w:p>
-    <w:p>
-      <w:pPr>
-        <w:shd w:val="clear" w:color="auto" w:fill="1F1F1F"/>
-        <w:spacing w:after="0" w:line="285" w:lineRule="atLeast"/>
-        <w:rPr>
-          <w:rFonts w:ascii="Consolas" w:eastAsia="Times New Roman" w:hAnsi="Consolas" w:cs="Times New Roman"/>
-          <w:color w:val="CCCCCC"/>
-          <w:sz w:val="21"/>
-          <w:szCs w:val="21"/>
-          <w:lang w:eastAsia="en-IN"/>
-        </w:rPr>
-      </w:pPr>
-    </w:p>
-    <w:p>
-      <w:pPr>
-        <w:shd w:val="clear" w:color="auto" w:fill="1F1F1F"/>
-        <w:spacing w:after="0" w:line="285" w:lineRule="atLeast"/>
-        <w:rPr>
-          <w:rFonts w:ascii="Consolas" w:eastAsia="Times New Roman" w:hAnsi="Consolas" w:cs="Times New Roman"/>
-          <w:color w:val="CCCCCC"/>
-          <w:sz w:val="21"/>
-          <w:szCs w:val="21"/>
-          <w:lang w:eastAsia="en-IN"/>
-        </w:rPr>
-      </w:pPr>
-      <w:r>
-        <w:rPr>
-          <w:rFonts w:ascii="Consolas" w:eastAsia="Times New Roman" w:hAnsi="Consolas" w:cs="Times New Roman"/>
-          <w:color w:val="CCCCCC"/>
-          <w:sz w:val="21"/>
-          <w:szCs w:val="21"/>
-          <w:lang w:eastAsia="en-IN"/>
-        </w:rPr>
-        <w:t xml:space="preserve">    </w:t>
-      </w:r>
-      <w:proofErr w:type="gramStart"/>
-      <w:r>
-        <w:rPr>
-          <w:rFonts w:ascii="Consolas" w:eastAsia="Times New Roman" w:hAnsi="Consolas" w:cs="Times New Roman"/>
-          <w:color w:val="CCCCCC"/>
-          <w:sz w:val="21"/>
-          <w:szCs w:val="21"/>
-          <w:lang w:eastAsia="en-IN"/>
-        </w:rPr>
-        <w:t>public</w:t>
-      </w:r>
-      <w:proofErr w:type="gramEnd"/>
-      <w:r>
-        <w:rPr>
-          <w:rFonts w:ascii="Consolas" w:eastAsia="Times New Roman" w:hAnsi="Consolas" w:cs="Times New Roman"/>
-          <w:color w:val="CCCCCC"/>
-          <w:sz w:val="21"/>
-          <w:szCs w:val="21"/>
-          <w:lang w:eastAsia="en-IN"/>
-        </w:rPr>
-        <w:t xml:space="preserve"> </w:t>
-      </w:r>
-      <w:proofErr w:type="spellStart"/>
-      <w:r>
-        <w:rPr>
-          <w:rFonts w:ascii="Consolas" w:eastAsia="Times New Roman" w:hAnsi="Consolas" w:cs="Times New Roman"/>
-          <w:color w:val="4EC9B0"/>
-          <w:sz w:val="21"/>
-          <w:szCs w:val="21"/>
-          <w:lang w:eastAsia="en-IN"/>
-        </w:rPr>
-        <w:t>int</w:t>
-      </w:r>
-      <w:proofErr w:type="spellEnd"/>
-      <w:r>
-        <w:rPr>
-          <w:rFonts w:ascii="Consolas" w:eastAsia="Times New Roman" w:hAnsi="Consolas" w:cs="Times New Roman"/>
-          <w:color w:val="CCCCCC"/>
-          <w:sz w:val="21"/>
-          <w:szCs w:val="21"/>
-          <w:lang w:eastAsia="en-IN"/>
-        </w:rPr>
-        <w:t xml:space="preserve"> </w:t>
-      </w:r>
-      <w:proofErr w:type="spellStart"/>
-      <w:r>
-        <w:rPr>
-          <w:rFonts w:ascii="Consolas" w:eastAsia="Times New Roman" w:hAnsi="Consolas" w:cs="Times New Roman"/>
-          <w:color w:val="DCDCAA"/>
-          <w:sz w:val="21"/>
-          <w:szCs w:val="21"/>
-          <w:lang w:eastAsia="en-IN"/>
-        </w:rPr>
-        <w:t>compareTo</w:t>
-      </w:r>
-      <w:proofErr w:type="spellEnd"/>
-      <w:r>
-        <w:rPr>
-          <w:rFonts w:ascii="Consolas" w:eastAsia="Times New Roman" w:hAnsi="Consolas" w:cs="Times New Roman"/>
-          <w:color w:val="CCCCCC"/>
-          <w:sz w:val="21"/>
-          <w:szCs w:val="21"/>
-          <w:lang w:eastAsia="en-IN"/>
-        </w:rPr>
-        <w:t>(</w:t>
-      </w:r>
-      <w:r>
-        <w:rPr>
-          <w:rFonts w:ascii="Consolas" w:eastAsia="Times New Roman" w:hAnsi="Consolas" w:cs="Times New Roman"/>
-          <w:color w:val="4EC9B0"/>
-          <w:sz w:val="21"/>
-          <w:szCs w:val="21"/>
-          <w:lang w:eastAsia="en-IN"/>
-        </w:rPr>
-        <w:t>Student</w:t>
-      </w:r>
-      <w:r>
-        <w:rPr>
-          <w:rFonts w:ascii="Consolas" w:eastAsia="Times New Roman" w:hAnsi="Consolas" w:cs="Times New Roman"/>
-          <w:color w:val="CCCCCC"/>
-          <w:sz w:val="21"/>
-          <w:szCs w:val="21"/>
-          <w:lang w:eastAsia="en-IN"/>
-        </w:rPr>
-        <w:t xml:space="preserve"> other) {</w:t>
-      </w:r>
-    </w:p>
-    <w:p>
-      <w:pPr>
-        <w:shd w:val="clear" w:color="auto" w:fill="1F1F1F"/>
-        <w:spacing w:after="0" w:line="285" w:lineRule="atLeast"/>
-        <w:rPr>
-          <w:rFonts w:ascii="Consolas" w:eastAsia="Times New Roman" w:hAnsi="Consolas" w:cs="Times New Roman"/>
-          <w:color w:val="CCCCCC"/>
-          <w:sz w:val="21"/>
-          <w:szCs w:val="21"/>
-          <w:lang w:eastAsia="en-IN"/>
-        </w:rPr>
-      </w:pPr>
-      <w:r>
-        <w:rPr>
-          <w:rFonts w:ascii="Consolas" w:eastAsia="Times New Roman" w:hAnsi="Consolas" w:cs="Times New Roman"/>
-          <w:color w:val="CCCCCC"/>
-          <w:sz w:val="21"/>
-          <w:szCs w:val="21"/>
-          <w:lang w:eastAsia="en-IN"/>
-        </w:rPr>
-        <w:t xml:space="preserve">        </w:t>
-      </w:r>
-      <w:proofErr w:type="gramStart"/>
-      <w:r>
-        <w:rPr>
-          <w:rFonts w:ascii="Consolas" w:eastAsia="Times New Roman" w:hAnsi="Consolas" w:cs="Times New Roman"/>
-          <w:color w:val="C586C0"/>
-          <w:sz w:val="21"/>
-          <w:szCs w:val="21"/>
-          <w:lang w:eastAsia="en-IN"/>
-        </w:rPr>
-        <w:t>return</w:t>
-      </w:r>
-      <w:proofErr w:type="gramEnd"/>
-      <w:r>
-        <w:rPr>
-          <w:rFonts w:ascii="Consolas" w:eastAsia="Times New Roman" w:hAnsi="Consolas" w:cs="Times New Roman"/>
-          <w:color w:val="CCCCCC"/>
-          <w:sz w:val="21"/>
-          <w:szCs w:val="21"/>
-          <w:lang w:eastAsia="en-IN"/>
-        </w:rPr>
-        <w:t xml:space="preserve"> </w:t>
-      </w:r>
-      <w:r>
-        <w:rPr>
-          <w:rFonts w:ascii="Consolas" w:eastAsia="Times New Roman" w:hAnsi="Consolas" w:cs="Times New Roman"/>
-          <w:color w:val="569CD6"/>
-          <w:sz w:val="21"/>
-          <w:szCs w:val="21"/>
-          <w:lang w:eastAsia="en-IN"/>
-        </w:rPr>
-        <w:t>this</w:t>
-      </w:r>
-      <w:r>
-        <w:rPr>
-          <w:rFonts w:ascii="Consolas" w:eastAsia="Times New Roman" w:hAnsi="Consolas" w:cs="Times New Roman"/>
-          <w:color w:val="CCCCCC"/>
-          <w:sz w:val="21"/>
-          <w:szCs w:val="21"/>
-          <w:lang w:eastAsia="en-IN"/>
-        </w:rPr>
-        <w:t xml:space="preserve">.id </w:t>
-      </w:r>
-      <w:r>
-        <w:rPr>
-          <w:rFonts w:ascii="Consolas" w:eastAsia="Times New Roman" w:hAnsi="Consolas" w:cs="Times New Roman"/>
-          <w:color w:val="D4D4D4"/>
-          <w:sz w:val="21"/>
-          <w:szCs w:val="21"/>
-          <w:lang w:eastAsia="en-IN"/>
-        </w:rPr>
-        <w:t>-</w:t>
-      </w:r>
-      <w:r>
-        <w:rPr>
-          <w:rFonts w:ascii="Consolas" w:eastAsia="Times New Roman" w:hAnsi="Consolas" w:cs="Times New Roman"/>
-          <w:color w:val="CCCCCC"/>
-          <w:sz w:val="21"/>
-          <w:szCs w:val="21"/>
-          <w:lang w:eastAsia="en-IN"/>
-        </w:rPr>
-        <w:t xml:space="preserve"> other.id; </w:t>
-      </w:r>
-      <w:r>
-        <w:rPr>
-          <w:rFonts w:ascii="Consolas" w:eastAsia="Times New Roman" w:hAnsi="Consolas" w:cs="Times New Roman"/>
-          <w:color w:val="6A9955"/>
-          <w:sz w:val="21"/>
-          <w:szCs w:val="21"/>
-          <w:lang w:eastAsia="en-IN"/>
-        </w:rPr>
-        <w:t>// Natural order by id</w:t>
-      </w:r>
-    </w:p>
-    <w:p>
-      <w:pPr>
-        <w:shd w:val="clear" w:color="auto" w:fill="1F1F1F"/>
-        <w:spacing w:after="0" w:line="285" w:lineRule="atLeast"/>
-        <w:rPr>
-          <w:rFonts w:ascii="Consolas" w:eastAsia="Times New Roman" w:hAnsi="Consolas" w:cs="Times New Roman"/>
-          <w:color w:val="CCCCCC"/>
-          <w:sz w:val="21"/>
-          <w:szCs w:val="21"/>
-          <w:lang w:eastAsia="en-IN"/>
-        </w:rPr>
-      </w:pPr>
-      <w:r>
-        <w:rPr>
-          <w:rFonts w:ascii="Consolas" w:eastAsia="Times New Roman" w:hAnsi="Consolas" w:cs="Times New Roman"/>
-          <w:color w:val="CCCCCC"/>
-          <w:sz w:val="21"/>
-          <w:szCs w:val="21"/>
-          <w:lang w:eastAsia="en-IN"/>
-        </w:rPr>
-        <w:t>    }</w:t>
-      </w:r>
-    </w:p>
-    <w:p>
-      <w:pPr>
-        <w:shd w:val="clear" w:color="auto" w:fill="1F1F1F"/>
-        <w:spacing w:after="0" w:line="285" w:lineRule="atLeast"/>
-        <w:rPr>
-          <w:rFonts w:ascii="Consolas" w:eastAsia="Times New Roman" w:hAnsi="Consolas" w:cs="Times New Roman"/>
-          <w:color w:val="CCCCCC"/>
-          <w:sz w:val="21"/>
-          <w:szCs w:val="21"/>
-          <w:lang w:eastAsia="en-IN"/>
-        </w:rPr>
-      </w:pPr>
-      <w:r>
-        <w:rPr>
-          <w:rFonts w:ascii="Consolas" w:eastAsia="Times New Roman" w:hAnsi="Consolas" w:cs="Times New Roman"/>
-          <w:color w:val="CCCCCC"/>
-          <w:sz w:val="21"/>
-          <w:szCs w:val="21"/>
-          <w:lang w:eastAsia="en-IN"/>
-        </w:rPr>
-        <w:t>}</w:t>
-      </w:r>
-    </w:p>
-    <w:p>
-      <w:pPr>
-        <w:shd w:val="clear" w:color="auto" w:fill="1F1F1F"/>
-        <w:spacing w:after="0" w:line="285" w:lineRule="atLeast"/>
-        <w:rPr>
-          <w:rFonts w:ascii="Consolas" w:eastAsia="Times New Roman" w:hAnsi="Consolas" w:cs="Times New Roman"/>
-          <w:color w:val="CCCCCC"/>
-          <w:sz w:val="21"/>
-          <w:szCs w:val="21"/>
-          <w:lang w:eastAsia="en-IN"/>
-        </w:rPr>
-      </w:pPr>
-    </w:p>
-    <w:p>
-      <w:pPr>
-        <w:shd w:val="clear" w:color="auto" w:fill="1F1F1F"/>
-        <w:spacing w:after="0" w:line="285" w:lineRule="atLeast"/>
-        <w:rPr>
-          <w:rFonts w:ascii="Consolas" w:eastAsia="Times New Roman" w:hAnsi="Consolas" w:cs="Times New Roman"/>
-          <w:color w:val="CCCCCC"/>
-          <w:sz w:val="21"/>
-          <w:szCs w:val="21"/>
-          <w:lang w:eastAsia="en-IN"/>
-        </w:rPr>
-      </w:pPr>
-      <w:r>
-        <w:rPr>
-          <w:rFonts w:ascii="Consolas" w:eastAsia="Times New Roman" w:hAnsi="Consolas" w:cs="Times New Roman"/>
-          <w:color w:val="6A9955"/>
-          <w:sz w:val="21"/>
-          <w:szCs w:val="21"/>
-          <w:lang w:eastAsia="en-IN"/>
-        </w:rPr>
-        <w:t>//Use</w:t>
-      </w:r>
-    </w:p>
-    <w:p>
-      <w:pPr>
-        <w:shd w:val="clear" w:color="auto" w:fill="1F1F1F"/>
-        <w:spacing w:after="0" w:line="285" w:lineRule="atLeast"/>
-        <w:rPr>
-          <w:rFonts w:ascii="Consolas" w:eastAsia="Times New Roman" w:hAnsi="Consolas" w:cs="Times New Roman"/>
-          <w:color w:val="CCCCCC"/>
-          <w:sz w:val="21"/>
-          <w:szCs w:val="21"/>
-          <w:lang w:eastAsia="en-IN"/>
-        </w:rPr>
-      </w:pPr>
-      <w:r>
-        <w:rPr>
-          <w:rFonts w:ascii="Consolas" w:eastAsia="Times New Roman" w:hAnsi="Consolas" w:cs="Times New Roman"/>
-          <w:color w:val="4EC9B0"/>
-          <w:sz w:val="21"/>
-          <w:szCs w:val="21"/>
-          <w:lang w:eastAsia="en-IN"/>
-        </w:rPr>
-        <w:t>List</w:t>
-      </w:r>
-      <w:r>
-        <w:rPr>
-          <w:rFonts w:ascii="Consolas" w:eastAsia="Times New Roman" w:hAnsi="Consolas" w:cs="Times New Roman"/>
-          <w:color w:val="CCCCCC"/>
-          <w:sz w:val="21"/>
-          <w:szCs w:val="21"/>
-          <w:lang w:eastAsia="en-IN"/>
-        </w:rPr>
-        <w:t>&lt;</w:t>
-      </w:r>
-      <w:r>
-        <w:rPr>
-          <w:rFonts w:ascii="Consolas" w:eastAsia="Times New Roman" w:hAnsi="Consolas" w:cs="Times New Roman"/>
-          <w:color w:val="4EC9B0"/>
-          <w:sz w:val="21"/>
-          <w:szCs w:val="21"/>
-          <w:lang w:eastAsia="en-IN"/>
-        </w:rPr>
-        <w:t>Student</w:t>
-      </w:r>
-      <w:r>
-        <w:rPr>
-          <w:rFonts w:ascii="Consolas" w:eastAsia="Times New Roman" w:hAnsi="Consolas" w:cs="Times New Roman"/>
-          <w:color w:val="CCCCCC"/>
-          <w:sz w:val="21"/>
-          <w:szCs w:val="21"/>
-          <w:lang w:eastAsia="en-IN"/>
-        </w:rPr>
-        <w:t xml:space="preserve">&gt; list </w:t>
-      </w:r>
-      <w:r>
-        <w:rPr>
-          <w:rFonts w:ascii="Consolas" w:eastAsia="Times New Roman" w:hAnsi="Consolas" w:cs="Times New Roman"/>
-          <w:color w:val="D4D4D4"/>
-          <w:sz w:val="21"/>
-          <w:szCs w:val="21"/>
-          <w:lang w:eastAsia="en-IN"/>
-        </w:rPr>
-        <w:t>=</w:t>
-      </w:r>
-      <w:r>
-        <w:rPr>
-          <w:rFonts w:ascii="Consolas" w:eastAsia="Times New Roman" w:hAnsi="Consolas" w:cs="Times New Roman"/>
-          <w:color w:val="CCCCCC"/>
-          <w:sz w:val="21"/>
-          <w:szCs w:val="21"/>
-          <w:lang w:eastAsia="en-IN"/>
-        </w:rPr>
-        <w:t xml:space="preserve"> </w:t>
-      </w:r>
-      <w:r>
-        <w:rPr>
-          <w:rFonts w:ascii="Consolas" w:eastAsia="Times New Roman" w:hAnsi="Consolas" w:cs="Times New Roman"/>
-          <w:color w:val="C586C0"/>
-          <w:sz w:val="21"/>
-          <w:szCs w:val="21"/>
-          <w:lang w:eastAsia="en-IN"/>
-        </w:rPr>
-        <w:t>new</w:t>
-      </w:r>
-      <w:r>
-        <w:rPr>
-          <w:rFonts w:ascii="Consolas" w:eastAsia="Times New Roman" w:hAnsi="Consolas" w:cs="Times New Roman"/>
-          <w:color w:val="CCCCCC"/>
-          <w:sz w:val="21"/>
-          <w:szCs w:val="21"/>
-          <w:lang w:eastAsia="en-IN"/>
-        </w:rPr>
-        <w:t xml:space="preserve"> </w:t>
-      </w:r>
-      <w:proofErr w:type="spellStart"/>
-      <w:r>
-        <w:rPr>
-          <w:rFonts w:ascii="Consolas" w:eastAsia="Times New Roman" w:hAnsi="Consolas" w:cs="Times New Roman"/>
-          <w:color w:val="4EC9B0"/>
-          <w:sz w:val="21"/>
-          <w:szCs w:val="21"/>
-          <w:lang w:eastAsia="en-IN"/>
-        </w:rPr>
-        <w:t>ArrayList</w:t>
-      </w:r>
-      <w:proofErr w:type="spellEnd"/>
-      <w:r>
-        <w:rPr>
-          <w:rFonts w:ascii="Consolas" w:eastAsia="Times New Roman" w:hAnsi="Consolas" w:cs="Times New Roman"/>
-          <w:color w:val="CCCCCC"/>
-          <w:sz w:val="21"/>
-          <w:szCs w:val="21"/>
-          <w:lang w:eastAsia="en-IN"/>
-        </w:rPr>
-        <w:t>&lt;</w:t>
-      </w:r>
-      <w:proofErr w:type="gramStart"/>
-      <w:r>
-        <w:rPr>
-          <w:rFonts w:ascii="Consolas" w:eastAsia="Times New Roman" w:hAnsi="Consolas" w:cs="Times New Roman"/>
-          <w:color w:val="CCCCCC"/>
-          <w:sz w:val="21"/>
-          <w:szCs w:val="21"/>
-          <w:lang w:eastAsia="en-IN"/>
-        </w:rPr>
-        <w:t>&gt;(</w:t>
-      </w:r>
-      <w:proofErr w:type="gramEnd"/>
-      <w:r>
-        <w:rPr>
-          <w:rFonts w:ascii="Consolas" w:eastAsia="Times New Roman" w:hAnsi="Consolas" w:cs="Times New Roman"/>
-          <w:color w:val="CCCCCC"/>
-          <w:sz w:val="21"/>
-          <w:szCs w:val="21"/>
-          <w:lang w:eastAsia="en-IN"/>
-        </w:rPr>
-        <w:t>);</w:t>
-      </w:r>
-    </w:p>
-    <w:p>
-      <w:pPr>
-        <w:shd w:val="clear" w:color="auto" w:fill="1F1F1F"/>
-        <w:spacing w:after="0" w:line="285" w:lineRule="atLeast"/>
-        <w:rPr>
-          <w:rFonts w:ascii="Consolas" w:eastAsia="Times New Roman" w:hAnsi="Consolas" w:cs="Times New Roman"/>
-          <w:color w:val="CCCCCC"/>
-          <w:sz w:val="21"/>
-          <w:szCs w:val="21"/>
-          <w:lang w:eastAsia="en-IN"/>
-        </w:rPr>
-      </w:pPr>
-      <w:proofErr w:type="spellStart"/>
-      <w:proofErr w:type="gramStart"/>
-      <w:r>
-        <w:rPr>
-          <w:rFonts w:ascii="Consolas" w:eastAsia="Times New Roman" w:hAnsi="Consolas" w:cs="Times New Roman"/>
-          <w:color w:val="CCCCCC"/>
-          <w:sz w:val="21"/>
-          <w:szCs w:val="21"/>
-          <w:lang w:eastAsia="en-IN"/>
-        </w:rPr>
-        <w:t>list.</w:t>
-      </w:r>
-      <w:r>
-        <w:rPr>
-          <w:rFonts w:ascii="Consolas" w:eastAsia="Times New Roman" w:hAnsi="Consolas" w:cs="Times New Roman"/>
-          <w:color w:val="DCDCAA"/>
-          <w:sz w:val="21"/>
-          <w:szCs w:val="21"/>
-          <w:lang w:eastAsia="en-IN"/>
-        </w:rPr>
-        <w:t>add</w:t>
-      </w:r>
-      <w:proofErr w:type="spellEnd"/>
-      <w:r>
-        <w:rPr>
-          <w:rFonts w:ascii="Consolas" w:eastAsia="Times New Roman" w:hAnsi="Consolas" w:cs="Times New Roman"/>
-          <w:color w:val="CCCCCC"/>
-          <w:sz w:val="21"/>
-          <w:szCs w:val="21"/>
-          <w:lang w:eastAsia="en-IN"/>
-        </w:rPr>
-        <w:t>(</w:t>
-      </w:r>
-      <w:proofErr w:type="gramEnd"/>
-      <w:r>
-        <w:rPr>
-          <w:rFonts w:ascii="Consolas" w:eastAsia="Times New Roman" w:hAnsi="Consolas" w:cs="Times New Roman"/>
-          <w:color w:val="C586C0"/>
-          <w:sz w:val="21"/>
-          <w:szCs w:val="21"/>
-          <w:lang w:eastAsia="en-IN"/>
-        </w:rPr>
-        <w:t>new</w:t>
-      </w:r>
-      <w:r>
-        <w:rPr>
-          <w:rFonts w:ascii="Consolas" w:eastAsia="Times New Roman" w:hAnsi="Consolas" w:cs="Times New Roman"/>
-          <w:color w:val="CCCCCC"/>
-          <w:sz w:val="21"/>
-          <w:szCs w:val="21"/>
-          <w:lang w:eastAsia="en-IN"/>
-        </w:rPr>
-        <w:t xml:space="preserve"> </w:t>
-      </w:r>
-      <w:r>
-        <w:rPr>
-          <w:rFonts w:ascii="Consolas" w:eastAsia="Times New Roman" w:hAnsi="Consolas" w:cs="Times New Roman"/>
-          <w:color w:val="4EC9B0"/>
-          <w:sz w:val="21"/>
-          <w:szCs w:val="21"/>
-          <w:lang w:eastAsia="en-IN"/>
-        </w:rPr>
-        <w:t>Student</w:t>
-      </w:r>
-      <w:r>
-        <w:rPr>
-          <w:rFonts w:ascii="Consolas" w:eastAsia="Times New Roman" w:hAnsi="Consolas" w:cs="Times New Roman"/>
-          <w:color w:val="CCCCCC"/>
-          <w:sz w:val="21"/>
-          <w:szCs w:val="21"/>
-          <w:lang w:eastAsia="en-IN"/>
-        </w:rPr>
-        <w:t>(</w:t>
-      </w:r>
-      <w:r>
-        <w:rPr>
-          <w:rFonts w:ascii="Consolas" w:eastAsia="Times New Roman" w:hAnsi="Consolas" w:cs="Times New Roman"/>
-          <w:color w:val="B5CEA8"/>
-          <w:sz w:val="21"/>
-          <w:szCs w:val="21"/>
-          <w:lang w:eastAsia="en-IN"/>
-        </w:rPr>
-        <w:t>2</w:t>
-      </w:r>
-      <w:r>
-        <w:rPr>
-          <w:rFonts w:ascii="Consolas" w:eastAsia="Times New Roman" w:hAnsi="Consolas" w:cs="Times New Roman"/>
-          <w:color w:val="CCCCCC"/>
-          <w:sz w:val="21"/>
-          <w:szCs w:val="21"/>
-          <w:lang w:eastAsia="en-IN"/>
-        </w:rPr>
-        <w:t xml:space="preserve">, </w:t>
-      </w:r>
-      <w:r>
-        <w:rPr>
-          <w:rFonts w:ascii="Consolas" w:eastAsia="Times New Roman" w:hAnsi="Consolas" w:cs="Times New Roman"/>
-          <w:color w:val="CE9178"/>
-          <w:sz w:val="21"/>
-          <w:szCs w:val="21"/>
-          <w:lang w:eastAsia="en-IN"/>
-        </w:rPr>
-        <w:t>"Raj"</w:t>
-      </w:r>
-      <w:r>
-        <w:rPr>
-          <w:rFonts w:ascii="Consolas" w:eastAsia="Times New Roman" w:hAnsi="Consolas" w:cs="Times New Roman"/>
-          <w:color w:val="CCCCCC"/>
-          <w:sz w:val="21"/>
-          <w:szCs w:val="21"/>
-          <w:lang w:eastAsia="en-IN"/>
-        </w:rPr>
-        <w:t>));</w:t>
-      </w:r>
-    </w:p>
-    <w:p>
-      <w:pPr>
-        <w:shd w:val="clear" w:color="auto" w:fill="1F1F1F"/>
-        <w:spacing w:after="0" w:line="285" w:lineRule="atLeast"/>
-        <w:rPr>
-          <w:rFonts w:ascii="Consolas" w:eastAsia="Times New Roman" w:hAnsi="Consolas" w:cs="Times New Roman"/>
-          <w:color w:val="CCCCCC"/>
-          <w:sz w:val="21"/>
-          <w:szCs w:val="21"/>
-          <w:lang w:eastAsia="en-IN"/>
-        </w:rPr>
-      </w:pPr>
-      <w:proofErr w:type="spellStart"/>
-      <w:proofErr w:type="gramStart"/>
-      <w:r>
-        <w:rPr>
-          <w:rFonts w:ascii="Consolas" w:eastAsia="Times New Roman" w:hAnsi="Consolas" w:cs="Times New Roman"/>
-          <w:color w:val="CCCCCC"/>
-          <w:sz w:val="21"/>
-          <w:szCs w:val="21"/>
-          <w:lang w:eastAsia="en-IN"/>
-        </w:rPr>
-        <w:t>list.</w:t>
-      </w:r>
-      <w:r>
-        <w:rPr>
-          <w:rFonts w:ascii="Consolas" w:eastAsia="Times New Roman" w:hAnsi="Consolas" w:cs="Times New Roman"/>
-          <w:color w:val="DCDCAA"/>
-          <w:sz w:val="21"/>
-          <w:szCs w:val="21"/>
-          <w:lang w:eastAsia="en-IN"/>
-        </w:rPr>
-        <w:t>add</w:t>
-      </w:r>
-      <w:proofErr w:type="spellEnd"/>
-      <w:r>
-        <w:rPr>
-          <w:rFonts w:ascii="Consolas" w:eastAsia="Times New Roman" w:hAnsi="Consolas" w:cs="Times New Roman"/>
-          <w:color w:val="CCCCCC"/>
-          <w:sz w:val="21"/>
-          <w:szCs w:val="21"/>
-          <w:lang w:eastAsia="en-IN"/>
-        </w:rPr>
-        <w:t>(</w:t>
-      </w:r>
-      <w:proofErr w:type="gramEnd"/>
-      <w:r>
-        <w:rPr>
-          <w:rFonts w:ascii="Consolas" w:eastAsia="Times New Roman" w:hAnsi="Consolas" w:cs="Times New Roman"/>
-          <w:color w:val="C586C0"/>
-          <w:sz w:val="21"/>
-          <w:szCs w:val="21"/>
-          <w:lang w:eastAsia="en-IN"/>
-        </w:rPr>
-        <w:t>new</w:t>
-      </w:r>
-      <w:r>
-        <w:rPr>
-          <w:rFonts w:ascii="Consolas" w:eastAsia="Times New Roman" w:hAnsi="Consolas" w:cs="Times New Roman"/>
-          <w:color w:val="CCCCCC"/>
-          <w:sz w:val="21"/>
-          <w:szCs w:val="21"/>
-          <w:lang w:eastAsia="en-IN"/>
-        </w:rPr>
-        <w:t xml:space="preserve"> </w:t>
-      </w:r>
-      <w:r>
-        <w:rPr>
-          <w:rFonts w:ascii="Consolas" w:eastAsia="Times New Roman" w:hAnsi="Consolas" w:cs="Times New Roman"/>
-          <w:color w:val="4EC9B0"/>
-          <w:sz w:val="21"/>
-          <w:szCs w:val="21"/>
-          <w:lang w:eastAsia="en-IN"/>
-        </w:rPr>
-        <w:t>Student</w:t>
-      </w:r>
-      <w:r>
-        <w:rPr>
-          <w:rFonts w:ascii="Consolas" w:eastAsia="Times New Roman" w:hAnsi="Consolas" w:cs="Times New Roman"/>
-          <w:color w:val="CCCCCC"/>
-          <w:sz w:val="21"/>
-          <w:szCs w:val="21"/>
-          <w:lang w:eastAsia="en-IN"/>
-        </w:rPr>
-        <w:t>(</w:t>
-      </w:r>
-      <w:r>
-        <w:rPr>
-          <w:rFonts w:ascii="Consolas" w:eastAsia="Times New Roman" w:hAnsi="Consolas" w:cs="Times New Roman"/>
-          <w:color w:val="B5CEA8"/>
-          <w:sz w:val="21"/>
-          <w:szCs w:val="21"/>
-          <w:lang w:eastAsia="en-IN"/>
-        </w:rPr>
-        <w:t>1</w:t>
-      </w:r>
-      <w:r>
-        <w:rPr>
-          <w:rFonts w:ascii="Consolas" w:eastAsia="Times New Roman" w:hAnsi="Consolas" w:cs="Times New Roman"/>
-          <w:color w:val="CCCCCC"/>
-          <w:sz w:val="21"/>
-          <w:szCs w:val="21"/>
-          <w:lang w:eastAsia="en-IN"/>
-        </w:rPr>
-        <w:t xml:space="preserve">, </w:t>
-      </w:r>
-      <w:r>
-        <w:rPr>
-          <w:rFonts w:ascii="Consolas" w:eastAsia="Times New Roman" w:hAnsi="Consolas" w:cs="Times New Roman"/>
-          <w:color w:val="CE9178"/>
-          <w:sz w:val="21"/>
-          <w:szCs w:val="21"/>
-          <w:lang w:eastAsia="en-IN"/>
-        </w:rPr>
-        <w:t>"Anita"</w:t>
-      </w:r>
-      <w:r>
-        <w:rPr>
-          <w:rFonts w:ascii="Consolas" w:eastAsia="Times New Roman" w:hAnsi="Consolas" w:cs="Times New Roman"/>
-          <w:color w:val="CCCCCC"/>
-          <w:sz w:val="21"/>
-          <w:szCs w:val="21"/>
-          <w:lang w:eastAsia="en-IN"/>
-        </w:rPr>
-        <w:t>));</w:t>
-      </w:r>
-    </w:p>
-    <w:p>
-      <w:pPr>
-        <w:shd w:val="clear" w:color="auto" w:fill="1F1F1F"/>
-        <w:spacing w:after="0" w:line="285" w:lineRule="atLeast"/>
-        <w:rPr>
-          <w:rFonts w:ascii="Consolas" w:eastAsia="Times New Roman" w:hAnsi="Consolas" w:cs="Times New Roman"/>
-          <w:color w:val="CCCCCC"/>
-          <w:sz w:val="21"/>
-          <w:szCs w:val="21"/>
-          <w:lang w:eastAsia="en-IN"/>
-        </w:rPr>
-      </w:pPr>
-      <w:proofErr w:type="spellStart"/>
-      <w:proofErr w:type="gramStart"/>
-      <w:r>
-        <w:rPr>
-          <w:rFonts w:ascii="Consolas" w:eastAsia="Times New Roman" w:hAnsi="Consolas" w:cs="Times New Roman"/>
-          <w:color w:val="4EC9B0"/>
-          <w:sz w:val="21"/>
-          <w:szCs w:val="21"/>
-          <w:lang w:eastAsia="en-IN"/>
-        </w:rPr>
-        <w:t>Collections</w:t>
-      </w:r>
-      <w:r>
-        <w:rPr>
-          <w:rFonts w:ascii="Consolas" w:eastAsia="Times New Roman" w:hAnsi="Consolas" w:cs="Times New Roman"/>
-          <w:color w:val="CCCCCC"/>
-          <w:sz w:val="21"/>
-          <w:szCs w:val="21"/>
-          <w:lang w:eastAsia="en-IN"/>
-        </w:rPr>
-        <w:t>.</w:t>
-      </w:r>
-      <w:r>
-        <w:rPr>
-          <w:rFonts w:ascii="Consolas" w:eastAsia="Times New Roman" w:hAnsi="Consolas" w:cs="Times New Roman"/>
-          <w:color w:val="DCDCAA"/>
-          <w:sz w:val="21"/>
-          <w:szCs w:val="21"/>
-          <w:lang w:eastAsia="en-IN"/>
-        </w:rPr>
-        <w:t>sort</w:t>
-      </w:r>
-      <w:proofErr w:type="spellEnd"/>
-      <w:r>
-        <w:rPr>
-          <w:rFonts w:ascii="Consolas" w:eastAsia="Times New Roman" w:hAnsi="Consolas" w:cs="Times New Roman"/>
-          <w:color w:val="CCCCCC"/>
-          <w:sz w:val="21"/>
-          <w:szCs w:val="21"/>
-          <w:lang w:eastAsia="en-IN"/>
-        </w:rPr>
-        <w:t>(</w:t>
-      </w:r>
-      <w:proofErr w:type="gramEnd"/>
-      <w:r>
-        <w:rPr>
-          <w:rFonts w:ascii="Consolas" w:eastAsia="Times New Roman" w:hAnsi="Consolas" w:cs="Times New Roman"/>
-          <w:color w:val="CCCCCC"/>
-          <w:sz w:val="21"/>
-          <w:szCs w:val="21"/>
-          <w:lang w:eastAsia="en-IN"/>
-        </w:rPr>
-        <w:t xml:space="preserve">list); </w:t>
-      </w:r>
-      <w:r>
-        <w:rPr>
-          <w:rFonts w:ascii="Consolas" w:eastAsia="Times New Roman" w:hAnsi="Consolas" w:cs="Times New Roman"/>
-          <w:color w:val="6A9955"/>
-          <w:sz w:val="21"/>
-          <w:szCs w:val="21"/>
-          <w:lang w:eastAsia="en-IN"/>
-        </w:rPr>
-        <w:t xml:space="preserve">// Uses </w:t>
-      </w:r>
-      <w:proofErr w:type="spellStart"/>
-      <w:r>
-        <w:rPr>
-          <w:rFonts w:ascii="Consolas" w:eastAsia="Times New Roman" w:hAnsi="Consolas" w:cs="Times New Roman"/>
-          <w:color w:val="6A9955"/>
-          <w:sz w:val="21"/>
-          <w:szCs w:val="21"/>
-          <w:lang w:eastAsia="en-IN"/>
-        </w:rPr>
-        <w:t>compareTo</w:t>
-      </w:r>
-      <w:proofErr w:type="spellEnd"/>
-    </w:p>
-    <w:p>
-      <w:pPr>
-        <w:shd w:val="clear" w:color="auto" w:fill="1F1F1F"/>
-        <w:spacing w:after="0" w:line="285" w:lineRule="atLeast"/>
-        <w:rPr>
-          <w:rFonts w:ascii="Consolas" w:eastAsia="Times New Roman" w:hAnsi="Consolas" w:cs="Times New Roman"/>
-          <w:color w:val="CCCCCC"/>
-          <w:sz w:val="21"/>
-          <w:szCs w:val="21"/>
-          <w:lang w:eastAsia="en-IN"/>
-        </w:rPr>
-      </w:pPr>
-      <w:proofErr w:type="gramStart"/>
-      <w:r>
-        <w:rPr>
-          <w:rFonts w:ascii="Consolas" w:eastAsia="Times New Roman" w:hAnsi="Consolas" w:cs="Times New Roman"/>
-          <w:color w:val="569CD6"/>
-          <w:sz w:val="21"/>
-          <w:szCs w:val="21"/>
-          <w:lang w:eastAsia="en-IN"/>
-        </w:rPr>
-        <w:lastRenderedPageBreak/>
-        <w:t>class</w:t>
-      </w:r>
-      <w:proofErr w:type="gramEnd"/>
-      <w:r>
-        <w:rPr>
-          <w:rFonts w:ascii="Consolas" w:eastAsia="Times New Roman" w:hAnsi="Consolas" w:cs="Times New Roman"/>
-          <w:color w:val="CCCCCC"/>
-          <w:sz w:val="21"/>
-          <w:szCs w:val="21"/>
-          <w:lang w:eastAsia="en-IN"/>
-        </w:rPr>
-        <w:t xml:space="preserve"> </w:t>
-      </w:r>
-      <w:r>
-        <w:rPr>
-          <w:rFonts w:ascii="Consolas" w:eastAsia="Times New Roman" w:hAnsi="Consolas" w:cs="Times New Roman"/>
-          <w:color w:val="4EC9B0"/>
-          <w:sz w:val="21"/>
-          <w:szCs w:val="21"/>
-          <w:lang w:eastAsia="en-IN"/>
-        </w:rPr>
-        <w:t>Student</w:t>
-      </w:r>
-      <w:r>
-        <w:rPr>
-          <w:rFonts w:ascii="Consolas" w:eastAsia="Times New Roman" w:hAnsi="Consolas" w:cs="Times New Roman"/>
-          <w:color w:val="CCCCCC"/>
-          <w:sz w:val="21"/>
-          <w:szCs w:val="21"/>
-          <w:lang w:eastAsia="en-IN"/>
-        </w:rPr>
-        <w:t xml:space="preserve"> {</w:t>
-      </w:r>
-    </w:p>
-    <w:p>
-      <w:pPr>
-        <w:shd w:val="clear" w:color="auto" w:fill="1F1F1F"/>
-        <w:spacing w:after="0" w:line="285" w:lineRule="atLeast"/>
-        <w:rPr>
-          <w:rFonts w:ascii="Consolas" w:eastAsia="Times New Roman" w:hAnsi="Consolas" w:cs="Times New Roman"/>
-          <w:color w:val="CCCCCC"/>
-          <w:sz w:val="21"/>
-          <w:szCs w:val="21"/>
-          <w:lang w:eastAsia="en-IN"/>
-        </w:rPr>
-      </w:pPr>
-      <w:r>
-        <w:rPr>
-          <w:rFonts w:ascii="Consolas" w:eastAsia="Times New Roman" w:hAnsi="Consolas" w:cs="Times New Roman"/>
-          <w:color w:val="CCCCCC"/>
-          <w:sz w:val="21"/>
-          <w:szCs w:val="21"/>
-          <w:lang w:eastAsia="en-IN"/>
-        </w:rPr>
-        <w:t xml:space="preserve">    </w:t>
-      </w:r>
-      <w:proofErr w:type="spellStart"/>
-      <w:proofErr w:type="gramStart"/>
-      <w:r>
-        <w:rPr>
-          <w:rFonts w:ascii="Consolas" w:eastAsia="Times New Roman" w:hAnsi="Consolas" w:cs="Times New Roman"/>
-          <w:color w:val="4EC9B0"/>
-          <w:sz w:val="21"/>
-          <w:szCs w:val="21"/>
-          <w:lang w:eastAsia="en-IN"/>
-        </w:rPr>
-        <w:t>int</w:t>
-      </w:r>
-      <w:proofErr w:type="spellEnd"/>
-      <w:proofErr w:type="gramEnd"/>
-      <w:r>
-        <w:rPr>
-          <w:rFonts w:ascii="Consolas" w:eastAsia="Times New Roman" w:hAnsi="Consolas" w:cs="Times New Roman"/>
-          <w:color w:val="CCCCCC"/>
-          <w:sz w:val="21"/>
-          <w:szCs w:val="21"/>
-          <w:lang w:eastAsia="en-IN"/>
-        </w:rPr>
-        <w:t xml:space="preserve"> id;</w:t>
-      </w:r>
-    </w:p>
-    <w:p>
-      <w:pPr>
-        <w:shd w:val="clear" w:color="auto" w:fill="1F1F1F"/>
-        <w:spacing w:after="0" w:line="285" w:lineRule="atLeast"/>
-        <w:rPr>
-          <w:rFonts w:ascii="Consolas" w:eastAsia="Times New Roman" w:hAnsi="Consolas" w:cs="Times New Roman"/>
-          <w:color w:val="CCCCCC"/>
-          <w:sz w:val="21"/>
-          <w:szCs w:val="21"/>
-          <w:lang w:eastAsia="en-IN"/>
-        </w:rPr>
-      </w:pPr>
-      <w:r>
-        <w:rPr>
-          <w:rFonts w:ascii="Consolas" w:eastAsia="Times New Roman" w:hAnsi="Consolas" w:cs="Times New Roman"/>
-          <w:color w:val="CCCCCC"/>
-          <w:sz w:val="21"/>
-          <w:szCs w:val="21"/>
-          <w:lang w:eastAsia="en-IN"/>
-        </w:rPr>
-        <w:t xml:space="preserve">    </w:t>
-      </w:r>
-      <w:r>
-        <w:rPr>
-          <w:rFonts w:ascii="Consolas" w:eastAsia="Times New Roman" w:hAnsi="Consolas" w:cs="Times New Roman"/>
-          <w:color w:val="4EC9B0"/>
-          <w:sz w:val="21"/>
-          <w:szCs w:val="21"/>
-          <w:lang w:eastAsia="en-IN"/>
-        </w:rPr>
-        <w:t>String</w:t>
-      </w:r>
-      <w:r>
-        <w:rPr>
-          <w:rFonts w:ascii="Consolas" w:eastAsia="Times New Roman" w:hAnsi="Consolas" w:cs="Times New Roman"/>
-          <w:color w:val="CCCCCC"/>
-          <w:sz w:val="21"/>
-          <w:szCs w:val="21"/>
-          <w:lang w:eastAsia="en-IN"/>
-        </w:rPr>
-        <w:t xml:space="preserve"> name;</w:t>
-      </w:r>
-    </w:p>
-    <w:p>
-      <w:pPr>
-        <w:shd w:val="clear" w:color="auto" w:fill="1F1F1F"/>
-        <w:spacing w:after="0" w:line="285" w:lineRule="atLeast"/>
-        <w:rPr>
-          <w:rFonts w:ascii="Consolas" w:eastAsia="Times New Roman" w:hAnsi="Consolas" w:cs="Times New Roman"/>
-          <w:color w:val="CCCCCC"/>
-          <w:sz w:val="21"/>
-          <w:szCs w:val="21"/>
-          <w:lang w:eastAsia="en-IN"/>
-        </w:rPr>
-      </w:pPr>
-    </w:p>
-    <w:p>
-      <w:pPr>
-        <w:shd w:val="clear" w:color="auto" w:fill="1F1F1F"/>
-        <w:spacing w:after="0" w:line="285" w:lineRule="atLeast"/>
-        <w:rPr>
-          <w:rFonts w:ascii="Consolas" w:eastAsia="Times New Roman" w:hAnsi="Consolas" w:cs="Times New Roman"/>
-          <w:color w:val="CCCCCC"/>
-          <w:sz w:val="21"/>
-          <w:szCs w:val="21"/>
-          <w:lang w:eastAsia="en-IN"/>
-        </w:rPr>
-      </w:pPr>
-      <w:r>
-        <w:rPr>
-          <w:rFonts w:ascii="Consolas" w:eastAsia="Times New Roman" w:hAnsi="Consolas" w:cs="Times New Roman"/>
-          <w:color w:val="CCCCCC"/>
-          <w:sz w:val="21"/>
-          <w:szCs w:val="21"/>
-          <w:lang w:eastAsia="en-IN"/>
-        </w:rPr>
-        <w:t xml:space="preserve">    </w:t>
-      </w:r>
-      <w:proofErr w:type="gramStart"/>
-      <w:r>
-        <w:rPr>
-          <w:rFonts w:ascii="Consolas" w:eastAsia="Times New Roman" w:hAnsi="Consolas" w:cs="Times New Roman"/>
-          <w:color w:val="4EC9B0"/>
-          <w:sz w:val="21"/>
-          <w:szCs w:val="21"/>
-          <w:lang w:eastAsia="en-IN"/>
-        </w:rPr>
-        <w:t>Student</w:t>
-      </w:r>
-      <w:r>
-        <w:rPr>
-          <w:rFonts w:ascii="Consolas" w:eastAsia="Times New Roman" w:hAnsi="Consolas" w:cs="Times New Roman"/>
-          <w:color w:val="CCCCCC"/>
-          <w:sz w:val="21"/>
-          <w:szCs w:val="21"/>
-          <w:lang w:eastAsia="en-IN"/>
-        </w:rPr>
-        <w:t>(</w:t>
-      </w:r>
-      <w:proofErr w:type="spellStart"/>
-      <w:proofErr w:type="gramEnd"/>
-      <w:r>
-        <w:rPr>
-          <w:rFonts w:ascii="Consolas" w:eastAsia="Times New Roman" w:hAnsi="Consolas" w:cs="Times New Roman"/>
-          <w:color w:val="4EC9B0"/>
-          <w:sz w:val="21"/>
-          <w:szCs w:val="21"/>
-          <w:lang w:eastAsia="en-IN"/>
-        </w:rPr>
-        <w:t>int</w:t>
-      </w:r>
-      <w:proofErr w:type="spellEnd"/>
-      <w:r>
-        <w:rPr>
-          <w:rFonts w:ascii="Consolas" w:eastAsia="Times New Roman" w:hAnsi="Consolas" w:cs="Times New Roman"/>
-          <w:color w:val="CCCCCC"/>
-          <w:sz w:val="21"/>
-          <w:szCs w:val="21"/>
-          <w:lang w:eastAsia="en-IN"/>
-        </w:rPr>
-        <w:t xml:space="preserve"> id, </w:t>
-      </w:r>
-      <w:r>
-        <w:rPr>
-          <w:rFonts w:ascii="Consolas" w:eastAsia="Times New Roman" w:hAnsi="Consolas" w:cs="Times New Roman"/>
-          <w:color w:val="4EC9B0"/>
-          <w:sz w:val="21"/>
-          <w:szCs w:val="21"/>
-          <w:lang w:eastAsia="en-IN"/>
-        </w:rPr>
-        <w:t>String</w:t>
-      </w:r>
-      <w:r>
-        <w:rPr>
-          <w:rFonts w:ascii="Consolas" w:eastAsia="Times New Roman" w:hAnsi="Consolas" w:cs="Times New Roman"/>
-          <w:color w:val="CCCCCC"/>
-          <w:sz w:val="21"/>
-          <w:szCs w:val="21"/>
-          <w:lang w:eastAsia="en-IN"/>
-        </w:rPr>
-        <w:t xml:space="preserve"> name) {</w:t>
-      </w:r>
-    </w:p>
-    <w:p>
-      <w:pPr>
-        <w:shd w:val="clear" w:color="auto" w:fill="1F1F1F"/>
-        <w:spacing w:after="0" w:line="285" w:lineRule="atLeast"/>
-        <w:rPr>
-          <w:rFonts w:ascii="Consolas" w:eastAsia="Times New Roman" w:hAnsi="Consolas" w:cs="Times New Roman"/>
-          <w:color w:val="CCCCCC"/>
-          <w:sz w:val="21"/>
-          <w:szCs w:val="21"/>
-          <w:lang w:eastAsia="en-IN"/>
-        </w:rPr>
-      </w:pPr>
-      <w:r>
-        <w:rPr>
-          <w:rFonts w:ascii="Consolas" w:eastAsia="Times New Roman" w:hAnsi="Consolas" w:cs="Times New Roman"/>
-          <w:color w:val="CCCCCC"/>
-          <w:sz w:val="21"/>
-          <w:szCs w:val="21"/>
-          <w:lang w:eastAsia="en-IN"/>
-        </w:rPr>
-        <w:t xml:space="preserve">        </w:t>
-      </w:r>
-      <w:r>
-        <w:rPr>
-          <w:rFonts w:ascii="Consolas" w:eastAsia="Times New Roman" w:hAnsi="Consolas" w:cs="Times New Roman"/>
-          <w:color w:val="569CD6"/>
-          <w:sz w:val="21"/>
-          <w:szCs w:val="21"/>
-          <w:lang w:eastAsia="en-IN"/>
-        </w:rPr>
-        <w:t>this</w:t>
-      </w:r>
-      <w:r>
-        <w:rPr>
-          <w:rFonts w:ascii="Consolas" w:eastAsia="Times New Roman" w:hAnsi="Consolas" w:cs="Times New Roman"/>
-          <w:color w:val="CCCCCC"/>
-          <w:sz w:val="21"/>
-          <w:szCs w:val="21"/>
-          <w:lang w:eastAsia="en-IN"/>
-        </w:rPr>
-        <w:t xml:space="preserve">.id </w:t>
-      </w:r>
-      <w:r>
-        <w:rPr>
-          <w:rFonts w:ascii="Consolas" w:eastAsia="Times New Roman" w:hAnsi="Consolas" w:cs="Times New Roman"/>
-          <w:color w:val="D4D4D4"/>
-          <w:sz w:val="21"/>
-          <w:szCs w:val="21"/>
-          <w:lang w:eastAsia="en-IN"/>
-        </w:rPr>
-        <w:t>=</w:t>
-      </w:r>
-      <w:r>
-        <w:rPr>
-          <w:rFonts w:ascii="Consolas" w:eastAsia="Times New Roman" w:hAnsi="Consolas" w:cs="Times New Roman"/>
-          <w:color w:val="CCCCCC"/>
-          <w:sz w:val="21"/>
-          <w:szCs w:val="21"/>
-          <w:lang w:eastAsia="en-IN"/>
-        </w:rPr>
-        <w:t xml:space="preserve"> id;</w:t>
-      </w:r>
-    </w:p>
-    <w:p>
-      <w:pPr>
-        <w:shd w:val="clear" w:color="auto" w:fill="1F1F1F"/>
-        <w:spacing w:after="0" w:line="285" w:lineRule="atLeast"/>
-        <w:rPr>
-          <w:rFonts w:ascii="Consolas" w:eastAsia="Times New Roman" w:hAnsi="Consolas" w:cs="Times New Roman"/>
-          <w:color w:val="CCCCCC"/>
-          <w:sz w:val="21"/>
-          <w:szCs w:val="21"/>
-          <w:lang w:eastAsia="en-IN"/>
-        </w:rPr>
-      </w:pPr>
-      <w:r>
-        <w:rPr>
-          <w:rFonts w:ascii="Consolas" w:eastAsia="Times New Roman" w:hAnsi="Consolas" w:cs="Times New Roman"/>
-          <w:color w:val="CCCCCC"/>
-          <w:sz w:val="21"/>
-          <w:szCs w:val="21"/>
-          <w:lang w:eastAsia="en-IN"/>
-        </w:rPr>
-        <w:t xml:space="preserve">        </w:t>
-      </w:r>
-      <w:r>
-        <w:rPr>
-          <w:rFonts w:ascii="Consolas" w:eastAsia="Times New Roman" w:hAnsi="Consolas" w:cs="Times New Roman"/>
-          <w:color w:val="569CD6"/>
-          <w:sz w:val="21"/>
-          <w:szCs w:val="21"/>
-          <w:lang w:eastAsia="en-IN"/>
-        </w:rPr>
-        <w:t>this</w:t>
-      </w:r>
-      <w:r>
-        <w:rPr>
-          <w:rFonts w:ascii="Consolas" w:eastAsia="Times New Roman" w:hAnsi="Consolas" w:cs="Times New Roman"/>
-          <w:color w:val="CCCCCC"/>
-          <w:sz w:val="21"/>
-          <w:szCs w:val="21"/>
-          <w:lang w:eastAsia="en-IN"/>
-        </w:rPr>
-        <w:t xml:space="preserve">.name </w:t>
-      </w:r>
-      <w:r>
-        <w:rPr>
-          <w:rFonts w:ascii="Consolas" w:eastAsia="Times New Roman" w:hAnsi="Consolas" w:cs="Times New Roman"/>
-          <w:color w:val="D4D4D4"/>
-          <w:sz w:val="21"/>
-          <w:szCs w:val="21"/>
-          <w:lang w:eastAsia="en-IN"/>
-        </w:rPr>
-        <w:t>=</w:t>
-      </w:r>
-      <w:r>
-        <w:rPr>
-          <w:rFonts w:ascii="Consolas" w:eastAsia="Times New Roman" w:hAnsi="Consolas" w:cs="Times New Roman"/>
-          <w:color w:val="CCCCCC"/>
-          <w:sz w:val="21"/>
-          <w:szCs w:val="21"/>
-          <w:lang w:eastAsia="en-IN"/>
-        </w:rPr>
-        <w:t xml:space="preserve"> name;</w:t>
-      </w:r>
-    </w:p>
-    <w:p>
-      <w:pPr>
-        <w:shd w:val="clear" w:color="auto" w:fill="1F1F1F"/>
-        <w:spacing w:after="0" w:line="285" w:lineRule="atLeast"/>
-        <w:rPr>
-          <w:rFonts w:ascii="Consolas" w:eastAsia="Times New Roman" w:hAnsi="Consolas" w:cs="Times New Roman"/>
-          <w:color w:val="CCCCCC"/>
-          <w:sz w:val="21"/>
-          <w:szCs w:val="21"/>
-          <w:lang w:eastAsia="en-IN"/>
-        </w:rPr>
-      </w:pPr>
-      <w:r>
-        <w:rPr>
-          <w:rFonts w:ascii="Consolas" w:eastAsia="Times New Roman" w:hAnsi="Consolas" w:cs="Times New Roman"/>
-          <w:color w:val="CCCCCC"/>
-          <w:sz w:val="21"/>
-          <w:szCs w:val="21"/>
-          <w:lang w:eastAsia="en-IN"/>
-        </w:rPr>
-        <w:t>    }</w:t>
-      </w:r>
-    </w:p>
-    <w:p>
-      <w:pPr>
-        <w:shd w:val="clear" w:color="auto" w:fill="1F1F1F"/>
-        <w:spacing w:after="0" w:line="285" w:lineRule="atLeast"/>
-        <w:rPr>
-          <w:rFonts w:ascii="Consolas" w:eastAsia="Times New Roman" w:hAnsi="Consolas" w:cs="Times New Roman"/>
-          <w:color w:val="CCCCCC"/>
-          <w:sz w:val="21"/>
-          <w:szCs w:val="21"/>
-          <w:lang w:eastAsia="en-IN"/>
-        </w:rPr>
-      </w:pPr>
-      <w:r>
-        <w:rPr>
-          <w:rFonts w:ascii="Consolas" w:eastAsia="Times New Roman" w:hAnsi="Consolas" w:cs="Times New Roman"/>
-          <w:color w:val="CCCCCC"/>
-          <w:sz w:val="21"/>
-          <w:szCs w:val="21"/>
-          <w:lang w:eastAsia="en-IN"/>
-        </w:rPr>
-        <w:t>}</w:t>
-      </w:r>
-    </w:p>
-    <w:p>
-      <w:pPr>
-        <w:shd w:val="clear" w:color="auto" w:fill="1F1F1F"/>
-        <w:spacing w:after="0" w:line="285" w:lineRule="atLeast"/>
-        <w:rPr>
-          <w:rFonts w:ascii="Consolas" w:eastAsia="Times New Roman" w:hAnsi="Consolas" w:cs="Times New Roman"/>
-          <w:color w:val="CCCCCC"/>
-          <w:sz w:val="21"/>
-          <w:szCs w:val="21"/>
-          <w:lang w:eastAsia="en-IN"/>
-        </w:rPr>
-      </w:pPr>
-    </w:p>
-    <w:p>
-      <w:pPr>
-        <w:shd w:val="clear" w:color="auto" w:fill="1F1F1F"/>
-        <w:spacing w:after="0" w:line="285" w:lineRule="atLeast"/>
-        <w:rPr>
-          <w:rFonts w:ascii="Consolas" w:eastAsia="Times New Roman" w:hAnsi="Consolas" w:cs="Times New Roman"/>
-          <w:color w:val="CCCCCC"/>
-          <w:sz w:val="21"/>
-          <w:szCs w:val="21"/>
-          <w:lang w:eastAsia="en-IN"/>
-        </w:rPr>
-      </w:pPr>
-      <w:r>
-        <w:rPr>
-          <w:rFonts w:ascii="Consolas" w:eastAsia="Times New Roman" w:hAnsi="Consolas" w:cs="Times New Roman"/>
-          <w:color w:val="6A9955"/>
-          <w:sz w:val="21"/>
-          <w:szCs w:val="21"/>
-          <w:lang w:eastAsia="en-IN"/>
-        </w:rPr>
-        <w:t>// Comparator to sort by name</w:t>
-      </w:r>
-    </w:p>
-    <w:p>
-      <w:pPr>
-        <w:shd w:val="clear" w:color="auto" w:fill="1F1F1F"/>
-        <w:spacing w:after="0" w:line="285" w:lineRule="atLeast"/>
-        <w:rPr>
-          <w:rFonts w:ascii="Consolas" w:eastAsia="Times New Roman" w:hAnsi="Consolas" w:cs="Times New Roman"/>
-          <w:color w:val="CCCCCC"/>
-          <w:sz w:val="21"/>
-          <w:szCs w:val="21"/>
-          <w:lang w:eastAsia="en-IN"/>
-        </w:rPr>
-      </w:pPr>
-      <w:proofErr w:type="gramStart"/>
-      <w:r>
-        <w:rPr>
-          <w:rFonts w:ascii="Consolas" w:eastAsia="Times New Roman" w:hAnsi="Consolas" w:cs="Times New Roman"/>
-          <w:color w:val="569CD6"/>
-          <w:sz w:val="21"/>
-          <w:szCs w:val="21"/>
-          <w:lang w:eastAsia="en-IN"/>
-        </w:rPr>
-        <w:t>class</w:t>
-      </w:r>
-      <w:proofErr w:type="gramEnd"/>
-      <w:r>
-        <w:rPr>
-          <w:rFonts w:ascii="Consolas" w:eastAsia="Times New Roman" w:hAnsi="Consolas" w:cs="Times New Roman"/>
-          <w:color w:val="CCCCCC"/>
-          <w:sz w:val="21"/>
-          <w:szCs w:val="21"/>
-          <w:lang w:eastAsia="en-IN"/>
-        </w:rPr>
-        <w:t xml:space="preserve"> </w:t>
-      </w:r>
-      <w:proofErr w:type="spellStart"/>
-      <w:r>
-        <w:rPr>
-          <w:rFonts w:ascii="Consolas" w:eastAsia="Times New Roman" w:hAnsi="Consolas" w:cs="Times New Roman"/>
-          <w:color w:val="4EC9B0"/>
-          <w:sz w:val="21"/>
-          <w:szCs w:val="21"/>
-          <w:lang w:eastAsia="en-IN"/>
-        </w:rPr>
-        <w:t>NameComparator</w:t>
-      </w:r>
-      <w:proofErr w:type="spellEnd"/>
-      <w:r>
-        <w:rPr>
-          <w:rFonts w:ascii="Consolas" w:eastAsia="Times New Roman" w:hAnsi="Consolas" w:cs="Times New Roman"/>
-          <w:color w:val="CCCCCC"/>
-          <w:sz w:val="21"/>
-          <w:szCs w:val="21"/>
-          <w:lang w:eastAsia="en-IN"/>
-        </w:rPr>
-        <w:t xml:space="preserve"> </w:t>
-      </w:r>
-      <w:r>
-        <w:rPr>
-          <w:rFonts w:ascii="Consolas" w:eastAsia="Times New Roman" w:hAnsi="Consolas" w:cs="Times New Roman"/>
-          <w:color w:val="569CD6"/>
-          <w:sz w:val="21"/>
-          <w:szCs w:val="21"/>
-          <w:lang w:eastAsia="en-IN"/>
-        </w:rPr>
-        <w:t>implements</w:t>
-      </w:r>
-      <w:r>
-        <w:rPr>
-          <w:rFonts w:ascii="Consolas" w:eastAsia="Times New Roman" w:hAnsi="Consolas" w:cs="Times New Roman"/>
-          <w:color w:val="CCCCCC"/>
-          <w:sz w:val="21"/>
-          <w:szCs w:val="21"/>
-          <w:lang w:eastAsia="en-IN"/>
-        </w:rPr>
-        <w:t xml:space="preserve"> </w:t>
-      </w:r>
-      <w:r>
-        <w:rPr>
-          <w:rFonts w:ascii="Consolas" w:eastAsia="Times New Roman" w:hAnsi="Consolas" w:cs="Times New Roman"/>
-          <w:color w:val="4EC9B0"/>
-          <w:sz w:val="21"/>
-          <w:szCs w:val="21"/>
-          <w:lang w:eastAsia="en-IN"/>
-        </w:rPr>
-        <w:t>Comparator</w:t>
-      </w:r>
-      <w:r>
-        <w:rPr>
-          <w:rFonts w:ascii="Consolas" w:eastAsia="Times New Roman" w:hAnsi="Consolas" w:cs="Times New Roman"/>
-          <w:color w:val="CCCCCC"/>
-          <w:sz w:val="21"/>
-          <w:szCs w:val="21"/>
-          <w:lang w:eastAsia="en-IN"/>
-        </w:rPr>
-        <w:t>&lt;</w:t>
-      </w:r>
-      <w:r>
-        <w:rPr>
-          <w:rFonts w:ascii="Consolas" w:eastAsia="Times New Roman" w:hAnsi="Consolas" w:cs="Times New Roman"/>
-          <w:color w:val="4EC9B0"/>
-          <w:sz w:val="21"/>
-          <w:szCs w:val="21"/>
-          <w:lang w:eastAsia="en-IN"/>
-        </w:rPr>
-        <w:t>Student</w:t>
-      </w:r>
-      <w:r>
-        <w:rPr>
-          <w:rFonts w:ascii="Consolas" w:eastAsia="Times New Roman" w:hAnsi="Consolas" w:cs="Times New Roman"/>
-          <w:color w:val="CCCCCC"/>
-          <w:sz w:val="21"/>
-          <w:szCs w:val="21"/>
-          <w:lang w:eastAsia="en-IN"/>
-        </w:rPr>
-        <w:t>&gt; {</w:t>
-      </w:r>
-    </w:p>
-    <w:p>
-      <w:pPr>
-        <w:shd w:val="clear" w:color="auto" w:fill="1F1F1F"/>
-        <w:spacing w:after="0" w:line="285" w:lineRule="atLeast"/>
-        <w:rPr>
-          <w:rFonts w:ascii="Consolas" w:eastAsia="Times New Roman" w:hAnsi="Consolas" w:cs="Times New Roman"/>
-          <w:color w:val="CCCCCC"/>
-          <w:sz w:val="21"/>
-          <w:szCs w:val="21"/>
-          <w:lang w:eastAsia="en-IN"/>
-        </w:rPr>
-      </w:pPr>
-      <w:r>
-        <w:rPr>
-          <w:rFonts w:ascii="Consolas" w:eastAsia="Times New Roman" w:hAnsi="Consolas" w:cs="Times New Roman"/>
-          <w:color w:val="CCCCCC"/>
-          <w:sz w:val="21"/>
-          <w:szCs w:val="21"/>
-          <w:lang w:eastAsia="en-IN"/>
-        </w:rPr>
-        <w:t xml:space="preserve">    </w:t>
-      </w:r>
-      <w:proofErr w:type="gramStart"/>
-      <w:r>
-        <w:rPr>
-          <w:rFonts w:ascii="Consolas" w:eastAsia="Times New Roman" w:hAnsi="Consolas" w:cs="Times New Roman"/>
-          <w:color w:val="CCCCCC"/>
-          <w:sz w:val="21"/>
-          <w:szCs w:val="21"/>
-          <w:lang w:eastAsia="en-IN"/>
-        </w:rPr>
-        <w:t>public</w:t>
-      </w:r>
-      <w:proofErr w:type="gramEnd"/>
-      <w:r>
-        <w:rPr>
-          <w:rFonts w:ascii="Consolas" w:eastAsia="Times New Roman" w:hAnsi="Consolas" w:cs="Times New Roman"/>
-          <w:color w:val="CCCCCC"/>
-          <w:sz w:val="21"/>
-          <w:szCs w:val="21"/>
-          <w:lang w:eastAsia="en-IN"/>
-        </w:rPr>
-        <w:t xml:space="preserve"> </w:t>
-      </w:r>
-      <w:proofErr w:type="spellStart"/>
-      <w:r>
-        <w:rPr>
-          <w:rFonts w:ascii="Consolas" w:eastAsia="Times New Roman" w:hAnsi="Consolas" w:cs="Times New Roman"/>
-          <w:color w:val="4EC9B0"/>
-          <w:sz w:val="21"/>
-          <w:szCs w:val="21"/>
-          <w:lang w:eastAsia="en-IN"/>
-        </w:rPr>
-        <w:t>int</w:t>
-      </w:r>
-      <w:proofErr w:type="spellEnd"/>
-      <w:r>
-        <w:rPr>
-          <w:rFonts w:ascii="Consolas" w:eastAsia="Times New Roman" w:hAnsi="Consolas" w:cs="Times New Roman"/>
-          <w:color w:val="CCCCCC"/>
-          <w:sz w:val="21"/>
-          <w:szCs w:val="21"/>
-          <w:lang w:eastAsia="en-IN"/>
-        </w:rPr>
-        <w:t xml:space="preserve"> </w:t>
-      </w:r>
-      <w:r>
-        <w:rPr>
-          <w:rFonts w:ascii="Consolas" w:eastAsia="Times New Roman" w:hAnsi="Consolas" w:cs="Times New Roman"/>
-          <w:color w:val="DCDCAA"/>
-          <w:sz w:val="21"/>
-          <w:szCs w:val="21"/>
-          <w:lang w:eastAsia="en-IN"/>
-        </w:rPr>
-        <w:t>compare</w:t>
-      </w:r>
-      <w:r>
-        <w:rPr>
-          <w:rFonts w:ascii="Consolas" w:eastAsia="Times New Roman" w:hAnsi="Consolas" w:cs="Times New Roman"/>
-          <w:color w:val="CCCCCC"/>
-          <w:sz w:val="21"/>
-          <w:szCs w:val="21"/>
-          <w:lang w:eastAsia="en-IN"/>
-        </w:rPr>
-        <w:t>(</w:t>
-      </w:r>
-      <w:r>
-        <w:rPr>
-          <w:rFonts w:ascii="Consolas" w:eastAsia="Times New Roman" w:hAnsi="Consolas" w:cs="Times New Roman"/>
-          <w:color w:val="4EC9B0"/>
-          <w:sz w:val="21"/>
-          <w:szCs w:val="21"/>
-          <w:lang w:eastAsia="en-IN"/>
-        </w:rPr>
-        <w:t>Student</w:t>
-      </w:r>
-      <w:r>
-        <w:rPr>
-          <w:rFonts w:ascii="Consolas" w:eastAsia="Times New Roman" w:hAnsi="Consolas" w:cs="Times New Roman"/>
-          <w:color w:val="CCCCCC"/>
-          <w:sz w:val="21"/>
-          <w:szCs w:val="21"/>
-          <w:lang w:eastAsia="en-IN"/>
-        </w:rPr>
-        <w:t xml:space="preserve"> a, </w:t>
-      </w:r>
-      <w:r>
-        <w:rPr>
-          <w:rFonts w:ascii="Consolas" w:eastAsia="Times New Roman" w:hAnsi="Consolas" w:cs="Times New Roman"/>
-          <w:color w:val="4EC9B0"/>
-          <w:sz w:val="21"/>
-          <w:szCs w:val="21"/>
-          <w:lang w:eastAsia="en-IN"/>
-        </w:rPr>
-        <w:t>Student</w:t>
-      </w:r>
-      <w:r>
-        <w:rPr>
-          <w:rFonts w:ascii="Consolas" w:eastAsia="Times New Roman" w:hAnsi="Consolas" w:cs="Times New Roman"/>
-          <w:color w:val="CCCCCC"/>
-          <w:sz w:val="21"/>
-          <w:szCs w:val="21"/>
-          <w:lang w:eastAsia="en-IN"/>
-        </w:rPr>
-        <w:t xml:space="preserve"> b) {</w:t>
-      </w:r>
-    </w:p>
-    <w:p>
-      <w:pPr>
-        <w:shd w:val="clear" w:color="auto" w:fill="1F1F1F"/>
-        <w:spacing w:after="0" w:line="285" w:lineRule="atLeast"/>
-        <w:rPr>
-          <w:rFonts w:ascii="Consolas" w:eastAsia="Times New Roman" w:hAnsi="Consolas" w:cs="Times New Roman"/>
-          <w:color w:val="CCCCCC"/>
-          <w:sz w:val="21"/>
-          <w:szCs w:val="21"/>
-          <w:lang w:eastAsia="en-IN"/>
-        </w:rPr>
-      </w:pPr>
-      <w:r>
-        <w:rPr>
-          <w:rFonts w:ascii="Consolas" w:eastAsia="Times New Roman" w:hAnsi="Consolas" w:cs="Times New Roman"/>
-          <w:color w:val="CCCCCC"/>
-          <w:sz w:val="21"/>
-          <w:szCs w:val="21"/>
-          <w:lang w:eastAsia="en-IN"/>
-        </w:rPr>
-        <w:t xml:space="preserve">        </w:t>
-      </w:r>
-      <w:proofErr w:type="gramStart"/>
-      <w:r>
-        <w:rPr>
-          <w:rFonts w:ascii="Consolas" w:eastAsia="Times New Roman" w:hAnsi="Consolas" w:cs="Times New Roman"/>
-          <w:color w:val="C586C0"/>
-          <w:sz w:val="21"/>
-          <w:szCs w:val="21"/>
-          <w:lang w:eastAsia="en-IN"/>
-        </w:rPr>
-        <w:t>return</w:t>
-      </w:r>
-      <w:proofErr w:type="gramEnd"/>
-      <w:r>
-        <w:rPr>
-          <w:rFonts w:ascii="Consolas" w:eastAsia="Times New Roman" w:hAnsi="Consolas" w:cs="Times New Roman"/>
-          <w:color w:val="CCCCCC"/>
-          <w:sz w:val="21"/>
-          <w:szCs w:val="21"/>
-          <w:lang w:eastAsia="en-IN"/>
-        </w:rPr>
-        <w:t xml:space="preserve"> </w:t>
-      </w:r>
-      <w:proofErr w:type="spellStart"/>
-      <w:r>
-        <w:rPr>
-          <w:rFonts w:ascii="Consolas" w:eastAsia="Times New Roman" w:hAnsi="Consolas" w:cs="Times New Roman"/>
-          <w:color w:val="CCCCCC"/>
-          <w:sz w:val="21"/>
-          <w:szCs w:val="21"/>
-          <w:lang w:eastAsia="en-IN"/>
-        </w:rPr>
-        <w:t>a.name.</w:t>
-      </w:r>
-      <w:r>
-        <w:rPr>
-          <w:rFonts w:ascii="Consolas" w:eastAsia="Times New Roman" w:hAnsi="Consolas" w:cs="Times New Roman"/>
-          <w:color w:val="DCDCAA"/>
-          <w:sz w:val="21"/>
-          <w:szCs w:val="21"/>
-          <w:lang w:eastAsia="en-IN"/>
-        </w:rPr>
-        <w:t>compareTo</w:t>
-      </w:r>
-      <w:proofErr w:type="spellEnd"/>
-      <w:r>
-        <w:rPr>
-          <w:rFonts w:ascii="Consolas" w:eastAsia="Times New Roman" w:hAnsi="Consolas" w:cs="Times New Roman"/>
-          <w:color w:val="CCCCCC"/>
-          <w:sz w:val="21"/>
-          <w:szCs w:val="21"/>
-          <w:lang w:eastAsia="en-IN"/>
-        </w:rPr>
-        <w:t>(b.name);</w:t>
-      </w:r>
-    </w:p>
-    <w:p>
-      <w:pPr>
-        <w:shd w:val="clear" w:color="auto" w:fill="1F1F1F"/>
-        <w:spacing w:after="0" w:line="285" w:lineRule="atLeast"/>
-        <w:rPr>
-          <w:rFonts w:ascii="Consolas" w:eastAsia="Times New Roman" w:hAnsi="Consolas" w:cs="Times New Roman"/>
-          <w:color w:val="CCCCCC"/>
-          <w:sz w:val="21"/>
-          <w:szCs w:val="21"/>
-          <w:lang w:eastAsia="en-IN"/>
-        </w:rPr>
-      </w:pPr>
-      <w:r>
-        <w:rPr>
-          <w:rFonts w:ascii="Consolas" w:eastAsia="Times New Roman" w:hAnsi="Consolas" w:cs="Times New Roman"/>
-          <w:color w:val="CCCCCC"/>
-          <w:sz w:val="21"/>
-          <w:szCs w:val="21"/>
-          <w:lang w:eastAsia="en-IN"/>
-        </w:rPr>
-        <w:t>    }</w:t>
-      </w:r>
-    </w:p>
-    <w:p>
-      <w:pPr>
-        <w:shd w:val="clear" w:color="auto" w:fill="1F1F1F"/>
-        <w:spacing w:after="0" w:line="285" w:lineRule="atLeast"/>
-        <w:rPr>
-          <w:rFonts w:ascii="Consolas" w:eastAsia="Times New Roman" w:hAnsi="Consolas" w:cs="Times New Roman"/>
-          <w:color w:val="CCCCCC"/>
-          <w:sz w:val="21"/>
-          <w:szCs w:val="21"/>
-          <w:lang w:eastAsia="en-IN"/>
-        </w:rPr>
-      </w:pPr>
-      <w:r>
-        <w:rPr>
-          <w:rFonts w:ascii="Consolas" w:eastAsia="Times New Roman" w:hAnsi="Consolas" w:cs="Times New Roman"/>
-          <w:color w:val="CCCCCC"/>
-          <w:sz w:val="21"/>
-          <w:szCs w:val="21"/>
-          <w:lang w:eastAsia="en-IN"/>
-        </w:rPr>
-        <w:t>}</w:t>
-      </w:r>
-    </w:p>
-    <w:p>
-      <w:pPr>
-        <w:shd w:val="clear" w:color="auto" w:fill="1F1F1F"/>
-        <w:spacing w:after="0" w:line="285" w:lineRule="atLeast"/>
-        <w:rPr>
-          <w:rFonts w:ascii="Consolas" w:eastAsia="Times New Roman" w:hAnsi="Consolas" w:cs="Times New Roman"/>
-          <w:color w:val="CCCCCC"/>
-          <w:sz w:val="21"/>
-          <w:szCs w:val="21"/>
-          <w:lang w:eastAsia="en-IN"/>
-        </w:rPr>
-      </w:pPr>
-    </w:p>
-    <w:p>
-      <w:pPr>
-        <w:shd w:val="clear" w:color="auto" w:fill="1F1F1F"/>
-        <w:spacing w:after="0" w:line="285" w:lineRule="atLeast"/>
-        <w:rPr>
-          <w:rFonts w:ascii="Consolas" w:eastAsia="Times New Roman" w:hAnsi="Consolas" w:cs="Times New Roman"/>
-          <w:color w:val="CCCCCC"/>
-          <w:sz w:val="21"/>
-          <w:szCs w:val="21"/>
-          <w:lang w:eastAsia="en-IN"/>
-        </w:rPr>
-      </w:pPr>
-      <w:r>
-        <w:rPr>
-          <w:rFonts w:ascii="Consolas" w:eastAsia="Times New Roman" w:hAnsi="Consolas" w:cs="Times New Roman"/>
-          <w:color w:val="4EC9B0"/>
-          <w:sz w:val="21"/>
-          <w:szCs w:val="21"/>
-          <w:lang w:eastAsia="en-IN"/>
-        </w:rPr>
-        <w:t>List</w:t>
-      </w:r>
-      <w:r>
-        <w:rPr>
-          <w:rFonts w:ascii="Consolas" w:eastAsia="Times New Roman" w:hAnsi="Consolas" w:cs="Times New Roman"/>
-          <w:color w:val="CCCCCC"/>
-          <w:sz w:val="21"/>
-          <w:szCs w:val="21"/>
-          <w:lang w:eastAsia="en-IN"/>
-        </w:rPr>
-        <w:t>&lt;</w:t>
-      </w:r>
-      <w:r>
-        <w:rPr>
-          <w:rFonts w:ascii="Consolas" w:eastAsia="Times New Roman" w:hAnsi="Consolas" w:cs="Times New Roman"/>
-          <w:color w:val="4EC9B0"/>
-          <w:sz w:val="21"/>
-          <w:szCs w:val="21"/>
-          <w:lang w:eastAsia="en-IN"/>
-        </w:rPr>
-        <w:t>Student</w:t>
-      </w:r>
-      <w:r>
-        <w:rPr>
-          <w:rFonts w:ascii="Consolas" w:eastAsia="Times New Roman" w:hAnsi="Consolas" w:cs="Times New Roman"/>
-          <w:color w:val="CCCCCC"/>
-          <w:sz w:val="21"/>
-          <w:szCs w:val="21"/>
-          <w:lang w:eastAsia="en-IN"/>
-        </w:rPr>
-        <w:t xml:space="preserve">&gt; list </w:t>
-      </w:r>
-      <w:r>
-        <w:rPr>
-          <w:rFonts w:ascii="Consolas" w:eastAsia="Times New Roman" w:hAnsi="Consolas" w:cs="Times New Roman"/>
-          <w:color w:val="D4D4D4"/>
-          <w:sz w:val="21"/>
-          <w:szCs w:val="21"/>
-          <w:lang w:eastAsia="en-IN"/>
-        </w:rPr>
-        <w:t>=</w:t>
-      </w:r>
-      <w:r>
-        <w:rPr>
-          <w:rFonts w:ascii="Consolas" w:eastAsia="Times New Roman" w:hAnsi="Consolas" w:cs="Times New Roman"/>
-          <w:color w:val="CCCCCC"/>
-          <w:sz w:val="21"/>
-          <w:szCs w:val="21"/>
-          <w:lang w:eastAsia="en-IN"/>
-        </w:rPr>
-        <w:t xml:space="preserve"> </w:t>
-      </w:r>
-      <w:r>
-        <w:rPr>
-          <w:rFonts w:ascii="Consolas" w:eastAsia="Times New Roman" w:hAnsi="Consolas" w:cs="Times New Roman"/>
-          <w:color w:val="C586C0"/>
-          <w:sz w:val="21"/>
-          <w:szCs w:val="21"/>
-          <w:lang w:eastAsia="en-IN"/>
-        </w:rPr>
-        <w:t>new</w:t>
-      </w:r>
-      <w:r>
-        <w:rPr>
-          <w:rFonts w:ascii="Consolas" w:eastAsia="Times New Roman" w:hAnsi="Consolas" w:cs="Times New Roman"/>
-          <w:color w:val="CCCCCC"/>
-          <w:sz w:val="21"/>
-          <w:szCs w:val="21"/>
-          <w:lang w:eastAsia="en-IN"/>
-        </w:rPr>
-        <w:t xml:space="preserve"> </w:t>
-      </w:r>
-      <w:proofErr w:type="spellStart"/>
-      <w:r>
-        <w:rPr>
-          <w:rFonts w:ascii="Consolas" w:eastAsia="Times New Roman" w:hAnsi="Consolas" w:cs="Times New Roman"/>
-          <w:color w:val="4EC9B0"/>
-          <w:sz w:val="21"/>
-          <w:szCs w:val="21"/>
-          <w:lang w:eastAsia="en-IN"/>
-        </w:rPr>
-        <w:t>ArrayList</w:t>
-      </w:r>
-      <w:proofErr w:type="spellEnd"/>
-      <w:r>
-        <w:rPr>
-          <w:rFonts w:ascii="Consolas" w:eastAsia="Times New Roman" w:hAnsi="Consolas" w:cs="Times New Roman"/>
-          <w:color w:val="CCCCCC"/>
-          <w:sz w:val="21"/>
-          <w:szCs w:val="21"/>
-          <w:lang w:eastAsia="en-IN"/>
-        </w:rPr>
-        <w:t>&lt;</w:t>
-      </w:r>
-      <w:proofErr w:type="gramStart"/>
-      <w:r>
-        <w:rPr>
-          <w:rFonts w:ascii="Consolas" w:eastAsia="Times New Roman" w:hAnsi="Consolas" w:cs="Times New Roman"/>
-          <w:color w:val="CCCCCC"/>
-          <w:sz w:val="21"/>
-          <w:szCs w:val="21"/>
-          <w:lang w:eastAsia="en-IN"/>
-        </w:rPr>
-        <w:t>&gt;(</w:t>
-      </w:r>
-      <w:proofErr w:type="gramEnd"/>
-      <w:r>
-        <w:rPr>
-          <w:rFonts w:ascii="Consolas" w:eastAsia="Times New Roman" w:hAnsi="Consolas" w:cs="Times New Roman"/>
-          <w:color w:val="CCCCCC"/>
-          <w:sz w:val="21"/>
-          <w:szCs w:val="21"/>
-          <w:lang w:eastAsia="en-IN"/>
-        </w:rPr>
-        <w:t>);</w:t>
-      </w:r>
-    </w:p>
-    <w:p>
-      <w:pPr>
-        <w:shd w:val="clear" w:color="auto" w:fill="1F1F1F"/>
-        <w:spacing w:after="0" w:line="285" w:lineRule="atLeast"/>
-        <w:rPr>
-          <w:rFonts w:ascii="Consolas" w:eastAsia="Times New Roman" w:hAnsi="Consolas" w:cs="Times New Roman"/>
-          <w:color w:val="CCCCCC"/>
-          <w:sz w:val="21"/>
-          <w:szCs w:val="21"/>
-          <w:lang w:eastAsia="en-IN"/>
-        </w:rPr>
-      </w:pPr>
-      <w:proofErr w:type="spellStart"/>
-      <w:proofErr w:type="gramStart"/>
-      <w:r>
-        <w:rPr>
-          <w:rFonts w:ascii="Consolas" w:eastAsia="Times New Roman" w:hAnsi="Consolas" w:cs="Times New Roman"/>
-          <w:color w:val="CCCCCC"/>
-          <w:sz w:val="21"/>
-          <w:szCs w:val="21"/>
-          <w:lang w:eastAsia="en-IN"/>
-        </w:rPr>
-        <w:t>list.</w:t>
-      </w:r>
-      <w:r>
-        <w:rPr>
-          <w:rFonts w:ascii="Consolas" w:eastAsia="Times New Roman" w:hAnsi="Consolas" w:cs="Times New Roman"/>
-          <w:color w:val="DCDCAA"/>
-          <w:sz w:val="21"/>
-          <w:szCs w:val="21"/>
-          <w:lang w:eastAsia="en-IN"/>
-        </w:rPr>
-        <w:t>add</w:t>
-      </w:r>
-      <w:proofErr w:type="spellEnd"/>
-      <w:r>
-        <w:rPr>
-          <w:rFonts w:ascii="Consolas" w:eastAsia="Times New Roman" w:hAnsi="Consolas" w:cs="Times New Roman"/>
-          <w:color w:val="CCCCCC"/>
-          <w:sz w:val="21"/>
-          <w:szCs w:val="21"/>
-          <w:lang w:eastAsia="en-IN"/>
-        </w:rPr>
-        <w:t>(</w:t>
-      </w:r>
-      <w:proofErr w:type="gramEnd"/>
-      <w:r>
-        <w:rPr>
-          <w:rFonts w:ascii="Consolas" w:eastAsia="Times New Roman" w:hAnsi="Consolas" w:cs="Times New Roman"/>
-          <w:color w:val="C586C0"/>
-          <w:sz w:val="21"/>
-          <w:szCs w:val="21"/>
-          <w:lang w:eastAsia="en-IN"/>
-        </w:rPr>
-        <w:t>new</w:t>
-      </w:r>
-      <w:r>
-        <w:rPr>
-          <w:rFonts w:ascii="Consolas" w:eastAsia="Times New Roman" w:hAnsi="Consolas" w:cs="Times New Roman"/>
-          <w:color w:val="CCCCCC"/>
-          <w:sz w:val="21"/>
-          <w:szCs w:val="21"/>
-          <w:lang w:eastAsia="en-IN"/>
-        </w:rPr>
-        <w:t xml:space="preserve"> </w:t>
-      </w:r>
-      <w:r>
-        <w:rPr>
-          <w:rFonts w:ascii="Consolas" w:eastAsia="Times New Roman" w:hAnsi="Consolas" w:cs="Times New Roman"/>
-          <w:color w:val="4EC9B0"/>
-          <w:sz w:val="21"/>
-          <w:szCs w:val="21"/>
-          <w:lang w:eastAsia="en-IN"/>
-        </w:rPr>
-        <w:t>Student</w:t>
-      </w:r>
-      <w:r>
-        <w:rPr>
-          <w:rFonts w:ascii="Consolas" w:eastAsia="Times New Roman" w:hAnsi="Consolas" w:cs="Times New Roman"/>
-          <w:color w:val="CCCCCC"/>
-          <w:sz w:val="21"/>
-          <w:szCs w:val="21"/>
-          <w:lang w:eastAsia="en-IN"/>
-        </w:rPr>
-        <w:t>(</w:t>
-      </w:r>
-      <w:r>
-        <w:rPr>
-          <w:rFonts w:ascii="Consolas" w:eastAsia="Times New Roman" w:hAnsi="Consolas" w:cs="Times New Roman"/>
-          <w:color w:val="B5CEA8"/>
-          <w:sz w:val="21"/>
-          <w:szCs w:val="21"/>
-          <w:lang w:eastAsia="en-IN"/>
-        </w:rPr>
-        <w:t>2</w:t>
-      </w:r>
-      <w:r>
-        <w:rPr>
-          <w:rFonts w:ascii="Consolas" w:eastAsia="Times New Roman" w:hAnsi="Consolas" w:cs="Times New Roman"/>
-          <w:color w:val="CCCCCC"/>
-          <w:sz w:val="21"/>
-          <w:szCs w:val="21"/>
-          <w:lang w:eastAsia="en-IN"/>
-        </w:rPr>
-        <w:t xml:space="preserve">, </w:t>
-      </w:r>
-      <w:r>
-        <w:rPr>
-          <w:rFonts w:ascii="Consolas" w:eastAsia="Times New Roman" w:hAnsi="Consolas" w:cs="Times New Roman"/>
-          <w:color w:val="CE9178"/>
-          <w:sz w:val="21"/>
-          <w:szCs w:val="21"/>
-          <w:lang w:eastAsia="en-IN"/>
-        </w:rPr>
-        <w:t>"Raj"</w:t>
-      </w:r>
-      <w:r>
-        <w:rPr>
-          <w:rFonts w:ascii="Consolas" w:eastAsia="Times New Roman" w:hAnsi="Consolas" w:cs="Times New Roman"/>
-          <w:color w:val="CCCCCC"/>
-          <w:sz w:val="21"/>
-          <w:szCs w:val="21"/>
-          <w:lang w:eastAsia="en-IN"/>
-        </w:rPr>
-        <w:t>));</w:t>
-      </w:r>
-    </w:p>
-    <w:p>
-      <w:pPr>
-        <w:shd w:val="clear" w:color="auto" w:fill="1F1F1F"/>
-        <w:spacing w:after="0" w:line="285" w:lineRule="atLeast"/>
-        <w:rPr>
-          <w:rFonts w:ascii="Consolas" w:eastAsia="Times New Roman" w:hAnsi="Consolas" w:cs="Times New Roman"/>
-          <w:color w:val="CCCCCC"/>
-          <w:sz w:val="21"/>
-          <w:szCs w:val="21"/>
-          <w:lang w:eastAsia="en-IN"/>
-        </w:rPr>
-      </w:pPr>
-      <w:proofErr w:type="spellStart"/>
-      <w:proofErr w:type="gramStart"/>
-      <w:r>
-        <w:rPr>
-          <w:rFonts w:ascii="Consolas" w:eastAsia="Times New Roman" w:hAnsi="Consolas" w:cs="Times New Roman"/>
-          <w:color w:val="CCCCCC"/>
-          <w:sz w:val="21"/>
-          <w:szCs w:val="21"/>
-          <w:lang w:eastAsia="en-IN"/>
-        </w:rPr>
-        <w:t>list.</w:t>
-      </w:r>
-      <w:r>
-        <w:rPr>
-          <w:rFonts w:ascii="Consolas" w:eastAsia="Times New Roman" w:hAnsi="Consolas" w:cs="Times New Roman"/>
-          <w:color w:val="DCDCAA"/>
-          <w:sz w:val="21"/>
-          <w:szCs w:val="21"/>
-          <w:lang w:eastAsia="en-IN"/>
-        </w:rPr>
-        <w:t>add</w:t>
-      </w:r>
-      <w:proofErr w:type="spellEnd"/>
-      <w:r>
-        <w:rPr>
-          <w:rFonts w:ascii="Consolas" w:eastAsia="Times New Roman" w:hAnsi="Consolas" w:cs="Times New Roman"/>
-          <w:color w:val="CCCCCC"/>
-          <w:sz w:val="21"/>
-          <w:szCs w:val="21"/>
-          <w:lang w:eastAsia="en-IN"/>
-        </w:rPr>
-        <w:t>(</w:t>
-      </w:r>
-      <w:proofErr w:type="gramEnd"/>
-      <w:r>
-        <w:rPr>
-          <w:rFonts w:ascii="Consolas" w:eastAsia="Times New Roman" w:hAnsi="Consolas" w:cs="Times New Roman"/>
-          <w:color w:val="C586C0"/>
-          <w:sz w:val="21"/>
-          <w:szCs w:val="21"/>
-          <w:lang w:eastAsia="en-IN"/>
-        </w:rPr>
-        <w:t>new</w:t>
-      </w:r>
-      <w:r>
-        <w:rPr>
-          <w:rFonts w:ascii="Consolas" w:eastAsia="Times New Roman" w:hAnsi="Consolas" w:cs="Times New Roman"/>
-          <w:color w:val="CCCCCC"/>
-          <w:sz w:val="21"/>
-          <w:szCs w:val="21"/>
-          <w:lang w:eastAsia="en-IN"/>
-        </w:rPr>
-        <w:t xml:space="preserve"> </w:t>
-      </w:r>
-      <w:r>
-        <w:rPr>
-          <w:rFonts w:ascii="Consolas" w:eastAsia="Times New Roman" w:hAnsi="Consolas" w:cs="Times New Roman"/>
-          <w:color w:val="4EC9B0"/>
-          <w:sz w:val="21"/>
-          <w:szCs w:val="21"/>
-          <w:lang w:eastAsia="en-IN"/>
-        </w:rPr>
-        <w:t>Student</w:t>
-      </w:r>
-      <w:r>
-        <w:rPr>
-          <w:rFonts w:ascii="Consolas" w:eastAsia="Times New Roman" w:hAnsi="Consolas" w:cs="Times New Roman"/>
-          <w:color w:val="CCCCCC"/>
-          <w:sz w:val="21"/>
-          <w:szCs w:val="21"/>
-          <w:lang w:eastAsia="en-IN"/>
-        </w:rPr>
-        <w:t>(</w:t>
-      </w:r>
-      <w:r>
-        <w:rPr>
-          <w:rFonts w:ascii="Consolas" w:eastAsia="Times New Roman" w:hAnsi="Consolas" w:cs="Times New Roman"/>
-          <w:color w:val="B5CEA8"/>
-          <w:sz w:val="21"/>
-          <w:szCs w:val="21"/>
-          <w:lang w:eastAsia="en-IN"/>
-        </w:rPr>
-        <w:t>1</w:t>
-      </w:r>
-      <w:r>
-        <w:rPr>
-          <w:rFonts w:ascii="Consolas" w:eastAsia="Times New Roman" w:hAnsi="Consolas" w:cs="Times New Roman"/>
-          <w:color w:val="CCCCCC"/>
-          <w:sz w:val="21"/>
-          <w:szCs w:val="21"/>
-          <w:lang w:eastAsia="en-IN"/>
-        </w:rPr>
-        <w:t xml:space="preserve">, </w:t>
-      </w:r>
-      <w:r>
-        <w:rPr>
-          <w:rFonts w:ascii="Consolas" w:eastAsia="Times New Roman" w:hAnsi="Consolas" w:cs="Times New Roman"/>
-          <w:color w:val="CE9178"/>
-          <w:sz w:val="21"/>
-          <w:szCs w:val="21"/>
-          <w:lang w:eastAsia="en-IN"/>
-        </w:rPr>
-        <w:t>"Anita"</w:t>
-      </w:r>
-      <w:r>
-        <w:rPr>
-          <w:rFonts w:ascii="Consolas" w:eastAsia="Times New Roman" w:hAnsi="Consolas" w:cs="Times New Roman"/>
-          <w:color w:val="CCCCCC"/>
-          <w:sz w:val="21"/>
-          <w:szCs w:val="21"/>
-          <w:lang w:eastAsia="en-IN"/>
-        </w:rPr>
-        <w:t>));</w:t>
-      </w:r>
-    </w:p>
-    <w:p>
-      <w:pPr>
-        <w:shd w:val="clear" w:color="auto" w:fill="1F1F1F"/>
-        <w:spacing w:after="0" w:line="285" w:lineRule="atLeast"/>
-        <w:rPr>
-          <w:rFonts w:ascii="Consolas" w:eastAsia="Times New Roman" w:hAnsi="Consolas" w:cs="Times New Roman"/>
-          <w:color w:val="CCCCCC"/>
-          <w:sz w:val="21"/>
-          <w:szCs w:val="21"/>
-          <w:lang w:eastAsia="en-IN"/>
-        </w:rPr>
-      </w:pPr>
-      <w:proofErr w:type="spellStart"/>
-      <w:proofErr w:type="gramStart"/>
-      <w:r>
-        <w:rPr>
-          <w:rFonts w:ascii="Consolas" w:eastAsia="Times New Roman" w:hAnsi="Consolas" w:cs="Times New Roman"/>
-          <w:color w:val="4EC9B0"/>
-          <w:sz w:val="21"/>
-          <w:szCs w:val="21"/>
-          <w:lang w:eastAsia="en-IN"/>
-        </w:rPr>
-        <w:t>Collections</w:t>
-      </w:r>
-      <w:r>
-        <w:rPr>
-          <w:rFonts w:ascii="Consolas" w:eastAsia="Times New Roman" w:hAnsi="Consolas" w:cs="Times New Roman"/>
-          <w:color w:val="CCCCCC"/>
-          <w:sz w:val="21"/>
-          <w:szCs w:val="21"/>
-          <w:lang w:eastAsia="en-IN"/>
-        </w:rPr>
-        <w:t>.</w:t>
-      </w:r>
-      <w:r>
-        <w:rPr>
-          <w:rFonts w:ascii="Consolas" w:eastAsia="Times New Roman" w:hAnsi="Consolas" w:cs="Times New Roman"/>
-          <w:color w:val="DCDCAA"/>
-          <w:sz w:val="21"/>
-          <w:szCs w:val="21"/>
-          <w:lang w:eastAsia="en-IN"/>
-        </w:rPr>
-        <w:t>sort</w:t>
-      </w:r>
-      <w:proofErr w:type="spellEnd"/>
-      <w:r>
-        <w:rPr>
-          <w:rFonts w:ascii="Consolas" w:eastAsia="Times New Roman" w:hAnsi="Consolas" w:cs="Times New Roman"/>
-          <w:color w:val="CCCCCC"/>
-          <w:sz w:val="21"/>
-          <w:szCs w:val="21"/>
-          <w:lang w:eastAsia="en-IN"/>
-        </w:rPr>
-        <w:t>(</w:t>
-      </w:r>
-      <w:proofErr w:type="gramEnd"/>
-      <w:r>
-        <w:rPr>
-          <w:rFonts w:ascii="Consolas" w:eastAsia="Times New Roman" w:hAnsi="Consolas" w:cs="Times New Roman"/>
-          <w:color w:val="CCCCCC"/>
-          <w:sz w:val="21"/>
-          <w:szCs w:val="21"/>
-          <w:lang w:eastAsia="en-IN"/>
-        </w:rPr>
-        <w:t xml:space="preserve">list, </w:t>
-      </w:r>
-      <w:r>
-        <w:rPr>
-          <w:rFonts w:ascii="Consolas" w:eastAsia="Times New Roman" w:hAnsi="Consolas" w:cs="Times New Roman"/>
-          <w:color w:val="C586C0"/>
-          <w:sz w:val="21"/>
-          <w:szCs w:val="21"/>
-          <w:lang w:eastAsia="en-IN"/>
-        </w:rPr>
-        <w:t>new</w:t>
-      </w:r>
-      <w:r>
-        <w:rPr>
-          <w:rFonts w:ascii="Consolas" w:eastAsia="Times New Roman" w:hAnsi="Consolas" w:cs="Times New Roman"/>
-          <w:color w:val="CCCCCC"/>
-          <w:sz w:val="21"/>
-          <w:szCs w:val="21"/>
-          <w:lang w:eastAsia="en-IN"/>
-        </w:rPr>
-        <w:t xml:space="preserve"> </w:t>
-      </w:r>
-      <w:proofErr w:type="spellStart"/>
-      <w:r>
-        <w:rPr>
-          <w:rFonts w:ascii="Consolas" w:eastAsia="Times New Roman" w:hAnsi="Consolas" w:cs="Times New Roman"/>
-          <w:color w:val="4EC9B0"/>
-          <w:sz w:val="21"/>
-          <w:szCs w:val="21"/>
-          <w:lang w:eastAsia="en-IN"/>
-        </w:rPr>
-        <w:t>NameComparator</w:t>
-      </w:r>
-      <w:proofErr w:type="spellEnd"/>
-      <w:r>
-        <w:rPr>
-          <w:rFonts w:ascii="Consolas" w:eastAsia="Times New Roman" w:hAnsi="Consolas" w:cs="Times New Roman"/>
-          <w:color w:val="CCCCCC"/>
-          <w:sz w:val="21"/>
-          <w:szCs w:val="21"/>
-          <w:lang w:eastAsia="en-IN"/>
-        </w:rPr>
-        <w:t xml:space="preserve">()); </w:t>
-      </w:r>
-      <w:r>
-        <w:rPr>
-          <w:rFonts w:ascii="Consolas" w:eastAsia="Times New Roman" w:hAnsi="Consolas" w:cs="Times New Roman"/>
-          <w:color w:val="6A9955"/>
-          <w:sz w:val="21"/>
-          <w:szCs w:val="21"/>
-          <w:lang w:eastAsia="en-IN"/>
-        </w:rPr>
-        <w:t>// Uses Comparator</w:t>
-      </w:r>
-    </w:p>
-    <w:p>
-      <w:pPr>
-        <w:spacing w:after="0"/>
-        <w:rPr>
-          <w:color w:val="0070C0"/>
-          <w:sz w:val="24"/>
-          <w:lang w:eastAsia="en-IN"/>
-        </w:rPr>
-      </w:pPr>
-    </w:p>
-    <w:p>
-      <w:pPr>
-        <w:spacing w:after="0"/>
-        <w:rPr>
-          <w:color w:val="0070C0"/>
-          <w:sz w:val="24"/>
-          <w:lang w:eastAsia="en-IN"/>
-        </w:rPr>
-      </w:pPr>
-    </w:p>
-    <w:p>
-      <w:pPr>
-        <w:spacing w:after="0"/>
-        <w:rPr>
-          <w:sz w:val="24"/>
-          <w:lang w:eastAsia="en-IN"/>
-        </w:rPr>
-      </w:pPr>
-      <w:r>
-        <w:rPr>
-          <w:sz w:val="24"/>
-          <w:lang w:eastAsia="en-IN"/>
-        </w:rPr>
-        <w:t>Both</w:t>
-      </w:r>
-      <w:r>
-        <w:rPr>
-          <w:sz w:val="24"/>
-          <w:lang w:eastAsia="en-IN"/>
-        </w:rPr>
-        <w:t> Comparator and Comparable are functional interfaces in Java.</w:t>
-      </w:r>
-    </w:p>
-    <w:p>
-      <w:pPr>
-        <w:spacing w:after="0"/>
-        <w:rPr>
-          <w:sz w:val="24"/>
-          <w:lang w:eastAsia="en-IN"/>
-        </w:rPr>
-      </w:pPr>
-      <w:r>
-        <w:rPr>
-          <w:sz w:val="24"/>
-          <w:lang w:eastAsia="en-IN"/>
-        </w:rPr>
-        <w:t>A functional interface is defined as an interface that contains exactly one abstract method. </w:t>
-      </w:r>
-    </w:p>
-    <w:p>
-      <w:pPr>
-        <w:numPr>
-          <w:ilvl w:val="0"/>
-          <w:numId w:val="36"/>
-        </w:numPr>
-        <w:spacing w:after="0"/>
-        <w:rPr>
-          <w:sz w:val="24"/>
-          <w:lang w:eastAsia="en-IN"/>
-        </w:rPr>
-      </w:pPr>
-      <w:bookmarkStart w:id="22" w:name="_GoBack"/>
-      <w:r>
-        <w:rPr>
-          <w:b/>
-          <w:sz w:val="24"/>
-          <w:lang w:eastAsia="en-IN"/>
-        </w:rPr>
-        <w:t>Comparator</w:t>
-      </w:r>
-      <w:bookmarkEnd w:id="22"/>
-      <w:r>
-        <w:rPr>
-          <w:sz w:val="24"/>
-          <w:lang w:eastAsia="en-IN"/>
-        </w:rPr>
-        <w:t>:</w:t>
-      </w:r>
-    </w:p>
-    <w:p>
-      <w:pPr>
-        <w:spacing w:after="0"/>
-        <w:rPr>
-          <w:sz w:val="24"/>
-          <w:lang w:eastAsia="en-IN"/>
-        </w:rPr>
-      </w:pPr>
-      <w:r>
-        <w:rPr>
-          <w:sz w:val="24"/>
-          <w:lang w:eastAsia="en-IN"/>
-        </w:rPr>
-        <w:t>This interface defines the </w:t>
-      </w:r>
-      <w:proofErr w:type="gramStart"/>
-      <w:r>
-        <w:rPr>
-          <w:sz w:val="24"/>
-          <w:lang w:eastAsia="en-IN"/>
-        </w:rPr>
-        <w:t>compare(</w:t>
-      </w:r>
-      <w:proofErr w:type="gramEnd"/>
-      <w:r>
-        <w:rPr>
-          <w:sz w:val="24"/>
-          <w:lang w:eastAsia="en-IN"/>
-        </w:rPr>
-        <w:t>T o1, T o2) abstract method, which is used to define a custom ordering for objects. Since it has only one abstract method, it is a functional interface. This allows Comparator instances to be easily created using lambda expressions in Java 8 and later.</w:t>
-      </w:r>
-    </w:p>
-    <w:p>
-      <w:pPr>
-        <w:numPr>
-          <w:ilvl w:val="0"/>
-          <w:numId w:val="36"/>
-        </w:numPr>
-        <w:spacing w:after="0"/>
-        <w:rPr>
-          <w:sz w:val="24"/>
-          <w:lang w:eastAsia="en-IN"/>
-        </w:rPr>
-      </w:pPr>
-      <w:r>
-        <w:rPr>
-          <w:b/>
-          <w:sz w:val="24"/>
-          <w:lang w:eastAsia="en-IN"/>
-        </w:rPr>
-        <w:t>Comparable</w:t>
-      </w:r>
-      <w:r>
-        <w:rPr>
-          <w:sz w:val="24"/>
-          <w:lang w:eastAsia="en-IN"/>
-        </w:rPr>
-        <w:t>:</w:t>
-      </w:r>
-    </w:p>
-    <w:p>
-      <w:pPr>
-        <w:spacing w:after="0"/>
-        <w:rPr>
-          <w:sz w:val="24"/>
-          <w:lang w:eastAsia="en-IN"/>
-        </w:rPr>
-      </w:pPr>
-      <w:r>
-        <w:rPr>
-          <w:sz w:val="24"/>
-          <w:lang w:eastAsia="en-IN"/>
-        </w:rPr>
-        <w:t>This interface defines the </w:t>
-      </w:r>
-      <w:proofErr w:type="spellStart"/>
-      <w:proofErr w:type="gramStart"/>
-      <w:r>
-        <w:rPr>
-          <w:sz w:val="24"/>
-          <w:lang w:eastAsia="en-IN"/>
-        </w:rPr>
-        <w:t>compareTo</w:t>
-      </w:r>
-      <w:proofErr w:type="spellEnd"/>
-      <w:r>
-        <w:rPr>
-          <w:sz w:val="24"/>
-          <w:lang w:eastAsia="en-IN"/>
-        </w:rPr>
-        <w:t>(</w:t>
-      </w:r>
-      <w:proofErr w:type="spellStart"/>
-      <w:proofErr w:type="gramEnd"/>
-      <w:r>
-        <w:rPr>
-          <w:sz w:val="24"/>
-          <w:lang w:eastAsia="en-IN"/>
-        </w:rPr>
-        <w:t>T o</w:t>
-      </w:r>
-      <w:proofErr w:type="spellEnd"/>
-      <w:r>
-        <w:rPr>
-          <w:sz w:val="24"/>
-          <w:lang w:eastAsia="en-IN"/>
-        </w:rPr>
-        <w:t>) abstract method, which is used to define the natural ordering of objects within a class. As it also contains only one abstract method, it technically qualifies as a functional interface. While it can be represented by a lambda expression, it is less common to do so in practice because Comparable is typically implemented directly within the class whose objects are being compared.</w:t>
-      </w:r>
-      <w:r>
-        <w:rPr>
-          <w:sz w:val="24"/>
-          <w:lang w:eastAsia="en-IN"/>
-        </w:rPr>
-        <w:t xml:space="preserve"> Also we don’t use @</w:t>
-      </w:r>
-      <w:proofErr w:type="spellStart"/>
-      <w:r>
-        <w:rPr>
-          <w:sz w:val="24"/>
-          <w:lang w:eastAsia="en-IN"/>
-        </w:rPr>
-        <w:t>FunctionalInterface</w:t>
-      </w:r>
-      <w:proofErr w:type="spellEnd"/>
-      <w:r>
-        <w:rPr>
-          <w:sz w:val="24"/>
-          <w:lang w:eastAsia="en-IN"/>
-        </w:rPr>
-        <w:t xml:space="preserve"> for Comparable.</w:t>
-      </w:r>
+          <w:sz w:val="32"/>
+          <w:lang w:eastAsia="en-IN"/>
+        </w:rPr>
+      </w:pPr>
+      <w:hyperlink r:id="rId10" w:history="1">
+        <w:r>
+          <w:rPr>
+            <w:rStyle w:val="Hyperlink"/>
+            <w:sz w:val="32"/>
+            <w:lang w:eastAsia="en-IN"/>
+          </w:rPr>
+          <w:t>https://github.com/PALASH-BAJPA</w:t>
+        </w:r>
+        <w:r>
+          <w:rPr>
+            <w:rStyle w:val="Hyperlink"/>
+            <w:sz w:val="32"/>
+            <w:lang w:eastAsia="en-IN"/>
+          </w:rPr>
+          <w:t>I</w:t>
+        </w:r>
+        <w:r>
+          <w:rPr>
+            <w:rStyle w:val="Hyperlink"/>
+            <w:sz w:val="32"/>
+            <w:lang w:eastAsia="en-IN"/>
+          </w:rPr>
+          <w:t>/Java-beginner-to-advance/tree/main/Interview%20Questions</w:t>
+        </w:r>
+      </w:hyperlink>
     </w:p>
     <w:p>
       <w:pPr>
@@ -40467,7 +36038,7 @@
           <w:rPr>
             <w:noProof/>
           </w:rPr>
-          <w:t>24</w:t>
+          <w:t>21</w:t>
         </w:r>
         <w:r>
           <w:rPr>
@@ -44997,6 +40568,7 @@
   <w:style w:type="character" w:default="1" w:styleId="DefaultParagraphFont">
     <w:name w:val="Default Paragraph Font"/>
     <w:uiPriority w:val="1"/>
+    <w:semiHidden/>
     <w:unhideWhenUsed/>
   </w:style>
   <w:style w:type="table" w:default="1" w:styleId="TableNormal">
@@ -45365,6 +40937,18 @@
       <w:bCs/>
     </w:rPr>
   </w:style>
+  <w:style w:type="character" w:styleId="FollowedHyperlink">
+    <w:name w:val="FollowedHyperlink"/>
+    <w:basedOn w:val="DefaultParagraphFont"/>
+    <w:uiPriority w:val="99"/>
+    <w:semiHidden/>
+    <w:unhideWhenUsed/>
+    <w:rsid w:val="00406D60"/>
+    <w:rPr>
+      <w:color w:val="954F72" w:themeColor="followedHyperlink"/>
+      <w:u w:val="single"/>
+    </w:rPr>
+  </w:style>
 </w:styles>
 </file>
 
@@ -45668,7 +41252,7 @@
 </file>
 
 <file path=customXml/itemProps1.xml><?xml version="1.0" encoding="utf-8"?>
-<ds:datastoreItem xmlns:ds="http://schemas.openxmlformats.org/officeDocument/2006/customXml" ds:itemID="{86B0F4C7-CA7C-4FA1-A9F4-D683A7CCF0F3}">
+<ds:datastoreItem xmlns:ds="http://schemas.openxmlformats.org/officeDocument/2006/customXml" ds:itemID="{9A2A66C2-2FFA-4125-B5B6-E54EACC392A4}">
   <ds:schemaRefs>
     <ds:schemaRef ds:uri="http://schemas.openxmlformats.org/officeDocument/2006/bibliography"/>
   </ds:schemaRefs>

</xml_diff>

<commit_message>
Functional Prog: Removed interview questions
</commit_message>
<xml_diff>
--- a/3. Java Collections.docx
+++ b/3. Java Collections.docx
@@ -138,7 +138,7 @@
           <w:r>
             <w:fldChar w:fldCharType="separate"/>
           </w:r>
-          <w:hyperlink w:anchor="_Toc197846290" w:history="1">
+          <w:hyperlink w:anchor="_Toc240366459" w:history="1">
             <w:r>
               <w:rPr>
                 <w:rStyle w:val="Hyperlink"/>
@@ -168,7 +168,7 @@
                 <w:noProof/>
                 <w:webHidden/>
               </w:rPr>
-              <w:instrText xml:space="preserve"> PAGEREF _Toc197846290 \h </w:instrText>
+              <w:instrText xml:space="preserve"> PAGEREF _Toc240366459 \h </w:instrText>
             </w:r>
             <w:r>
               <w:rPr>
@@ -211,7 +211,7 @@
               <w:lang w:eastAsia="en-IN"/>
             </w:rPr>
           </w:pPr>
-          <w:hyperlink w:anchor="_Toc197846291" w:history="1">
+          <w:hyperlink w:anchor="_Toc240366460" w:history="1">
             <w:r>
               <w:rPr>
                 <w:rStyle w:val="Hyperlink"/>
@@ -239,7 +239,7 @@
                 <w:noProof/>
                 <w:webHidden/>
               </w:rPr>
-              <w:instrText xml:space="preserve"> PAGEREF _Toc197846291 \h </w:instrText>
+              <w:instrText xml:space="preserve"> PAGEREF _Toc240366460 \h </w:instrText>
             </w:r>
             <w:r>
               <w:rPr>
@@ -282,7 +282,7 @@
               <w:lang w:eastAsia="en-IN"/>
             </w:rPr>
           </w:pPr>
-          <w:hyperlink w:anchor="_Toc197846292" w:history="1">
+          <w:hyperlink w:anchor="_Toc240366461" w:history="1">
             <w:r>
               <w:rPr>
                 <w:rStyle w:val="Hyperlink"/>
@@ -310,7 +310,7 @@
                 <w:noProof/>
                 <w:webHidden/>
               </w:rPr>
-              <w:instrText xml:space="preserve"> PAGEREF _Toc197846292 \h </w:instrText>
+              <w:instrText xml:space="preserve"> PAGEREF _Toc240366461 \h </w:instrText>
             </w:r>
             <w:r>
               <w:rPr>
@@ -353,7 +353,7 @@
               <w:lang w:eastAsia="en-IN"/>
             </w:rPr>
           </w:pPr>
-          <w:hyperlink w:anchor="_Toc197846293" w:history="1">
+          <w:hyperlink w:anchor="_Toc240366462" w:history="1">
             <w:r>
               <w:rPr>
                 <w:rStyle w:val="Hyperlink"/>
@@ -381,7 +381,7 @@
                 <w:noProof/>
                 <w:webHidden/>
               </w:rPr>
-              <w:instrText xml:space="preserve"> PAGEREF _Toc197846293 \h </w:instrText>
+              <w:instrText xml:space="preserve"> PAGEREF _Toc240366462 \h </w:instrText>
             </w:r>
             <w:r>
               <w:rPr>
@@ -424,7 +424,7 @@
               <w:lang w:eastAsia="en-IN"/>
             </w:rPr>
           </w:pPr>
-          <w:hyperlink w:anchor="_Toc197846294" w:history="1">
+          <w:hyperlink w:anchor="_Toc240366463" w:history="1">
             <w:r>
               <w:rPr>
                 <w:rStyle w:val="Hyperlink"/>
@@ -454,7 +454,7 @@
                 <w:noProof/>
                 <w:webHidden/>
               </w:rPr>
-              <w:instrText xml:space="preserve"> PAGEREF _Toc197846294 \h </w:instrText>
+              <w:instrText xml:space="preserve"> PAGEREF _Toc240366463 \h </w:instrText>
             </w:r>
             <w:r>
               <w:rPr>
@@ -497,7 +497,7 @@
               <w:lang w:eastAsia="en-IN"/>
             </w:rPr>
           </w:pPr>
-          <w:hyperlink w:anchor="_Toc197846295" w:history="1">
+          <w:hyperlink w:anchor="_Toc240366464" w:history="1">
             <w:r>
               <w:rPr>
                 <w:rStyle w:val="Hyperlink"/>
@@ -525,7 +525,7 @@
                 <w:noProof/>
                 <w:webHidden/>
               </w:rPr>
-              <w:instrText xml:space="preserve"> PAGEREF _Toc197846295 \h </w:instrText>
+              <w:instrText xml:space="preserve"> PAGEREF _Toc240366464 \h </w:instrText>
             </w:r>
             <w:r>
               <w:rPr>
@@ -568,7 +568,7 @@
               <w:lang w:eastAsia="en-IN"/>
             </w:rPr>
           </w:pPr>
-          <w:hyperlink w:anchor="_Toc197846296" w:history="1">
+          <w:hyperlink w:anchor="_Toc240366465" w:history="1">
             <w:r>
               <w:rPr>
                 <w:rStyle w:val="Hyperlink"/>
@@ -596,7 +596,7 @@
                 <w:noProof/>
                 <w:webHidden/>
               </w:rPr>
-              <w:instrText xml:space="preserve"> PAGEREF _Toc197846296 \h </w:instrText>
+              <w:instrText xml:space="preserve"> PAGEREF _Toc240366465 \h </w:instrText>
             </w:r>
             <w:r>
               <w:rPr>
@@ -639,7 +639,7 @@
               <w:lang w:eastAsia="en-IN"/>
             </w:rPr>
           </w:pPr>
-          <w:hyperlink w:anchor="_Toc197846297" w:history="1">
+          <w:hyperlink w:anchor="_Toc240366466" w:history="1">
             <w:r>
               <w:rPr>
                 <w:rStyle w:val="Hyperlink"/>
@@ -669,7 +669,7 @@
                 <w:noProof/>
                 <w:webHidden/>
               </w:rPr>
-              <w:instrText xml:space="preserve"> PAGEREF _Toc197846297 \h </w:instrText>
+              <w:instrText xml:space="preserve"> PAGEREF _Toc240366466 \h </w:instrText>
             </w:r>
             <w:r>
               <w:rPr>
@@ -712,7 +712,7 @@
               <w:lang w:eastAsia="en-IN"/>
             </w:rPr>
           </w:pPr>
-          <w:hyperlink w:anchor="_Toc197846298" w:history="1">
+          <w:hyperlink w:anchor="_Toc240366467" w:history="1">
             <w:r>
               <w:rPr>
                 <w:rStyle w:val="Hyperlink"/>
@@ -740,7 +740,7 @@
                 <w:noProof/>
                 <w:webHidden/>
               </w:rPr>
-              <w:instrText xml:space="preserve"> PAGEREF _Toc197846298 \h </w:instrText>
+              <w:instrText xml:space="preserve"> PAGEREF _Toc240366467 \h </w:instrText>
             </w:r>
             <w:r>
               <w:rPr>
@@ -783,7 +783,7 @@
               <w:lang w:eastAsia="en-IN"/>
             </w:rPr>
           </w:pPr>
-          <w:hyperlink w:anchor="_Toc197846299" w:history="1">
+          <w:hyperlink w:anchor="_Toc240366468" w:history="1">
             <w:r>
               <w:rPr>
                 <w:rStyle w:val="Hyperlink"/>
@@ -811,7 +811,7 @@
                 <w:noProof/>
                 <w:webHidden/>
               </w:rPr>
-              <w:instrText xml:space="preserve"> PAGEREF _Toc197846299 \h </w:instrText>
+              <w:instrText xml:space="preserve"> PAGEREF _Toc240366468 \h </w:instrText>
             </w:r>
             <w:r>
               <w:rPr>
@@ -854,7 +854,7 @@
               <w:lang w:eastAsia="en-IN"/>
             </w:rPr>
           </w:pPr>
-          <w:hyperlink w:anchor="_Toc197846300" w:history="1">
+          <w:hyperlink w:anchor="_Toc240366469" w:history="1">
             <w:r>
               <w:rPr>
                 <w:rStyle w:val="Hyperlink"/>
@@ -884,7 +884,7 @@
                 <w:noProof/>
                 <w:webHidden/>
               </w:rPr>
-              <w:instrText xml:space="preserve"> PAGEREF _Toc197846300 \h </w:instrText>
+              <w:instrText xml:space="preserve"> PAGEREF _Toc240366469 \h </w:instrText>
             </w:r>
             <w:r>
               <w:rPr>
@@ -927,7 +927,7 @@
               <w:lang w:eastAsia="en-IN"/>
             </w:rPr>
           </w:pPr>
-          <w:hyperlink w:anchor="_Toc197846301" w:history="1">
+          <w:hyperlink w:anchor="_Toc240366470" w:history="1">
             <w:r>
               <w:rPr>
                 <w:rStyle w:val="Hyperlink"/>
@@ -955,7 +955,7 @@
                 <w:noProof/>
                 <w:webHidden/>
               </w:rPr>
-              <w:instrText xml:space="preserve"> PAGEREF _Toc197846301 \h </w:instrText>
+              <w:instrText xml:space="preserve"> PAGEREF _Toc240366470 \h </w:instrText>
             </w:r>
             <w:r>
               <w:rPr>
@@ -998,7 +998,7 @@
               <w:lang w:eastAsia="en-IN"/>
             </w:rPr>
           </w:pPr>
-          <w:hyperlink w:anchor="_Toc197846302" w:history="1">
+          <w:hyperlink w:anchor="_Toc240366471" w:history="1">
             <w:r>
               <w:rPr>
                 <w:rStyle w:val="Hyperlink"/>
@@ -1026,7 +1026,7 @@
                 <w:noProof/>
                 <w:webHidden/>
               </w:rPr>
-              <w:instrText xml:space="preserve"> PAGEREF _Toc197846302 \h </w:instrText>
+              <w:instrText xml:space="preserve"> PAGEREF _Toc240366471 \h </w:instrText>
             </w:r>
             <w:r>
               <w:rPr>
@@ -1069,7 +1069,7 @@
               <w:lang w:eastAsia="en-IN"/>
             </w:rPr>
           </w:pPr>
-          <w:hyperlink w:anchor="_Toc197846303" w:history="1">
+          <w:hyperlink w:anchor="_Toc240366472" w:history="1">
             <w:r>
               <w:rPr>
                 <w:rStyle w:val="Hyperlink"/>
@@ -1099,7 +1099,7 @@
                 <w:noProof/>
                 <w:webHidden/>
               </w:rPr>
-              <w:instrText xml:space="preserve"> PAGEREF _Toc197846303 \h </w:instrText>
+              <w:instrText xml:space="preserve"> PAGEREF _Toc240366472 \h </w:instrText>
             </w:r>
             <w:r>
               <w:rPr>
@@ -1142,7 +1142,7 @@
               <w:lang w:eastAsia="en-IN"/>
             </w:rPr>
           </w:pPr>
-          <w:hyperlink w:anchor="_Toc197846304" w:history="1">
+          <w:hyperlink w:anchor="_Toc240366473" w:history="1">
             <w:r>
               <w:rPr>
                 <w:rStyle w:val="Hyperlink"/>
@@ -1170,7 +1170,7 @@
                 <w:noProof/>
                 <w:webHidden/>
               </w:rPr>
-              <w:instrText xml:space="preserve"> PAGEREF _Toc197846304 \h </w:instrText>
+              <w:instrText xml:space="preserve"> PAGEREF _Toc240366473 \h </w:instrText>
             </w:r>
             <w:r>
               <w:rPr>
@@ -1213,7 +1213,7 @@
               <w:lang w:eastAsia="en-IN"/>
             </w:rPr>
           </w:pPr>
-          <w:hyperlink w:anchor="_Toc197846305" w:history="1">
+          <w:hyperlink w:anchor="_Toc240366474" w:history="1">
             <w:r>
               <w:rPr>
                 <w:rStyle w:val="Hyperlink"/>
@@ -1243,7 +1243,7 @@
                 <w:noProof/>
                 <w:webHidden/>
               </w:rPr>
-              <w:instrText xml:space="preserve"> PAGEREF _Toc197846305 \h </w:instrText>
+              <w:instrText xml:space="preserve"> PAGEREF _Toc240366474 \h </w:instrText>
             </w:r>
             <w:r>
               <w:rPr>
@@ -1286,7 +1286,7 @@
               <w:lang w:eastAsia="en-IN"/>
             </w:rPr>
           </w:pPr>
-          <w:hyperlink w:anchor="_Toc197846306" w:history="1">
+          <w:hyperlink w:anchor="_Toc240366475" w:history="1">
             <w:r>
               <w:rPr>
                 <w:rStyle w:val="Hyperlink"/>
@@ -1314,7 +1314,7 @@
                 <w:noProof/>
                 <w:webHidden/>
               </w:rPr>
-              <w:instrText xml:space="preserve"> PAGEREF _Toc197846306 \h </w:instrText>
+              <w:instrText xml:space="preserve"> PAGEREF _Toc240366475 \h </w:instrText>
             </w:r>
             <w:r>
               <w:rPr>
@@ -1357,7 +1357,7 @@
               <w:lang w:eastAsia="en-IN"/>
             </w:rPr>
           </w:pPr>
-          <w:hyperlink w:anchor="_Toc197846307" w:history="1">
+          <w:hyperlink w:anchor="_Toc240366476" w:history="1">
             <w:r>
               <w:rPr>
                 <w:rStyle w:val="Hyperlink"/>
@@ -1387,7 +1387,7 @@
                 <w:noProof/>
                 <w:webHidden/>
               </w:rPr>
-              <w:instrText xml:space="preserve"> PAGEREF _Toc197846307 \h </w:instrText>
+              <w:instrText xml:space="preserve"> PAGEREF _Toc240366476 \h </w:instrText>
             </w:r>
             <w:r>
               <w:rPr>
@@ -1430,7 +1430,7 @@
               <w:lang w:eastAsia="en-IN"/>
             </w:rPr>
           </w:pPr>
-          <w:hyperlink w:anchor="_Toc197846308" w:history="1">
+          <w:hyperlink w:anchor="_Toc240366477" w:history="1">
             <w:r>
               <w:rPr>
                 <w:rStyle w:val="Hyperlink"/>
@@ -1460,7 +1460,7 @@
                 <w:noProof/>
                 <w:webHidden/>
               </w:rPr>
-              <w:instrText xml:space="preserve"> PAGEREF _Toc197846308 \h </w:instrText>
+              <w:instrText xml:space="preserve"> PAGEREF _Toc240366477 \h </w:instrText>
             </w:r>
             <w:r>
               <w:rPr>
@@ -1503,14 +1503,30 @@
               <w:lang w:eastAsia="en-IN"/>
             </w:rPr>
           </w:pPr>
-          <w:hyperlink w:anchor="_Toc197846309" w:history="1">
+          <w:hyperlink w:anchor="_Toc240366478" w:history="1">
             <w:r>
               <w:rPr>
                 <w:rStyle w:val="Hyperlink"/>
                 <w:rFonts w:asciiTheme="majorHAnsi" w:hAnsiTheme="majorHAnsi" w:cstheme="majorHAnsi"/>
                 <w:noProof/>
               </w:rPr>
-              <w:t># WildCards</w:t>
+              <w:t># WildCa</w:t>
+            </w:r>
+            <w:r>
+              <w:rPr>
+                <w:rStyle w:val="Hyperlink"/>
+                <w:rFonts w:asciiTheme="majorHAnsi" w:hAnsiTheme="majorHAnsi" w:cstheme="majorHAnsi"/>
+                <w:noProof/>
+              </w:rPr>
+              <w:t>r</w:t>
+            </w:r>
+            <w:r>
+              <w:rPr>
+                <w:rStyle w:val="Hyperlink"/>
+                <w:rFonts w:asciiTheme="majorHAnsi" w:hAnsiTheme="majorHAnsi" w:cstheme="majorHAnsi"/>
+                <w:noProof/>
+              </w:rPr>
+              <w:t>ds</w:t>
             </w:r>
             <w:r>
               <w:rPr>
@@ -1531,7 +1547,7 @@
                 <w:noProof/>
                 <w:webHidden/>
               </w:rPr>
-              <w:instrText xml:space="preserve"> PAGEREF _Toc197846309 \h </w:instrText>
+              <w:instrText xml:space="preserve"> PAGEREF _Toc240366478 \h </w:instrText>
             </w:r>
             <w:r>
               <w:rPr>
@@ -1552,79 +1568,6 @@
                 <w:webHidden/>
               </w:rPr>
               <w:t>21</w:t>
-            </w:r>
-            <w:r>
-              <w:rPr>
-                <w:noProof/>
-                <w:webHidden/>
-              </w:rPr>
-              <w:fldChar w:fldCharType="end"/>
-            </w:r>
-          </w:hyperlink>
-        </w:p>
-        <w:p>
-          <w:pPr>
-            <w:pStyle w:val="TOC2"/>
-            <w:tabs>
-              <w:tab w:val="right" w:leader="dot" w:pos="10456"/>
-            </w:tabs>
-            <w:rPr>
-              <w:rFonts w:eastAsiaTheme="minorEastAsia"/>
-              <w:noProof/>
-              <w:lang w:eastAsia="en-IN"/>
-            </w:rPr>
-          </w:pPr>
-          <w:hyperlink w:anchor="_Toc197846310" w:history="1">
-            <w:r>
-              <w:rPr>
-                <w:rStyle w:val="Hyperlink"/>
-                <w:rFonts w:eastAsia="Times New Roman"/>
-                <w:b/>
-                <w:noProof/>
-                <w:lang w:eastAsia="en-IN"/>
-              </w:rPr>
-              <w:t>9. Interview Questions</w:t>
-            </w:r>
-            <w:r>
-              <w:rPr>
-                <w:noProof/>
-                <w:webHidden/>
-              </w:rPr>
-              <w:tab/>
-            </w:r>
-            <w:r>
-              <w:rPr>
-                <w:noProof/>
-                <w:webHidden/>
-              </w:rPr>
-              <w:fldChar w:fldCharType="begin"/>
-            </w:r>
-            <w:r>
-              <w:rPr>
-                <w:noProof/>
-                <w:webHidden/>
-              </w:rPr>
-              <w:instrText xml:space="preserve"> PAGEREF _Toc197846310 \h </w:instrText>
-            </w:r>
-            <w:r>
-              <w:rPr>
-                <w:noProof/>
-                <w:webHidden/>
-              </w:rPr>
-            </w:r>
-            <w:r>
-              <w:rPr>
-                <w:noProof/>
-                <w:webHidden/>
-              </w:rPr>
-              <w:fldChar w:fldCharType="separate"/>
-            </w:r>
-            <w:r>
-              <w:rPr>
-                <w:noProof/>
-                <w:webHidden/>
-              </w:rPr>
-              <w:t>23</w:t>
             </w:r>
             <w:r>
               <w:rPr>
@@ -1907,7 +1850,7 @@
         </w:rPr>
       </w:pPr>
       <w:bookmarkStart w:id="0" w:name="_Toc158098017"/>
-      <w:bookmarkStart w:id="1" w:name="_Toc197846290"/>
+      <w:bookmarkStart w:id="1" w:name="_Toc240366459"/>
       <w:r>
         <w:rPr>
           <w:rFonts w:eastAsia="Times New Roman"/>
@@ -2086,7 +2029,7 @@
           <w:szCs w:val="32"/>
         </w:rPr>
       </w:pPr>
-      <w:bookmarkStart w:id="2" w:name="_Toc197846291"/>
+      <w:bookmarkStart w:id="2" w:name="_Toc240366460"/>
       <w:r>
         <w:rPr>
           <w:rFonts w:asciiTheme="majorHAnsi" w:hAnsiTheme="majorHAnsi" w:cstheme="majorHAnsi"/>
@@ -4193,7 +4136,7 @@
           <w:szCs w:val="32"/>
         </w:rPr>
       </w:pPr>
-      <w:bookmarkStart w:id="3" w:name="_Toc197846292"/>
+      <w:bookmarkStart w:id="3" w:name="_Toc240366461"/>
       <w:r>
         <w:rPr>
           <w:rFonts w:asciiTheme="majorHAnsi" w:hAnsiTheme="majorHAnsi" w:cstheme="majorHAnsi"/>
@@ -5676,7 +5619,7 @@
           <w:szCs w:val="32"/>
         </w:rPr>
       </w:pPr>
-      <w:bookmarkStart w:id="4" w:name="_Toc197846293"/>
+      <w:bookmarkStart w:id="4" w:name="_Toc240366462"/>
       <w:r>
         <w:rPr>
           <w:rFonts w:asciiTheme="majorHAnsi" w:hAnsiTheme="majorHAnsi" w:cstheme="majorHAnsi"/>
@@ -7036,7 +6979,7 @@
           <w:lang w:eastAsia="en-IN"/>
         </w:rPr>
       </w:pPr>
-      <w:bookmarkStart w:id="5" w:name="_Toc197846294"/>
+      <w:bookmarkStart w:id="5" w:name="_Toc240366463"/>
       <w:r>
         <w:rPr>
           <w:rFonts w:eastAsia="Times New Roman"/>
@@ -10049,7 +9992,7 @@
           <w:szCs w:val="32"/>
         </w:rPr>
       </w:pPr>
-      <w:bookmarkStart w:id="6" w:name="_Toc197846295"/>
+      <w:bookmarkStart w:id="6" w:name="_Toc240366464"/>
       <w:r>
         <w:rPr>
           <w:rFonts w:asciiTheme="majorHAnsi" w:hAnsiTheme="majorHAnsi" w:cstheme="majorHAnsi"/>
@@ -11595,7 +11538,7 @@
           <w:szCs w:val="32"/>
         </w:rPr>
       </w:pPr>
-      <w:bookmarkStart w:id="7" w:name="_Toc197846296"/>
+      <w:bookmarkStart w:id="7" w:name="_Toc240366465"/>
       <w:r>
         <w:rPr>
           <w:rFonts w:asciiTheme="majorHAnsi" w:hAnsiTheme="majorHAnsi" w:cstheme="majorHAnsi"/>
@@ -12562,7 +12505,7 @@
           <w:lang w:eastAsia="en-IN"/>
         </w:rPr>
       </w:pPr>
-      <w:bookmarkStart w:id="8" w:name="_Toc197846297"/>
+      <w:bookmarkStart w:id="8" w:name="_Toc240366466"/>
       <w:r>
         <w:rPr>
           <w:rFonts w:eastAsia="Times New Roman"/>
@@ -15070,7 +15013,7 @@
           <w:szCs w:val="32"/>
         </w:rPr>
       </w:pPr>
-      <w:bookmarkStart w:id="9" w:name="_Toc197846298"/>
+      <w:bookmarkStart w:id="9" w:name="_Toc240366467"/>
       <w:r>
         <w:rPr>
           <w:rFonts w:asciiTheme="majorHAnsi" w:hAnsiTheme="majorHAnsi" w:cstheme="majorHAnsi"/>
@@ -15747,7 +15690,7 @@
           <w:szCs w:val="32"/>
         </w:rPr>
       </w:pPr>
-      <w:bookmarkStart w:id="10" w:name="_Toc197846299"/>
+      <w:bookmarkStart w:id="10" w:name="_Toc240366468"/>
       <w:r>
         <w:rPr>
           <w:rFonts w:asciiTheme="majorHAnsi" w:hAnsiTheme="majorHAnsi" w:cstheme="majorHAnsi"/>
@@ -16619,7 +16562,7 @@
           <w:lang w:eastAsia="en-IN"/>
         </w:rPr>
       </w:pPr>
-      <w:bookmarkStart w:id="11" w:name="_Toc197846300"/>
+      <w:bookmarkStart w:id="11" w:name="_Toc240366469"/>
       <w:r>
         <w:rPr>
           <w:rFonts w:eastAsia="Times New Roman"/>
@@ -17946,7 +17889,7 @@
           <w:sz w:val="28"/>
         </w:rPr>
       </w:pPr>
-      <w:bookmarkStart w:id="12" w:name="_Toc197846301"/>
+      <w:bookmarkStart w:id="12" w:name="_Toc240366470"/>
       <w:r>
         <w:rPr>
           <w:rFonts w:asciiTheme="majorHAnsi" w:hAnsiTheme="majorHAnsi" w:cstheme="majorHAnsi"/>
@@ -18723,7 +18666,7 @@
           <w:szCs w:val="32"/>
         </w:rPr>
       </w:pPr>
-      <w:bookmarkStart w:id="13" w:name="_Toc197846302"/>
+      <w:bookmarkStart w:id="13" w:name="_Toc240366471"/>
       <w:r>
         <w:rPr>
           <w:rFonts w:asciiTheme="majorHAnsi" w:hAnsiTheme="majorHAnsi" w:cstheme="majorHAnsi"/>
@@ -19376,7 +19319,7 @@
           <w:lang w:eastAsia="en-IN"/>
         </w:rPr>
       </w:pPr>
-      <w:bookmarkStart w:id="14" w:name="_Toc197846303"/>
+      <w:bookmarkStart w:id="14" w:name="_Toc240366472"/>
       <w:r>
         <w:rPr>
           <w:rFonts w:eastAsia="Times New Roman"/>
@@ -20654,7 +20597,7 @@
           <w:szCs w:val="32"/>
         </w:rPr>
       </w:pPr>
-      <w:bookmarkStart w:id="15" w:name="_Toc197846304"/>
+      <w:bookmarkStart w:id="15" w:name="_Toc240366473"/>
       <w:r>
         <w:rPr>
           <w:rFonts w:asciiTheme="majorHAnsi" w:hAnsiTheme="majorHAnsi" w:cstheme="majorHAnsi"/>
@@ -21350,7 +21293,7 @@
           <w:lang w:eastAsia="en-IN"/>
         </w:rPr>
       </w:pPr>
-      <w:bookmarkStart w:id="16" w:name="_Toc197846305"/>
+      <w:bookmarkStart w:id="16" w:name="_Toc240366474"/>
       <w:r>
         <w:rPr>
           <w:rFonts w:eastAsia="Times New Roman"/>
@@ -24317,7 +24260,7 @@
           <w:szCs w:val="32"/>
         </w:rPr>
       </w:pPr>
-      <w:bookmarkStart w:id="17" w:name="_Toc197846306"/>
+      <w:bookmarkStart w:id="17" w:name="_Toc240366475"/>
       <w:r>
         <w:rPr>
           <w:rFonts w:asciiTheme="majorHAnsi" w:hAnsiTheme="majorHAnsi" w:cstheme="majorHAnsi"/>
@@ -25579,7 +25522,7 @@
           <w:lang w:eastAsia="en-IN"/>
         </w:rPr>
       </w:pPr>
-      <w:bookmarkStart w:id="18" w:name="_Toc197846307"/>
+      <w:bookmarkStart w:id="18" w:name="_Toc240366476"/>
       <w:r>
         <w:rPr>
           <w:rFonts w:eastAsia="Times New Roman"/>
@@ -28788,7 +28731,7 @@
           <w:lang w:eastAsia="en-IN"/>
         </w:rPr>
       </w:pPr>
-      <w:bookmarkStart w:id="19" w:name="_Toc197846308"/>
+      <w:bookmarkStart w:id="19" w:name="_Toc240366477"/>
       <w:r>
         <w:rPr>
           <w:rFonts w:eastAsia="Times New Roman"/>
@@ -32878,7 +32821,7 @@
           <w:szCs w:val="32"/>
         </w:rPr>
       </w:pPr>
-      <w:bookmarkStart w:id="20" w:name="_Toc197846309"/>
+      <w:bookmarkStart w:id="20" w:name="_Toc240366478"/>
       <w:r>
         <w:rPr>
           <w:rFonts w:asciiTheme="majorHAnsi" w:hAnsiTheme="majorHAnsi" w:cstheme="majorHAnsi"/>
@@ -35900,7 +35843,6 @@
         </w:rPr>
       </w:pPr>
       <w:bookmarkStart w:id="21" w:name="_GoBack"/>
-      <w:bookmarkEnd w:id="21"/>
     </w:p>
     <w:p>
       <w:pPr>
@@ -35938,26 +35880,11 @@
             <w:sz w:val="32"/>
             <w:lang w:eastAsia="en-IN"/>
           </w:rPr>
-          <w:t>https://github.com/PALASH-BAJPA</w:t>
-        </w:r>
-        <w:r>
-          <w:rPr>
-            <w:rStyle w:val="Hyperlink"/>
-            <w:sz w:val="32"/>
-            <w:lang w:eastAsia="en-IN"/>
-          </w:rPr>
-          <w:t>I</w:t>
-        </w:r>
-        <w:r>
-          <w:rPr>
-            <w:rStyle w:val="Hyperlink"/>
-            <w:sz w:val="32"/>
-            <w:lang w:eastAsia="en-IN"/>
-          </w:rPr>
-          <w:t>/Java-beginner-to-advance/tree/main/Interview%20Questions</w:t>
+          <w:t>https://github.com/PALASH-BAJPAI/Java-beginner-to-advance/tree/main/Interview%20Questions</w:t>
         </w:r>
       </w:hyperlink>
     </w:p>
+    <w:bookmarkEnd w:id="21"/>
     <w:p>
       <w:pPr>
         <w:spacing w:after="0"/>
@@ -36038,7 +35965,7 @@
           <w:rPr>
             <w:noProof/>
           </w:rPr>
-          <w:t>21</w:t>
+          <w:t>22</w:t>
         </w:r>
         <w:r>
           <w:rPr>
@@ -41252,7 +41179,7 @@
 </file>
 
 <file path=customXml/itemProps1.xml><?xml version="1.0" encoding="utf-8"?>
-<ds:datastoreItem xmlns:ds="http://schemas.openxmlformats.org/officeDocument/2006/customXml" ds:itemID="{9A2A66C2-2FFA-4125-B5B6-E54EACC392A4}">
+<ds:datastoreItem xmlns:ds="http://schemas.openxmlformats.org/officeDocument/2006/customXml" ds:itemID="{42190B93-34EF-4DD1-887F-8BEFD6C5CDD6}">
   <ds:schemaRefs>
     <ds:schemaRef ds:uri="http://schemas.openxmlformats.org/officeDocument/2006/bibliography"/>
   </ds:schemaRefs>

</xml_diff>